<commit_message>
Added eqtable macro, introduction section and started theory background
</commit_message>
<xml_diff>
--- a/DiplomatervSablon_v3.2_hu.docx
+++ b/DiplomatervSablon_v3.2_hu.docx
@@ -1,6 +1,6 @@
 
 <file path=word/document.xml><?xml version="1.0" encoding="utf-8"?>
-<w:document xmlns:wpc="http://schemas.microsoft.com/office/word/2010/wordprocessingCanvas" xmlns:cx="http://schemas.microsoft.com/office/drawing/2014/chartex" xmlns:cx1="http://schemas.microsoft.com/office/drawing/2015/9/8/chartex" xmlns:cx2="http://schemas.microsoft.com/office/drawing/2015/10/21/chartex" xmlns:cx3="http://schemas.microsoft.com/office/drawing/2016/5/9/chartex" xmlns:cx4="http://schemas.microsoft.com/office/drawing/2016/5/10/chartex" xmlns:cx5="http://schemas.microsoft.com/office/drawing/2016/5/11/chartex" xmlns:cx6="http://schemas.microsoft.com/office/drawing/2016/5/12/chartex" xmlns:cx7="http://schemas.microsoft.com/office/drawing/2016/5/13/chartex" xmlns:cx8="http://schemas.microsoft.com/office/drawing/2016/5/14/chartex" xmlns:mc="http://schemas.openxmlformats.org/markup-compatibility/2006" xmlns:aink="http://schemas.microsoft.com/office/drawing/2016/ink" xmlns:am3d="http://schemas.microsoft.com/office/drawing/2017/model3d" xmlns:o="urn:schemas-microsoft-com:office:office" xmlns:r="http://schemas.openxmlformats.org/officeDocument/2006/relationships" xmlns:m="http://schemas.openxmlformats.org/officeDocument/2006/math" xmlns:v="urn:schemas-microsoft-com:vml" xmlns:wp14="http://schemas.microsoft.com/office/word/2010/wordprocessingDrawing" xmlns:wp="http://schemas.openxmlformats.org/drawingml/2006/wordprocessingDrawing" xmlns:w10="urn:schemas-microsoft-com:office:word" xmlns:w="http://schemas.openxmlformats.org/wordprocessingml/2006/main" xmlns:w14="http://schemas.microsoft.com/office/word/2010/wordml" xmlns:w15="http://schemas.microsoft.com/office/word/2012/wordml" xmlns:w16cex="http://schemas.microsoft.com/office/word/2018/wordml/cex" xmlns:w16cid="http://schemas.microsoft.com/office/word/2016/wordml/cid" xmlns:w16="http://schemas.microsoft.com/office/word/2018/wordml" xmlns:w16sdtdh="http://schemas.microsoft.com/office/word/2020/wordml/sdtdatahash" xmlns:w16se="http://schemas.microsoft.com/office/word/2015/wordml/symex" xmlns:wpg="http://schemas.microsoft.com/office/word/2010/wordprocessingGroup" xmlns:wpi="http://schemas.microsoft.com/office/word/2010/wordprocessingInk" xmlns:wne="http://schemas.microsoft.com/office/word/2006/wordml" xmlns:wps="http://schemas.microsoft.com/office/word/2010/wordprocessingShape" mc:Ignorable="w14 w15 w16se w16cid w16 w16cex w16sdtdh wp14">
+<w:document xmlns:wpc="http://schemas.microsoft.com/office/word/2010/wordprocessingCanvas" xmlns:cx="http://schemas.microsoft.com/office/drawing/2014/chartex" xmlns:cx1="http://schemas.microsoft.com/office/drawing/2015/9/8/chartex" xmlns:cx2="http://schemas.microsoft.com/office/drawing/2015/10/21/chartex" xmlns:cx3="http://schemas.microsoft.com/office/drawing/2016/5/9/chartex" xmlns:cx4="http://schemas.microsoft.com/office/drawing/2016/5/10/chartex" xmlns:cx5="http://schemas.microsoft.com/office/drawing/2016/5/11/chartex" xmlns:cx6="http://schemas.microsoft.com/office/drawing/2016/5/12/chartex" xmlns:cx7="http://schemas.microsoft.com/office/drawing/2016/5/13/chartex" xmlns:cx8="http://schemas.microsoft.com/office/drawing/2016/5/14/chartex" xmlns:mc="http://schemas.openxmlformats.org/markup-compatibility/2006" xmlns:aink="http://schemas.microsoft.com/office/drawing/2016/ink" xmlns:am3d="http://schemas.microsoft.com/office/drawing/2017/model3d" xmlns:o="urn:schemas-microsoft-com:office:office" xmlns:oel="http://schemas.microsoft.com/office/2019/extlst" xmlns:r="http://schemas.openxmlformats.org/officeDocument/2006/relationships" xmlns:m="http://schemas.openxmlformats.org/officeDocument/2006/math" xmlns:v="urn:schemas-microsoft-com:vml" xmlns:wp14="http://schemas.microsoft.com/office/word/2010/wordprocessingDrawing" xmlns:wp="http://schemas.openxmlformats.org/drawingml/2006/wordprocessingDrawing" xmlns:w10="urn:schemas-microsoft-com:office:word" xmlns:w="http://schemas.openxmlformats.org/wordprocessingml/2006/main" xmlns:w14="http://schemas.microsoft.com/office/word/2010/wordml" xmlns:w15="http://schemas.microsoft.com/office/word/2012/wordml" xmlns:w16cex="http://schemas.microsoft.com/office/word/2018/wordml/cex" xmlns:w16cid="http://schemas.microsoft.com/office/word/2016/wordml/cid" xmlns:w16="http://schemas.microsoft.com/office/word/2018/wordml" xmlns:w16du="http://schemas.microsoft.com/office/word/2023/wordml/word16du" xmlns:w16sdtdh="http://schemas.microsoft.com/office/word/2020/wordml/sdtdatahash" xmlns:w16se="http://schemas.microsoft.com/office/word/2015/wordml/symex" xmlns:wpg="http://schemas.microsoft.com/office/word/2010/wordprocessingGroup" xmlns:wpi="http://schemas.microsoft.com/office/word/2010/wordprocessingInk" xmlns:wne="http://schemas.microsoft.com/office/word/2006/wordml" xmlns:wps="http://schemas.microsoft.com/office/word/2010/wordprocessingShape" mc:Ignorable="w14 w15 w16se w16cid w16 w16cex w16sdtdh w16du wp14">
   <w:body>
     <w:p>
       <w:pPr>
@@ -208,15 +208,7 @@
         <w:ind w:left="714" w:hanging="357"/>
       </w:pPr>
       <w:r>
-        <w:t>Függelék(</w:t>
-      </w:r>
-      <w:proofErr w:type="spellStart"/>
-      <w:r>
-        <w:t>ek</w:t>
-      </w:r>
-      <w:proofErr w:type="spellEnd"/>
-      <w:r>
-        <w:t>)</w:t>
+        <w:t>Függelék(ek)</w:t>
       </w:r>
     </w:p>
     <w:p>
@@ -300,15 +292,7 @@
         <w:pStyle w:val="tmutat"/>
       </w:pPr>
       <w:r>
-        <w:t xml:space="preserve">Az irodalomjegyzék szövegközi hivatkozása történhet a Harvard-rendszerben (a szerző és az évszám megadásával) vagy </w:t>
-      </w:r>
-      <w:proofErr w:type="spellStart"/>
-      <w:r>
-        <w:t>sorszámozva</w:t>
-      </w:r>
-      <w:proofErr w:type="spellEnd"/>
-      <w:r>
-        <w:t>. A teljes lista névsor szerinti sorrendben a szöveg végén szerepeljen (sorszámozott irodalmi hivatkozások esetén hivatkozási sorrendben). A szakirodalmi források címeit azonban mindig az eredeti nyelven kell megadni, esetleg zárójelben a fordítással. A listában szereplő valamennyi publikációra hivatkozni kell a szövegben. Minden publikáció a szerzők után a következő adatok szerepelnek: folyóirat cikkeknél a pontos cím, a folyóirat címe, évfolyam, szám, oldalszám tól-ig. A folyóirat címeket csak akkor rövidítsük, ha azok nagyon közismertek vagy nagyon hosszúak. Internet hivatkozások megadásakor fontos, hogy az elérési út előtt megadjuk az oldal tulajdonosát és tartalmát (mivel a link egy idő után akár elérhetetlenné is válhat), valamint az elérés időpontját.</w:t>
+        <w:t>Az irodalomjegyzék szövegközi hivatkozása történhet a Harvard-rendszerben (a szerző és az évszám megadásával) vagy sorszámozva. A teljes lista névsor szerinti sorrendben a szöveg végén szerepeljen (sorszámozott irodalmi hivatkozások esetén hivatkozási sorrendben). A szakirodalmi források címeit azonban mindig az eredeti nyelven kell megadni, esetleg zárójelben a fordítással. A listában szereplő valamennyi publikációra hivatkozni kell a szövegben. Minden publikáció a szerzők után a következő adatok szerepelnek: folyóirat cikkeknél a pontos cím, a folyóirat címe, évfolyam, szám, oldalszám tól-ig. A folyóirat címeket csak akkor rövidítsük, ha azok nagyon közismertek vagy nagyon hosszúak. Internet hivatkozások megadásakor fontos, hogy az elérési út előtt megadjuk az oldal tulajdonosát és tartalmát (mivel a link egy idő után akár elérhetetlenné is válhat), valamint az elérés időpontját.</w:t>
       </w:r>
     </w:p>
     <w:p>
@@ -417,7 +401,7 @@
       </w:r>
       <w:r>
         <w:rPr>
-          <w:rStyle w:val="Kiemels2"/>
+          <w:rStyle w:val="Strong"/>
         </w:rPr>
         <w:t>tanszék saját előírása szerint</w:t>
       </w:r>
@@ -520,21 +504,11 @@
       <w:pPr>
         <w:pStyle w:val="Cmlapkarstanszk"/>
       </w:pPr>
-      <w:r>
-        <w:fldChar w:fldCharType="begin"/>
-      </w:r>
-      <w:r>
-        <w:instrText xml:space="preserve"> DOCPROPERTY  Company  \* MERGEFORMAT </w:instrText>
-      </w:r>
-      <w:r>
-        <w:fldChar w:fldCharType="separate"/>
-      </w:r>
-      <w:r>
-        <w:t>XXX Tanszék</w:t>
-      </w:r>
-      <w:r>
-        <w:fldChar w:fldCharType="end"/>
-      </w:r>
+      <w:fldSimple w:instr=" DOCPROPERTY  Company  \* MERGEFORMAT ">
+        <w:r>
+          <w:t>XXX Tanszék</w:t>
+        </w:r>
+      </w:fldSimple>
     </w:p>
     <w:p/>
     <w:p/>
@@ -547,68 +521,35 @@
       <w:pPr>
         <w:pStyle w:val="Cmlapszerz"/>
       </w:pPr>
-      <w:r>
-        <w:fldChar w:fldCharType="begin"/>
-      </w:r>
-      <w:r>
-        <w:instrText xml:space="preserve"> AUTHOR  \* MERGEFORMAT</w:instrText>
-      </w:r>
-      <w:r>
-        <w:instrText xml:space="preserve"> </w:instrText>
-      </w:r>
-      <w:r>
-        <w:fldChar w:fldCharType="separate"/>
-      </w:r>
-      <w:r>
-        <w:t>Rezeda Kázmér</w:t>
-      </w:r>
-      <w:r>
-        <w:fldChar w:fldCharType="end"/>
-      </w:r>
-    </w:p>
-    <w:p>
-      <w:pPr>
-        <w:pStyle w:val="Cm"/>
-      </w:pPr>
-      <w:r>
-        <w:fldChar w:fldCharType="begin"/>
-      </w:r>
-      <w:r>
-        <w:instrText xml:space="preserve"> TITLE  \* MERGEFORMAT </w:instrText>
-      </w:r>
-      <w:r>
-        <w:fldChar w:fldCharType="separate"/>
-      </w:r>
-      <w:r>
-        <w:t>Elektronikus terelők</w:t>
-      </w:r>
-      <w:r>
-        <w:fldChar w:fldCharType="end"/>
-      </w:r>
-    </w:p>
-    <w:p>
-      <w:pPr>
-        <w:pStyle w:val="Alcm"/>
-      </w:pPr>
-      <w:r>
-        <w:fldChar w:fldCharType="begin"/>
-      </w:r>
-      <w:r>
-        <w:instrText xml:space="preserve"> SUBJECT  \* MERGEFORMAT </w:instrText>
-      </w:r>
-      <w:r>
-        <w:fldChar w:fldCharType="separate"/>
-      </w:r>
-      <w:r>
-        <w:t>Kisfeszültségű folyamatirányítók</w:t>
-      </w:r>
-      <w:r>
-        <w:fldChar w:fldCharType="end"/>
-      </w:r>
-    </w:p>
-    <w:p>
-      <w:pPr>
-        <w:pStyle w:val="Alcm"/>
+      <w:fldSimple w:instr=" AUTHOR  \* MERGEFORMAT ">
+        <w:r>
+          <w:t>Rezeda Kázmér</w:t>
+        </w:r>
+      </w:fldSimple>
+    </w:p>
+    <w:p>
+      <w:pPr>
+        <w:pStyle w:val="Title"/>
+      </w:pPr>
+      <w:fldSimple w:instr=" TITLE  \* MERGEFORMAT ">
+        <w:r>
+          <w:t>Elektronikus terelők</w:t>
+        </w:r>
+      </w:fldSimple>
+    </w:p>
+    <w:p>
+      <w:pPr>
+        <w:pStyle w:val="Subtitle"/>
+      </w:pPr>
+      <w:fldSimple w:instr=" SUBJECT  \* MERGEFORMAT ">
+        <w:r>
+          <w:t>Kisfeszültségű folyamatirányítók</w:t>
+        </w:r>
+      </w:fldSimple>
+    </w:p>
+    <w:p>
+      <w:pPr>
+        <w:pStyle w:val="Subtitle"/>
       </w:pPr>
       <w:r>
         <w:rPr>
@@ -688,21 +629,11 @@
                             <w:pPr>
                               <w:pStyle w:val="Cmlapszerz"/>
                             </w:pPr>
-                            <w:r>
-                              <w:fldChar w:fldCharType="begin"/>
-                            </w:r>
-                            <w:r>
-                              <w:instrText xml:space="preserve"> DOCPROPERTY "Manager"  \* MERGEFORMAT </w:instrText>
-                            </w:r>
-                            <w:r>
-                              <w:fldChar w:fldCharType="separate"/>
-                            </w:r>
-                            <w:r>
-                              <w:t>Dr. Érték Elek</w:t>
-                            </w:r>
-                            <w:r>
-                              <w:fldChar w:fldCharType="end"/>
-                            </w:r>
+                            <w:fldSimple w:instr=" DOCPROPERTY &quot;Manager&quot;  \* MERGEFORMAT ">
+                              <w:r>
+                                <w:t>Dr. Érték Elek</w:t>
+                              </w:r>
+                            </w:fldSimple>
                           </w:p>
                           <w:p>
                             <w:pPr>
@@ -726,7 +657,7 @@
                               <w:rPr>
                                 <w:noProof/>
                               </w:rPr>
-                              <w:t>2023</w:t>
+                              <w:t>2024</w:t>
                             </w:r>
                             <w:r>
                               <w:fldChar w:fldCharType="end"/>
@@ -755,7 +686,7 @@
                 <v:stroke joinstyle="miter"/>
                 <v:path gradientshapeok="t" o:connecttype="rect"/>
               </v:shapetype>
-              <v:shape id="Text Box 7" o:spid="_x0000_s1026" type="#_x0000_t202" style="position:absolute;left:0;text-align:left;margin-left:204.95pt;margin-top:28.55pt;width:226.75pt;height:81pt;z-index:251657728;visibility:visible;mso-wrap-style:square;mso-width-percent:0;mso-height-percent:0;mso-wrap-distance-left:9pt;mso-wrap-distance-top:0;mso-wrap-distance-right:9pt;mso-wrap-distance-bottom:0;mso-position-horizontal:absolute;mso-position-horizontal-relative:page;mso-position-vertical:absolute;mso-position-vertical-relative:text;mso-width-percent:0;mso-height-percent:0;mso-width-relative:page;mso-height-relative:page;v-text-anchor:top" o:gfxdata="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" stroked="f">
+              <v:shape id="Text Box 7" o:spid="_x0000_s1026" type="#_x0000_t202" style="position:absolute;left:0;text-align:left;margin-left:204.95pt;margin-top:28.55pt;width:226.75pt;height:81pt;z-index:251657728;visibility:visible;mso-wrap-style:square;mso-width-percent:0;mso-height-percent:0;mso-wrap-distance-left:9pt;mso-wrap-distance-top:0;mso-wrap-distance-right:9pt;mso-wrap-distance-bottom:0;mso-position-horizontal:absolute;mso-position-horizontal-relative:page;mso-position-vertical:absolute;mso-position-vertical-relative:text;mso-width-percent:0;mso-height-percent:0;mso-width-relative:page;mso-height-relative:page;v-text-anchor:top" o:gfxdata="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" stroked="f">
                 <v:textbox>
                   <w:txbxContent>
                     <w:p>
@@ -779,21 +710,11 @@
                       <w:pPr>
                         <w:pStyle w:val="Cmlapszerz"/>
                       </w:pPr>
-                      <w:r>
-                        <w:fldChar w:fldCharType="begin"/>
-                      </w:r>
-                      <w:r>
-                        <w:instrText xml:space="preserve"> DOCPROPERTY "Manager"  \* MERGEFORMAT </w:instrText>
-                      </w:r>
-                      <w:r>
-                        <w:fldChar w:fldCharType="separate"/>
-                      </w:r>
-                      <w:r>
-                        <w:t>Dr. Érték Elek</w:t>
-                      </w:r>
-                      <w:r>
-                        <w:fldChar w:fldCharType="end"/>
-                      </w:r>
+                      <w:fldSimple w:instr=" DOCPROPERTY &quot;Manager&quot;  \* MERGEFORMAT ">
+                        <w:r>
+                          <w:t>Dr. Érték Elek</w:t>
+                        </w:r>
+                      </w:fldSimple>
                     </w:p>
                     <w:p>
                       <w:pPr>
@@ -817,7 +738,7 @@
                         <w:rPr>
                           <w:noProof/>
                         </w:rPr>
-                        <w:t>2023</w:t>
+                        <w:t>2024</w:t>
                       </w:r>
                       <w:r>
                         <w:fldChar w:fldCharType="end"/>
@@ -843,7 +764,7 @@
     </w:p>
     <w:p>
       <w:pPr>
-        <w:pStyle w:val="TJ1"/>
+        <w:pStyle w:val="TOC1"/>
         <w:rPr>
           <w:rFonts w:asciiTheme="minorHAnsi" w:eastAsiaTheme="minorEastAsia" w:hAnsiTheme="minorHAnsi" w:cstheme="minorBidi"/>
           <w:b w:val="0"/>
@@ -865,7 +786,7 @@
       <w:hyperlink w:anchor="_Toc59896130" w:history="1">
         <w:r>
           <w:rPr>
-            <w:rStyle w:val="Hiperhivatkozs"/>
+            <w:rStyle w:val="Hyperlink"/>
             <w:noProof/>
           </w:rPr>
           <w:t>Összefoglaló</w:t>
@@ -922,7 +843,7 @@
     </w:p>
     <w:p>
       <w:pPr>
-        <w:pStyle w:val="TJ1"/>
+        <w:pStyle w:val="TOC1"/>
         <w:rPr>
           <w:rFonts w:asciiTheme="minorHAnsi" w:eastAsiaTheme="minorEastAsia" w:hAnsiTheme="minorHAnsi" w:cstheme="minorBidi"/>
           <w:b w:val="0"/>
@@ -935,7 +856,7 @@
       <w:hyperlink w:anchor="_Toc59896131" w:history="1">
         <w:r>
           <w:rPr>
-            <w:rStyle w:val="Hiperhivatkozs"/>
+            <w:rStyle w:val="Hyperlink"/>
             <w:noProof/>
           </w:rPr>
           <w:t>Abstract</w:t>
@@ -992,7 +913,7 @@
     </w:p>
     <w:p>
       <w:pPr>
-        <w:pStyle w:val="TJ1"/>
+        <w:pStyle w:val="TOC1"/>
         <w:rPr>
           <w:rFonts w:asciiTheme="minorHAnsi" w:eastAsiaTheme="minorEastAsia" w:hAnsiTheme="minorHAnsi" w:cstheme="minorBidi"/>
           <w:b w:val="0"/>
@@ -1005,7 +926,7 @@
       <w:hyperlink w:anchor="_Toc59896132" w:history="1">
         <w:r>
           <w:rPr>
-            <w:rStyle w:val="Hiperhivatkozs"/>
+            <w:rStyle w:val="Hyperlink"/>
             <w:noProof/>
           </w:rPr>
           <w:t>1 Bevezetés</w:t>
@@ -1062,7 +983,7 @@
     </w:p>
     <w:p>
       <w:pPr>
-        <w:pStyle w:val="TJ2"/>
+        <w:pStyle w:val="TOC2"/>
         <w:tabs>
           <w:tab w:val="right" w:leader="dot" w:pos="8494"/>
         </w:tabs>
@@ -1077,7 +998,7 @@
       <w:hyperlink w:anchor="_Toc59896133" w:history="1">
         <w:r>
           <w:rPr>
-            <w:rStyle w:val="Hiperhivatkozs"/>
+            <w:rStyle w:val="Hyperlink"/>
             <w:noProof/>
           </w:rPr>
           <w:t>1.1 Formázási tudnivalók</w:t>
@@ -1134,7 +1055,7 @@
     </w:p>
     <w:p>
       <w:pPr>
-        <w:pStyle w:val="TJ3"/>
+        <w:pStyle w:val="TOC3"/>
         <w:tabs>
           <w:tab w:val="right" w:leader="dot" w:pos="8494"/>
         </w:tabs>
@@ -1149,7 +1070,7 @@
       <w:hyperlink w:anchor="_Toc59896134" w:history="1">
         <w:r>
           <w:rPr>
-            <w:rStyle w:val="Hiperhivatkozs"/>
+            <w:rStyle w:val="Hyperlink"/>
             <w:noProof/>
           </w:rPr>
           <w:t>1.1.1 Címsorok</w:t>
@@ -1206,7 +1127,7 @@
     </w:p>
     <w:p>
       <w:pPr>
-        <w:pStyle w:val="TJ3"/>
+        <w:pStyle w:val="TOC3"/>
         <w:tabs>
           <w:tab w:val="right" w:leader="dot" w:pos="8494"/>
         </w:tabs>
@@ -1221,7 +1142,7 @@
       <w:hyperlink w:anchor="_Toc59896135" w:history="1">
         <w:r>
           <w:rPr>
-            <w:rStyle w:val="Hiperhivatkozs"/>
+            <w:rStyle w:val="Hyperlink"/>
             <w:noProof/>
           </w:rPr>
           <w:t>1.1.2 Képek</w:t>
@@ -1278,7 +1199,7 @@
     </w:p>
     <w:p>
       <w:pPr>
-        <w:pStyle w:val="TJ3"/>
+        <w:pStyle w:val="TOC3"/>
         <w:tabs>
           <w:tab w:val="right" w:leader="dot" w:pos="8494"/>
         </w:tabs>
@@ -1293,7 +1214,7 @@
       <w:hyperlink w:anchor="_Toc59896136" w:history="1">
         <w:r>
           <w:rPr>
-            <w:rStyle w:val="Hiperhivatkozs"/>
+            <w:rStyle w:val="Hyperlink"/>
             <w:noProof/>
           </w:rPr>
           <w:t>1.1.3 Kódrészletek</w:t>
@@ -1350,7 +1271,7 @@
     </w:p>
     <w:p>
       <w:pPr>
-        <w:pStyle w:val="TJ3"/>
+        <w:pStyle w:val="TOC3"/>
         <w:tabs>
           <w:tab w:val="right" w:leader="dot" w:pos="8494"/>
         </w:tabs>
@@ -1365,7 +1286,7 @@
       <w:hyperlink w:anchor="_Toc59896137" w:history="1">
         <w:r>
           <w:rPr>
-            <w:rStyle w:val="Hiperhivatkozs"/>
+            <w:rStyle w:val="Hyperlink"/>
             <w:noProof/>
           </w:rPr>
           <w:t>1.1.4 Irodalomjegyzék</w:t>
@@ -1422,7 +1343,7 @@
     </w:p>
     <w:p>
       <w:pPr>
-        <w:pStyle w:val="TJ1"/>
+        <w:pStyle w:val="TOC1"/>
         <w:rPr>
           <w:rFonts w:asciiTheme="minorHAnsi" w:eastAsiaTheme="minorEastAsia" w:hAnsiTheme="minorHAnsi" w:cstheme="minorBidi"/>
           <w:b w:val="0"/>
@@ -1435,7 +1356,7 @@
       <w:hyperlink w:anchor="_Toc59896138" w:history="1">
         <w:r>
           <w:rPr>
-            <w:rStyle w:val="Hiperhivatkozs"/>
+            <w:rStyle w:val="Hyperlink"/>
             <w:noProof/>
           </w:rPr>
           <w:t>2 Utolsó simítások</w:t>
@@ -1492,7 +1413,7 @@
     </w:p>
     <w:p>
       <w:pPr>
-        <w:pStyle w:val="TJ1"/>
+        <w:pStyle w:val="TOC1"/>
         <w:rPr>
           <w:rFonts w:asciiTheme="minorHAnsi" w:eastAsiaTheme="minorEastAsia" w:hAnsiTheme="minorHAnsi" w:cstheme="minorBidi"/>
           <w:b w:val="0"/>
@@ -1505,7 +1426,7 @@
       <w:hyperlink w:anchor="_Toc59896139" w:history="1">
         <w:r>
           <w:rPr>
-            <w:rStyle w:val="Hiperhivatkozs"/>
+            <w:rStyle w:val="Hyperlink"/>
             <w:noProof/>
           </w:rPr>
           <w:t>Irodalomjegyzék</w:t>
@@ -1562,7 +1483,7 @@
     </w:p>
     <w:p>
       <w:pPr>
-        <w:pStyle w:val="TJ1"/>
+        <w:pStyle w:val="TOC1"/>
         <w:rPr>
           <w:rFonts w:asciiTheme="minorHAnsi" w:eastAsiaTheme="minorEastAsia" w:hAnsiTheme="minorHAnsi" w:cstheme="minorBidi"/>
           <w:b w:val="0"/>
@@ -1575,7 +1496,7 @@
       <w:hyperlink w:anchor="_Toc59896140" w:history="1">
         <w:r>
           <w:rPr>
-            <w:rStyle w:val="Hiperhivatkozs"/>
+            <w:rStyle w:val="Hyperlink"/>
             <w:noProof/>
           </w:rPr>
           <w:t>Függelék</w:t>
@@ -1641,7 +1562,7 @@
     </w:p>
     <w:p>
       <w:pPr>
-        <w:pStyle w:val="Kpalrs"/>
+        <w:pStyle w:val="Caption"/>
       </w:pPr>
     </w:p>
     <w:p>
@@ -1665,36 +1586,7 @@
           <w:b/>
           <w:bCs/>
         </w:rPr>
-        <w:fldChar w:fldCharType="begin"/>
-      </w:r>
-      <w:r>
-        <w:rPr>
-          <w:b/>
-          <w:bCs/>
-        </w:rPr>
-        <w:instrText xml:space="preserve"> AUTHOR  \* MERGEFORMAT </w:instrText>
-      </w:r>
-      <w:r>
-        <w:rPr>
-          <w:b/>
-          <w:bCs/>
-        </w:rPr>
-        <w:fldChar w:fldCharType="separate"/>
-      </w:r>
-      <w:r>
-        <w:rPr>
-          <w:b/>
-          <w:bCs/>
-          <w:noProof/>
-        </w:rPr>
-        <w:t>Rezeda Kázmér</w:t>
-      </w:r>
-      <w:r>
-        <w:rPr>
-          <w:b/>
-          <w:bCs/>
-        </w:rPr>
-        <w:fldChar w:fldCharType="end"/>
+        <w:t>Nagy Áron Artúr</w:t>
       </w:r>
       <w:r>
         <w:t xml:space="preserve">, szigorló hallgató kijelentem, hogy ezt a </w:t>
@@ -1729,29 +1621,13 @@
         <w:pStyle w:val="Nyilatkozatszveg"/>
       </w:pPr>
       <w:r>
-        <w:t>Hozzájárulok, hogy a jelen munkám alapadatait (szerző(k), cím, angol és magyar nyelvű tartalmi kivonat, készítés éve, konzulens(</w:t>
-      </w:r>
-      <w:proofErr w:type="spellStart"/>
-      <w:r>
-        <w:t>ek</w:t>
-      </w:r>
-      <w:proofErr w:type="spellEnd"/>
-      <w:r>
-        <w:t xml:space="preserve">) neve) a BME VIK nyilvánosan hozzáférhető elektronikus formában, a munka teljes szövegét pedig az egyetem belső hálózatán keresztül (vagy </w:t>
+        <w:t xml:space="preserve">Hozzájárulok, hogy a jelen munkám alapadatait (szerző(k), cím, angol és magyar nyelvű tartalmi kivonat, készítés éve, konzulens(ek) neve) a BME VIK nyilvánosan hozzáférhető elektronikus formában, a munka teljes szövegét pedig az egyetem belső hálózatán keresztül (vagy </w:t>
       </w:r>
       <w:r>
         <w:t>hitelesített</w:t>
       </w:r>
       <w:r>
-        <w:t xml:space="preserve"> felhasználók számára) </w:t>
-      </w:r>
-      <w:proofErr w:type="spellStart"/>
-      <w:r>
-        <w:t>közzétegye</w:t>
-      </w:r>
-      <w:proofErr w:type="spellEnd"/>
-      <w:r>
-        <w:t>. Kijelentem, hogy a benyújtott munka és annak elektronikus verziója megegyezik.</w:t>
+        <w:t xml:space="preserve"> felhasználók számára) közzétegye. Kijelentem, hogy a benyújtott munka és annak elektronikus verziója megegyezik.</w:t>
       </w:r>
       <w:r>
         <w:t xml:space="preserve"> Dékáni engedéllyel titkosított diplomatervek esetén a dolgozat szövege csak 3 év </w:t>
@@ -1783,7 +1659,7 @@
         <w:rPr>
           <w:noProof/>
         </w:rPr>
-        <w:t>2023. 02. 27.</w:t>
+        <w:t>2024. 11. 25.</w:t>
       </w:r>
       <w:r>
         <w:fldChar w:fldCharType="end"/>
@@ -1810,21 +1686,14 @@
       <w:r>
         <w:tab/>
       </w:r>
-      <w:r>
-        <w:fldChar w:fldCharType="begin"/>
-      </w:r>
-      <w:r>
-        <w:instrText xml:space="preserve"> AUTHOR   \* MERGEFORMAT </w:instrText>
-      </w:r>
-      <w:r>
-        <w:fldChar w:fldCharType="separate"/>
-      </w:r>
-      <w:r>
-        <w:t>Rezeda Kázmér</w:t>
-      </w:r>
-      <w:r>
-        <w:fldChar w:fldCharType="end"/>
-      </w:r>
+      <w:fldSimple w:instr=" AUTHOR   \* MERGEFORMAT ">
+        <w:r>
+          <w:t>Nagy Áron Artú</w:t>
+        </w:r>
+        <w:r>
+          <w:t>r</w:t>
+        </w:r>
+      </w:fldSimple>
     </w:p>
     <w:p>
       <w:pPr>
@@ -1857,31 +1726,180 @@
     </w:p>
     <w:p>
       <w:r>
-        <w:t>Ide jön a</w:t>
-      </w:r>
-      <w:r>
-        <w:t xml:space="preserve"> ½-</w:t>
-      </w:r>
-      <w:r>
-        <w:t>1 oldalas magyar nyelvű összefoglaló</w:t>
-      </w:r>
-      <w:r>
-        <w:t>, melynek szövege a</w:t>
-      </w:r>
-      <w:r>
-        <w:t xml:space="preserve"> Diplomaterv</w:t>
-      </w:r>
-      <w:r>
-        <w:t xml:space="preserve"> Portálra külön i</w:t>
-      </w:r>
-      <w:r>
-        <w:t>s</w:t>
-      </w:r>
-      <w:r>
-        <w:t xml:space="preserve"> feltöltésre kerül</w:t>
-      </w:r>
-      <w:r>
-        <w:t>.</w:t>
+        <w:t xml:space="preserve">A technológia fejlődésével a nagy iparágakban, mint a filmipar, építőipar, autóipar, egyre fontosabbá válik pontfelhők megjelenítése szolid objektumként, felületek színinterpolációjának kiszámítása épületek, autók szimulációjánál, </w:t>
+      </w:r>
+      <w:r>
+        <w:t>valamint</w:t>
+      </w:r>
+      <w:r>
+        <w:t xml:space="preserve"> </w:t>
+      </w:r>
+      <w:r>
+        <w:t xml:space="preserve">a </w:t>
+      </w:r>
+      <w:r>
+        <w:t>hőeloszlás</w:t>
+      </w:r>
+      <w:r>
+        <w:t>nak a</w:t>
+      </w:r>
+      <w:r>
+        <w:t xml:space="preserve"> szimuláció</w:t>
+      </w:r>
+      <w:r>
+        <w:t>ja</w:t>
+      </w:r>
+      <w:r>
+        <w:t xml:space="preserve"> </w:t>
+      </w:r>
+      <w:r>
+        <w:t>hőérzékeny modelleknél</w:t>
+      </w:r>
+      <w:r>
+        <w:t>. Ezekben nagy segítséget tud nyújtani egy alternatívaként a Monte Carlo metódus.</w:t>
+      </w:r>
+    </w:p>
+    <w:p>
+      <w:r>
+        <w:t xml:space="preserve">A jelen szakdolgozat a geometriai feldolgozás egy formájának implementációját mutatja be, annak elméleti hátterét, valamint egy implementációját a módszernek. A módszer </w:t>
+      </w:r>
+      <w:r>
+        <w:t xml:space="preserve">a Monte Carlo nevet kapta, mivel a Monte Carlo algoritmusra épül. </w:t>
+      </w:r>
+      <w:r>
+        <w:t xml:space="preserve">A </w:t>
+      </w:r>
+      <w:r>
+        <w:t xml:space="preserve">Monte Carlo algoritmus több </w:t>
+      </w:r>
+      <w:r>
+        <w:t>területen</w:t>
+      </w:r>
+      <w:r>
+        <w:t xml:space="preserve"> is előfordul, így nem ismeretlen a valószínűségszámítás, vagy</w:t>
+      </w:r>
+      <w:r>
+        <w:t xml:space="preserve"> a</w:t>
+      </w:r>
+      <w:r>
+        <w:t xml:space="preserve"> közgazdaság</w:t>
+      </w:r>
+      <w:r>
+        <w:t>tan</w:t>
+      </w:r>
+      <w:r>
+        <w:t xml:space="preserve"> [3] </w:t>
+      </w:r>
+      <w:r>
+        <w:t>világában</w:t>
+      </w:r>
+      <w:r>
+        <w:t xml:space="preserve"> jártas embereknek</w:t>
+      </w:r>
+      <w:r>
+        <w:t xml:space="preserve"> sem</w:t>
+      </w:r>
+      <w:r>
+        <w:t xml:space="preserve">. A Monte Carlo módszer előnye más megoldásokkal szemben, e.g. a FEM metódusokkal szemben, az, hogy nem diszkretizálja a teret, így egy adott idő múlva biztosan eléri a kívánt megoldást. </w:t>
+      </w:r>
+      <w:r>
+        <w:fldChar w:fldCharType="begin"/>
+      </w:r>
+      <w:r>
+        <w:instrText xml:space="preserve"> REF _Ref183355875 \h </w:instrText>
+      </w:r>
+      <w:r>
+        <w:fldChar w:fldCharType="separate"/>
+      </w:r>
+      <w:r>
+        <w:rPr>
+          <w:noProof/>
+        </w:rPr>
+        <w:t>(Sawhney, 2020 )</w:t>
+      </w:r>
+      <w:r>
+        <w:fldChar w:fldCharType="end"/>
+      </w:r>
+    </w:p>
+    <w:p>
+      <w:r>
+        <w:t>A FEM (</w:t>
+      </w:r>
+      <w:r>
+        <w:rPr>
+          <w:b/>
+          <w:bCs/>
+        </w:rPr>
+        <w:t>F</w:t>
+      </w:r>
+      <w:r>
+        <w:t xml:space="preserve">inite </w:t>
+      </w:r>
+      <w:r>
+        <w:rPr>
+          <w:b/>
+          <w:bCs/>
+        </w:rPr>
+        <w:t>E</w:t>
+      </w:r>
+      <w:r>
+        <w:t xml:space="preserve">lement </w:t>
+      </w:r>
+      <w:r>
+        <w:rPr>
+          <w:b/>
+          <w:bCs/>
+        </w:rPr>
+        <w:t>M</w:t>
+      </w:r>
+      <w:r>
+        <w:t>ethod) metódusok</w:t>
+      </w:r>
+      <w:r>
+        <w:t>, magyarul Véges Elem Metódus,</w:t>
+      </w:r>
+      <w:r>
+        <w:t xml:space="preserve"> úgy próbálják megoldani a parciális differenciálegyenlet problémákat, hogy kisebb, diszkrét elemekre bontják az adott feladatot. Ezt </w:t>
+      </w:r>
+      <w:r>
+        <w:t xml:space="preserve">például úgy oldják meg, hogy a teret kis egységekre bontják, majd az egyenleteket ezeken a kis területeken, lokálisan próbálják numerikusan megoldani. </w:t>
+      </w:r>
+      <w:r>
+        <w:t>[2]</w:t>
+      </w:r>
+    </w:p>
+    <w:p>
+      <w:r>
+        <w:t xml:space="preserve">A Monte Carlo metódus ezzel ellentétben úgy oldja meg a differenciálegyenleteket, egy adott tartományon, hogy nem diszkrét elemekre bontja a teret, hanem úgynevezett legközelebbi pontkeresést hajt végre. </w:t>
+      </w:r>
+      <w:r>
+        <w:t>Nem</w:t>
+      </w:r>
+      <w:r>
+        <w:t xml:space="preserve"> diszkretizálja a teret, így helyes megoldást tud adni.</w:t>
+      </w:r>
+    </w:p>
+    <w:p>
+      <w:r>
+        <w:t>Mivel a pontok kiértékelése agnosztikus a szomszédos pontokra</w:t>
+      </w:r>
+      <w:r>
+        <w:t xml:space="preserve"> tekintve</w:t>
+      </w:r>
+      <w:r>
+        <w:t>, egyedül a határértékek vannak rá hatással, így a számítógépes grafikában szintén egyre elterjedtebb terület</w:t>
+      </w:r>
+      <w:r>
+        <w:t xml:space="preserve">hez, </w:t>
+      </w:r>
+      <w:r>
+        <w:t>a sugárkövetéshez (raytracing)</w:t>
+      </w:r>
+      <w:r>
+        <w:t>,</w:t>
+      </w:r>
+      <w:r>
+        <w:t xml:space="preserve"> hasonlóan nagyon jól párhuzamosítható, így könnyedén implementálható a GPU-n. </w:t>
       </w:r>
     </w:p>
     <w:p>
@@ -1889,13 +1907,11 @@
         <w:pStyle w:val="Fejezetcimszmozsnlkl"/>
       </w:pPr>
       <w:bookmarkStart w:id="1" w:name="_Toc59896131"/>
-      <w:proofErr w:type="spellStart"/>
       <w:r>
         <w:lastRenderedPageBreak/>
         <w:t>Abstract</w:t>
       </w:r>
       <w:bookmarkEnd w:id="1"/>
-      <w:proofErr w:type="spellEnd"/>
     </w:p>
     <w:p>
       <w:r>
@@ -1925,7 +1941,7 @@
     </w:p>
     <w:p>
       <w:pPr>
-        <w:pStyle w:val="Cmsor1"/>
+        <w:pStyle w:val="Heading1"/>
       </w:pPr>
       <w:bookmarkStart w:id="2" w:name="_Toc332797397"/>
       <w:bookmarkStart w:id="3" w:name="_Toc59896132"/>
@@ -1938,12 +1954,462 @@
     </w:p>
     <w:p>
       <w:r>
-        <w:t>A következő fejezet pár példán keresztül bemutatja a diplomatervekben és szakdolgozatokban szokásosan előkerülő formázások megvalósítását.</w:t>
-      </w:r>
-    </w:p>
-    <w:p>
-      <w:pPr>
-        <w:pStyle w:val="Cmsor2"/>
+        <w:t xml:space="preserve">A </w:t>
+      </w:r>
+      <w:r>
+        <w:t>számítógépek fejlődésével egyre komplexebb, számításigényesebb algoritmusokat tudnak futtatni az emberek. Egy ilyen terület a parciális differenciálegyenletek megoldása. A differenciálegyenletek megjelennek a számítógépes grafika világában, számítógépes játékoknál is, modellek felszíni rekonstrukciójánál. A játékokon kívül a differenciálegyenletekkel tudunk természeti jelenségeket is leírni, mint például az egyenletes hőeloszlást. Így a PDE-k gyors megoldása egy fontos kérdés több területen is.</w:t>
+      </w:r>
+      <w:r>
+        <w:t xml:space="preserve"> </w:t>
+      </w:r>
+    </w:p>
+    <w:p>
+      <w:pPr>
+        <w:pStyle w:val="Heading2"/>
+      </w:pPr>
+      <w:r>
+        <w:t>Motiváció</w:t>
+      </w:r>
+    </w:p>
+    <w:p>
+      <w:r>
+        <w:t xml:space="preserve"> </w:t>
+      </w:r>
+      <w:r>
+        <w:t>Geometriai modellek feldolgozására szolgáló algoritmusok komplexek</w:t>
+      </w:r>
+      <w:r>
+        <w:t xml:space="preserve"> és általában véges elemekre bontják a céltartományt és ezeken a véges elemeken oldanak meg algebrai egyenleteket. Az ilyen globális rendszerek nehezen párhuzamosíthatók, valamint a diszkretizálás diszkretizálási hibalehetőséget hozhat be az eredménybe. A mai hardver tendenciák szerint sokkal nagyobb hangsúlyt fektetnek a szálak növelésére, mint az óraszám növelésére. </w:t>
+      </w:r>
+    </w:p>
+    <w:p>
+      <w:r>
+        <w:t xml:space="preserve">Erre egy alternatívát adnak a Monte Carlo metódusok, melyek a Monte Carlo integrálásra alapszanak. Köszönhetően annak, hogy lokálisan kiértékelhető minden egyes pontra a céltartományban a Monte Carlo metódus, így nagyon jól párhuzamosítható. Az általam </w:t>
+      </w:r>
+      <w:r>
+        <w:t>választott</w:t>
+      </w:r>
+      <w:r>
+        <w:t xml:space="preserve"> Walk On Spheres algoritmus [1] triviálisan párhuzamosítható</w:t>
+      </w:r>
+      <w:r>
+        <w:t xml:space="preserve"> így ezt a GPU-n implementáltam.</w:t>
+      </w:r>
+    </w:p>
+    <w:p>
+      <w:pPr>
+        <w:pStyle w:val="Heading1"/>
+      </w:pPr>
+      <w:r>
+        <w:lastRenderedPageBreak/>
+        <w:t>Elméleti háttér</w:t>
+      </w:r>
+    </w:p>
+    <w:p>
+      <w:pPr>
+        <w:pStyle w:val="Heading2"/>
+      </w:pPr>
+      <w:r>
+        <w:t>Matematikai jelölések</w:t>
+      </w:r>
+    </w:p>
+    <w:p>
+      <w:r>
+        <w:t xml:space="preserve">A szakdolgozat során a következő matematikai jelölőrendszert fogom alkalmazni. Bármely </w:t>
+      </w:r>
+      <w:r>
+        <w:t>S</w:t>
+      </w:r>
+      <w:r>
+        <w:t xml:space="preserve"> ⸦ </w:t>
+      </w:r>
+      <m:oMath>
+        <m:sSup>
+          <m:sSupPr>
+            <m:ctrlPr>
+              <w:rPr>
+                <w:rFonts w:ascii="Cambria Math" w:hAnsi="Cambria Math"/>
+                <w:i/>
+              </w:rPr>
+            </m:ctrlPr>
+          </m:sSupPr>
+          <m:e>
+            <m:r>
+              <w:rPr>
+                <w:rFonts w:ascii="Cambria Math" w:hAnsi="Cambria Math"/>
+              </w:rPr>
+              <m:t>R</m:t>
+            </m:r>
+          </m:e>
+          <m:sup>
+            <m:r>
+              <w:rPr>
+                <w:rFonts w:ascii="Cambria Math" w:hAnsi="Cambria Math"/>
+              </w:rPr>
+              <m:t>n</m:t>
+            </m:r>
+          </m:sup>
+        </m:sSup>
+      </m:oMath>
+      <w:r>
+        <w:t xml:space="preserve"> tartomány esetén ∂S-vel jelölöm a tartomány peremét, míg |S|-el a tartomány térfogatát. A céltartományt mindig </w:t>
+      </w:r>
+      <w:r>
+        <w:t>Ω</w:t>
+      </w:r>
+      <w:r>
+        <w:t xml:space="preserve">-val fogom jelölni, B(x)-el azt a kört, amely </w:t>
+      </w:r>
+      <w:r>
+        <w:t>Ω</w:t>
+      </w:r>
+      <w:r>
+        <w:t xml:space="preserve"> tartományban van és az x a középpontja. </w:t>
+      </w:r>
+      <m:oMath>
+        <m:acc>
+          <m:accPr>
+            <m:chr m:val="̅"/>
+            <m:ctrlPr>
+              <w:rPr>
+                <w:rFonts w:ascii="Cambria Math" w:hAnsi="Cambria Math"/>
+                <w:i/>
+              </w:rPr>
+            </m:ctrlPr>
+          </m:accPr>
+          <m:e>
+            <m:r>
+              <w:rPr>
+                <w:rFonts w:ascii="Cambria Math" w:hAnsi="Cambria Math"/>
+              </w:rPr>
+              <m:t>x</m:t>
+            </m:r>
+          </m:e>
+        </m:acc>
+      </m:oMath>
+      <w:r>
+        <w:t>-el fogom jelölni azt az értéket, amely az ∂</w:t>
+      </w:r>
+      <w:r>
+        <w:t>Ω</w:t>
+      </w:r>
+      <w:r>
+        <w:t xml:space="preserve"> peremen legközelebb van az x ponthoz. A </w:t>
+      </w:r>
+      <m:oMath>
+        <m:r>
+          <w:rPr>
+            <w:rFonts w:ascii="Cambria Math" w:hAnsi="Cambria Math"/>
+          </w:rPr>
+          <m:t>∆</m:t>
+        </m:r>
+      </m:oMath>
+      <w:r>
+        <w:t xml:space="preserve">-al fogom jelölni a Laplace operátort </w:t>
+      </w:r>
+      <m:oMath>
+        <m:sSup>
+          <m:sSupPr>
+            <m:ctrlPr>
+              <w:rPr>
+                <w:rFonts w:ascii="Cambria Math" w:hAnsi="Cambria Math"/>
+                <w:i/>
+              </w:rPr>
+            </m:ctrlPr>
+          </m:sSupPr>
+          <m:e>
+            <m:r>
+              <w:rPr>
+                <w:rFonts w:ascii="Cambria Math" w:hAnsi="Cambria Math"/>
+              </w:rPr>
+              <m:t>R</m:t>
+            </m:r>
+          </m:e>
+          <m:sup>
+            <m:r>
+              <w:rPr>
+                <w:rFonts w:ascii="Cambria Math" w:hAnsi="Cambria Math"/>
+              </w:rPr>
+              <m:t>n</m:t>
+            </m:r>
+          </m:sup>
+        </m:sSup>
+      </m:oMath>
+      <w:r>
+        <w:t>-ben, valamint</w:t>
+      </w:r>
+      <m:oMath>
+        <m:r>
+          <w:rPr>
+            <w:rFonts w:ascii="Cambria Math" w:hAnsi="Cambria Math"/>
+          </w:rPr>
+          <m:t xml:space="preserve"> X∙Y</m:t>
+        </m:r>
+      </m:oMath>
+      <w:r>
+        <w:t xml:space="preserve">-al a skalárszorzatot, ahol </w:t>
+      </w:r>
+      <m:oMath>
+        <m:r>
+          <w:rPr>
+            <w:rFonts w:ascii="Cambria Math" w:hAnsi="Cambria Math"/>
+          </w:rPr>
+          <m:t>X,Y∈</m:t>
+        </m:r>
+        <m:sSup>
+          <m:sSupPr>
+            <m:ctrlPr>
+              <w:rPr>
+                <w:rFonts w:ascii="Cambria Math" w:hAnsi="Cambria Math"/>
+                <w:i/>
+              </w:rPr>
+            </m:ctrlPr>
+          </m:sSupPr>
+          <m:e>
+            <m:r>
+              <w:rPr>
+                <w:rFonts w:ascii="Cambria Math" w:hAnsi="Cambria Math"/>
+              </w:rPr>
+              <m:t>R</m:t>
+            </m:r>
+          </m:e>
+          <m:sup>
+            <m:r>
+              <w:rPr>
+                <w:rFonts w:ascii="Cambria Math" w:hAnsi="Cambria Math"/>
+              </w:rPr>
+              <m:t>n</m:t>
+            </m:r>
+          </m:sup>
+        </m:sSup>
+      </m:oMath>
+      <w:r>
+        <w:t>.</w:t>
+      </w:r>
+      <w:r>
+        <w:t xml:space="preserve"> [1]</w:t>
+      </w:r>
+    </w:p>
+    <w:p>
+      <w:pPr>
+        <w:pStyle w:val="Heading2"/>
+      </w:pPr>
+      <w:r>
+        <w:t>Monte Carlo Integrálás</w:t>
+      </w:r>
+    </w:p>
+    <w:p>
+      <w:r>
+        <w:t>Mivel maga az algoritmus a Monte Carlo integrálásra alapszik, ezért helyénvalónak tartom a módszer, legalább felületes, bemutatását.</w:t>
+      </w:r>
+    </w:p>
+    <w:p>
+      <w:r>
+        <w:t xml:space="preserve">A Monte Carlo integrálás arra alapszik, hogy egy integrált tudunk úgy megbecsülni, hogy ezt az integrált véletlenszerűen választott pontokban kiértékeljük és a kapott eredményeknek az átlagát vesszük. </w:t>
+      </w:r>
+    </w:p>
+    <w:p>
+      <w:r>
+        <w:t>Adott</w:t>
+      </w:r>
+    </w:p>
+    <w:tbl>
+      <w:tblPr>
+        <w:tblStyle w:val="TableGrid"/>
+        <w:tblW w:w="0" w:type="auto"/>
+        <w:tblBorders>
+          <w:top w:val="none" w:sz="0" w:space="0" w:color="auto"/>
+          <w:left w:val="none" w:sz="0" w:space="0" w:color="auto"/>
+          <w:bottom w:val="none" w:sz="0" w:space="0" w:color="auto"/>
+          <w:right w:val="none" w:sz="0" w:space="0" w:color="auto"/>
+          <w:insideH w:val="none" w:sz="0" w:space="0" w:color="auto"/>
+          <w:insideV w:val="none" w:sz="0" w:space="0" w:color="auto"/>
+        </w:tblBorders>
+        <w:tblLook w:val="04A0" w:firstRow="1" w:lastRow="0" w:firstColumn="1" w:lastColumn="0" w:noHBand="0" w:noVBand="1"/>
+      </w:tblPr>
+      <w:tblGrid>
+        <w:gridCol w:w="7938"/>
+        <w:gridCol w:w="561"/>
+      </w:tblGrid>
+      <w:tr>
+        <w:tc>
+          <w:tcPr>
+            <w:tcW w:w="7938" w:type="dxa"/>
+          </w:tcPr>
+          <w:p>
+            <w:pPr>
+              <w:pStyle w:val="Caption"/>
+            </w:pPr>
+            <m:oMathPara>
+              <m:oMath>
+                <m:r>
+                  <m:rPr>
+                    <m:sty m:val="bi"/>
+                  </m:rPr>
+                  <w:rPr>
+                    <w:rFonts w:ascii="Cambria Math" w:hAnsi="Cambria Math"/>
+                  </w:rPr>
+                  <m:t xml:space="preserve">I≔ </m:t>
+                </m:r>
+                <m:nary>
+                  <m:naryPr>
+                    <m:supHide m:val="1"/>
+                    <m:ctrlPr>
+                      <w:rPr>
+                        <w:rFonts w:ascii="Cambria Math" w:hAnsi="Cambria Math"/>
+                        <w:i/>
+                      </w:rPr>
+                    </m:ctrlPr>
+                  </m:naryPr>
+                  <m:sub>
+                    <m:r>
+                      <m:rPr>
+                        <m:sty m:val="b"/>
+                      </m:rPr>
+                      <w:rPr>
+                        <w:rFonts w:ascii="Cambria Math" w:hAnsi="Cambria Math"/>
+                      </w:rPr>
+                      <m:t>Ω</m:t>
+                    </m:r>
+                  </m:sub>
+                  <m:sup/>
+                  <m:e>
+                    <m:r>
+                      <m:rPr>
+                        <m:sty m:val="bi"/>
+                      </m:rPr>
+                      <w:rPr>
+                        <w:rFonts w:ascii="Cambria Math" w:hAnsi="Cambria Math"/>
+                      </w:rPr>
+                      <m:t>f</m:t>
+                    </m:r>
+                    <m:d>
+                      <m:dPr>
+                        <m:ctrlPr>
+                          <w:rPr>
+                            <w:rFonts w:ascii="Cambria Math" w:hAnsi="Cambria Math"/>
+                            <w:i/>
+                          </w:rPr>
+                        </m:ctrlPr>
+                      </m:dPr>
+                      <m:e>
+                        <m:r>
+                          <m:rPr>
+                            <m:sty m:val="bi"/>
+                          </m:rPr>
+                          <w:rPr>
+                            <w:rFonts w:ascii="Cambria Math" w:hAnsi="Cambria Math"/>
+                          </w:rPr>
+                          <m:t>x</m:t>
+                        </m:r>
+                      </m:e>
+                    </m:d>
+                    <m:r>
+                      <m:rPr>
+                        <m:sty m:val="bi"/>
+                      </m:rPr>
+                      <w:rPr>
+                        <w:rFonts w:ascii="Cambria Math" w:hAnsi="Cambria Math"/>
+                      </w:rPr>
+                      <m:t>dx</m:t>
+                    </m:r>
+                  </m:e>
+                </m:nary>
+              </m:oMath>
+            </m:oMathPara>
+          </w:p>
+        </w:tc>
+        <w:tc>
+          <w:tcPr>
+            <w:tcW w:w="561" w:type="dxa"/>
+          </w:tcPr>
+          <w:p>
+            <w:pPr>
+              <w:pStyle w:val="Caption"/>
+            </w:pPr>
+            <w:r>
+              <w:fldChar w:fldCharType="begin"/>
+            </w:r>
+            <w:r>
+              <w:instrText xml:space="preserve"> SEQ egyenlet \* ARABIC </w:instrText>
+            </w:r>
+            <w:r>
+              <w:fldChar w:fldCharType="separate"/>
+            </w:r>
+            <w:r>
+              <w:rPr>
+                <w:noProof/>
+              </w:rPr>
+              <w:t>1</w:t>
+            </w:r>
+            <w:r>
+              <w:fldChar w:fldCharType="end"/>
+            </w:r>
+          </w:p>
+        </w:tc>
+      </w:tr>
+    </w:tbl>
+    <w:p>
+      <w:r>
+        <w:t xml:space="preserve">ahol f(x) egy integrálható függvény a </w:t>
+      </w:r>
+      <w:r>
+        <w:t>Ω</w:t>
+      </w:r>
+      <w:r>
+        <w:t xml:space="preserve"> tartományban. </w:t>
+      </w:r>
+      <w:r>
+        <w:t xml:space="preserve">Az (1) egyenlet </w:t>
+      </w:r>
+    </w:p>
+    <w:p>
+      <w:pPr>
+        <w:pStyle w:val="Heading2"/>
+        <w:numPr>
+          <w:ilvl w:val="0"/>
+          <w:numId w:val="0"/>
+        </w:numPr>
+      </w:pPr>
+      <w:r>
+        <w:t>Parciális differenciálegyenletek</w:t>
+      </w:r>
+    </w:p>
+    <w:p>
+      <w:r>
+        <w:t>A cikk</w:t>
+      </w:r>
+      <w:r>
+        <w:t>,</w:t>
+      </w:r>
+      <w:r>
+        <w:t xml:space="preserve"> mely alapján implementáltam az algoritmust</w:t>
+      </w:r>
+      <w:r>
+        <w:t>,</w:t>
+      </w:r>
+      <w:r>
+        <w:t xml:space="preserve"> csak lineáris másodrendű PDE-kel foglalkozik, valamint a Dirichlet </w:t>
+      </w:r>
+      <w:r>
+        <w:t>peremérték feltételt feltételezi.</w:t>
+      </w:r>
+      <w:r>
+        <w:t xml:space="preserve"> </w:t>
+      </w:r>
+      <w:r>
+        <w:t>A Dirichlet permérték feltétel elvárja, hogy egy adott Ω tartományon a PDE bizonyos fix értékeket felvegyen, ha ∂</w:t>
+      </w:r>
+      <w:r>
+        <w:t>Ω</w:t>
+      </w:r>
+      <w:r>
+        <w:t xml:space="preserve"> peremen van. Egy ilyen </w:t>
+      </w:r>
+    </w:p>
+    <w:p>
+      <w:pPr>
+        <w:pStyle w:val="Heading2"/>
       </w:pPr>
       <w:bookmarkStart w:id="4" w:name="_Toc332797398"/>
       <w:bookmarkStart w:id="5" w:name="_Toc59896133"/>
@@ -1959,29 +2425,22 @@
       </w:r>
       <w:r>
         <w:rPr>
-          <w:rStyle w:val="Kiemels2"/>
+          <w:rStyle w:val="Strong"/>
         </w:rPr>
         <w:t>Normál</w:t>
       </w:r>
       <w:r>
-        <w:t xml:space="preserve"> (angol Word esetén </w:t>
-      </w:r>
-      <w:proofErr w:type="spellStart"/>
-      <w:r>
-        <w:t>Normal</w:t>
-      </w:r>
-      <w:proofErr w:type="spellEnd"/>
-      <w:r>
-        <w:t>) stílust.</w:t>
-      </w:r>
-    </w:p>
-    <w:p>
-      <w:pPr>
-        <w:pStyle w:val="Cmsor3"/>
+        <w:t xml:space="preserve"> (angol Word esetén Normal) stílust.</w:t>
+      </w:r>
+    </w:p>
+    <w:p>
+      <w:pPr>
+        <w:pStyle w:val="Heading3"/>
       </w:pPr>
       <w:bookmarkStart w:id="6" w:name="_Toc332797399"/>
       <w:bookmarkStart w:id="7" w:name="_Toc59896134"/>
       <w:r>
+        <w:lastRenderedPageBreak/>
         <w:t>Címsorok</w:t>
       </w:r>
       <w:bookmarkEnd w:id="6"/>
@@ -1993,7 +2452,7 @@
       </w:r>
       <w:r>
         <w:rPr>
-          <w:rStyle w:val="Kiemels2"/>
+          <w:rStyle w:val="Strong"/>
         </w:rPr>
         <w:t>Címsor 1-4</w:t>
       </w:r>
@@ -2003,7 +2462,7 @@
     </w:p>
     <w:p>
       <w:pPr>
-        <w:pStyle w:val="Cmsor3"/>
+        <w:pStyle w:val="Heading3"/>
       </w:pPr>
       <w:bookmarkStart w:id="8" w:name="_Toc332797400"/>
       <w:bookmarkStart w:id="9" w:name="_Toc59896135"/>
@@ -2019,7 +2478,7 @@
       </w:r>
       <w:r>
         <w:rPr>
-          <w:rStyle w:val="Kiemels2"/>
+          <w:rStyle w:val="Strong"/>
         </w:rPr>
         <w:t>Kép</w:t>
       </w:r>
@@ -2033,7 +2492,7 @@
       </w:r>
       <w:r>
         <w:rPr>
-          <w:rStyle w:val="Kiemels"/>
+          <w:rStyle w:val="Emphasis"/>
         </w:rPr>
         <w:t>Képaláírás beszúrása…</w:t>
       </w:r>
@@ -2042,20 +2501,12 @@
       </w:r>
       <w:r>
         <w:rPr>
-          <w:rStyle w:val="Kiemels2"/>
+          <w:rStyle w:val="Strong"/>
         </w:rPr>
         <w:t>Képaláírás</w:t>
       </w:r>
       <w:r>
-        <w:t xml:space="preserve"> (</w:t>
-      </w:r>
-      <w:proofErr w:type="spellStart"/>
-      <w:r>
-        <w:t>Caption</w:t>
-      </w:r>
-      <w:proofErr w:type="spellEnd"/>
-      <w:r>
-        <w:t>) stílusú lesz.</w:t>
+        <w:t xml:space="preserve"> (Caption) stílusú lesz.</w:t>
       </w:r>
     </w:p>
     <w:p>
@@ -2119,13 +2570,13 @@
     </w:p>
     <w:p>
       <w:pPr>
-        <w:pStyle w:val="Kpalrs"/>
+        <w:pStyle w:val="Caption"/>
       </w:pPr>
       <w:r>
         <w:fldChar w:fldCharType="begin"/>
       </w:r>
       <w:r>
-        <w:instrText xml:space="preserve"> STYLEREF 1 \s </w:instrText>
+        <w:instrText xml:space="preserve"> SEQ ábra \* ARABIC </w:instrText>
       </w:r>
       <w:r>
         <w:fldChar w:fldCharType="separate"/>
@@ -2134,45 +2585,18 @@
         <w:rPr>
           <w:noProof/>
         </w:rPr>
-        <w:t>1</w:t>
-      </w:r>
-      <w:r>
-        <w:rPr>
-          <w:noProof/>
-        </w:rPr>
+        <w:t>2</w:t>
+      </w:r>
+      <w:r>
         <w:fldChar w:fldCharType="end"/>
       </w:r>
       <w:r>
-        <w:t>.</w:t>
-      </w:r>
-      <w:r>
-        <w:fldChar w:fldCharType="begin"/>
-      </w:r>
-      <w:r>
-        <w:instrText xml:space="preserve"> SEQ ábra \* ARABIC \s 1 </w:instrText>
-      </w:r>
-      <w:r>
-        <w:fldChar w:fldCharType="separate"/>
-      </w:r>
-      <w:r>
-        <w:rPr>
-          <w:noProof/>
-        </w:rPr>
-        <w:t>1</w:t>
-      </w:r>
-      <w:r>
-        <w:rPr>
-          <w:noProof/>
-        </w:rPr>
-        <w:fldChar w:fldCharType="end"/>
-      </w:r>
-      <w:r>
         <w:t>. ábra: Példa képaláírásra</w:t>
       </w:r>
     </w:p>
     <w:p>
       <w:pPr>
-        <w:pStyle w:val="Cmsor3"/>
+        <w:pStyle w:val="Heading3"/>
       </w:pPr>
       <w:bookmarkStart w:id="10" w:name="_Toc332797401"/>
       <w:bookmarkStart w:id="11" w:name="_Toc59896136"/>
@@ -2188,7 +2612,7 @@
       </w:r>
       <w:r>
         <w:rPr>
-          <w:rStyle w:val="Kiemels2"/>
+          <w:rStyle w:val="Strong"/>
         </w:rPr>
         <w:t>Kód</w:t>
       </w:r>
@@ -2200,32 +2624,17 @@
       <w:pPr>
         <w:pStyle w:val="Kd"/>
       </w:pPr>
-      <w:proofErr w:type="spellStart"/>
-      <w:r>
-        <w:t>using</w:t>
-      </w:r>
-      <w:proofErr w:type="spellEnd"/>
-      <w:r>
-        <w:t xml:space="preserve"> System;</w:t>
+      <w:r>
+        <w:t>using System;</w:t>
       </w:r>
     </w:p>
     <w:p>
       <w:pPr>
         <w:pStyle w:val="Kd"/>
       </w:pPr>
-      <w:proofErr w:type="spellStart"/>
-      <w:r>
-        <w:t>namespace</w:t>
-      </w:r>
-      <w:proofErr w:type="spellEnd"/>
-      <w:r>
-        <w:t xml:space="preserve"> </w:t>
-      </w:r>
-      <w:proofErr w:type="spellStart"/>
-      <w:r>
-        <w:t>MyApp</w:t>
-      </w:r>
-      <w:proofErr w:type="spellEnd"/>
+      <w:r>
+        <w:t>namespace MyApp</w:t>
+      </w:r>
     </w:p>
     <w:p>
       <w:pPr>
@@ -2241,14 +2650,7 @@
       </w:pPr>
       <w:r>
         <w:tab/>
-      </w:r>
-      <w:proofErr w:type="spellStart"/>
-      <w:r>
-        <w:t>class</w:t>
-      </w:r>
-      <w:proofErr w:type="spellEnd"/>
-      <w:r>
-        <w:t xml:space="preserve"> Program</w:t>
+        <w:t>class Program</w:t>
       </w:r>
     </w:p>
     <w:p>
@@ -2270,42 +2672,8 @@
       <w:r>
         <w:tab/>
       </w:r>
-      <w:proofErr w:type="spellStart"/>
-      <w:r>
-        <w:t>static</w:t>
-      </w:r>
-      <w:proofErr w:type="spellEnd"/>
-      <w:r>
-        <w:t xml:space="preserve"> </w:t>
-      </w:r>
-      <w:proofErr w:type="spellStart"/>
-      <w:r>
-        <w:t>void</w:t>
-      </w:r>
-      <w:proofErr w:type="spellEnd"/>
-      <w:r>
-        <w:t xml:space="preserve"> </w:t>
-      </w:r>
-      <w:proofErr w:type="gramStart"/>
-      <w:r>
-        <w:t xml:space="preserve">Main( </w:t>
-      </w:r>
-      <w:proofErr w:type="spellStart"/>
-      <w:r>
-        <w:t>string</w:t>
-      </w:r>
-      <w:proofErr w:type="spellEnd"/>
-      <w:proofErr w:type="gramEnd"/>
-      <w:r>
-        <w:t xml:space="preserve">[] </w:t>
-      </w:r>
-      <w:proofErr w:type="spellStart"/>
-      <w:r>
-        <w:t>args</w:t>
-      </w:r>
-      <w:proofErr w:type="spellEnd"/>
-      <w:r>
-        <w:t xml:space="preserve"> )</w:t>
+      <w:r>
+        <w:t>static void Main( string[] args )</w:t>
       </w:r>
     </w:p>
     <w:p>
@@ -2332,19 +2700,7 @@
       </w:r>
       <w:r>
         <w:tab/>
-      </w:r>
-      <w:proofErr w:type="spellStart"/>
-      <w:r>
-        <w:t>Console.WriteLine</w:t>
-      </w:r>
-      <w:proofErr w:type="spellEnd"/>
-      <w:proofErr w:type="gramStart"/>
-      <w:r>
-        <w:t>( "</w:t>
-      </w:r>
-      <w:proofErr w:type="gramEnd"/>
-      <w:r>
-        <w:t>Szia Világ!" );</w:t>
+        <w:t>Console.WriteLine( "Szia Világ!" );</w:t>
       </w:r>
     </w:p>
     <w:p>
@@ -2388,12 +2744,11 @@
     </w:p>
     <w:p>
       <w:pPr>
-        <w:pStyle w:val="Cmsor3"/>
+        <w:pStyle w:val="Heading3"/>
       </w:pPr>
       <w:bookmarkStart w:id="12" w:name="_Toc332797402"/>
       <w:bookmarkStart w:id="13" w:name="_Toc59896137"/>
       <w:r>
-        <w:lastRenderedPageBreak/>
         <w:t>Irodalomjegyzék</w:t>
       </w:r>
       <w:bookmarkEnd w:id="12"/>
@@ -2405,13 +2760,13 @@
       </w:r>
       <w:r>
         <w:rPr>
-          <w:rStyle w:val="Kiemels2"/>
+          <w:rStyle w:val="Strong"/>
         </w:rPr>
         <w:t xml:space="preserve">Irodalomjegyzék </w:t>
       </w:r>
       <w:r>
         <w:rPr>
-          <w:rStyle w:val="Kiemels2"/>
+          <w:rStyle w:val="Strong"/>
         </w:rPr>
         <w:t>sor</w:t>
       </w:r>
@@ -2420,7 +2775,7 @@
       </w:r>
       <w:r>
         <w:rPr>
-          <w:rStyle w:val="Kiemels2"/>
+          <w:rStyle w:val="Strong"/>
         </w:rPr>
         <w:t xml:space="preserve">Irodalomjegyzék forrás </w:t>
       </w:r>
@@ -2434,28 +2789,12 @@
       </w:r>
       <w:r>
         <w:rPr>
-          <w:rStyle w:val="Kiemels"/>
+          <w:rStyle w:val="Emphasis"/>
         </w:rPr>
         <w:t>Kereszthivatkozás beszúrása</w:t>
       </w:r>
       <w:r>
-        <w:t xml:space="preserve"> (</w:t>
-      </w:r>
-      <w:proofErr w:type="spellStart"/>
-      <w:r>
-        <w:t>Insert</w:t>
-      </w:r>
-      <w:proofErr w:type="spellEnd"/>
-      <w:r>
-        <w:t xml:space="preserve"> </w:t>
-      </w:r>
-      <w:proofErr w:type="spellStart"/>
-      <w:r>
-        <w:t>cross-reference</w:t>
-      </w:r>
-      <w:proofErr w:type="spellEnd"/>
-      <w:r>
-        <w:t xml:space="preserve">) funkcióval helyezzük el (példa egy így beszúrt hivatkozásra: </w:t>
+        <w:t xml:space="preserve"> (Insert cross-reference) funkcióval helyezzük el (példa egy így beszúrt hivatkozásra: </w:t>
       </w:r>
       <w:r>
         <w:fldChar w:fldCharType="begin"/>
@@ -2478,7 +2817,7 @@
     </w:p>
     <w:p>
       <w:pPr>
-        <w:pStyle w:val="Cmsor1"/>
+        <w:pStyle w:val="Heading1"/>
       </w:pPr>
       <w:bookmarkStart w:id="14" w:name="_Toc332797403"/>
       <w:bookmarkStart w:id="15" w:name="_Toc59896138"/>
@@ -2503,20 +2842,12 @@
       </w:pPr>
       <w:r>
         <w:rPr>
-          <w:rStyle w:val="Kiemels"/>
+          <w:rStyle w:val="Emphasis"/>
         </w:rPr>
         <w:t>Kereszthivatkozások frissítése:</w:t>
       </w:r>
       <w:r>
-        <w:t xml:space="preserve"> miután kijelöltük a teljes szöveget (</w:t>
-      </w:r>
-      <w:proofErr w:type="spellStart"/>
-      <w:r>
-        <w:t>Ctrl+A</w:t>
-      </w:r>
-      <w:proofErr w:type="spellEnd"/>
-      <w:r>
-        <w:t>), nyomjuk meg az F9 billentyűt, és a Word frissíti az összes kereszthivatkozást. Ilyenkor ellenőrizzük, hogy nem jelent-e meg valahol a "Hiba! A könyvjelző nem létezik." szöveg.</w:t>
+        <w:t xml:space="preserve"> miután kijelöltük a teljes szöveget (Ctrl+A), nyomjuk meg az F9 billentyűt, és a Word frissíti az összes kereszthivatkozást. Ilyenkor ellenőrizzük, hogy nem jelent-e meg valahol a "Hiba! A könyvjelző nem létezik." szöveg.</w:t>
       </w:r>
     </w:p>
     <w:p>
@@ -2528,20 +2859,12 @@
       </w:pPr>
       <w:r>
         <w:rPr>
-          <w:rStyle w:val="Kiemels"/>
+          <w:rStyle w:val="Emphasis"/>
         </w:rPr>
         <w:t>Dokumentum tulajdonságok megadása:</w:t>
       </w:r>
       <w:r>
-        <w:t xml:space="preserve"> a dokumentumhoz tartozó </w:t>
-      </w:r>
-      <w:proofErr w:type="spellStart"/>
-      <w:r>
-        <w:t>meta</w:t>
-      </w:r>
-      <w:proofErr w:type="spellEnd"/>
-      <w:r>
-        <w:t xml:space="preserve"> adatok kitöltése (szerző, cím, kulcsszavak stb.). Erre való a Dokumentum tulajdonságai panel, mely a Fájl / Információ / Tulajdonságok / Dokumentumpanel megjelenítése úton érhető el.</w:t>
+        <w:t xml:space="preserve"> a dokumentumhoz tartozó meta adatok kitöltése (szerző, cím, kulcsszavak stb.). Erre való a Dokumentum tulajdonságai panel, mely a Fájl / Információ / Tulajdonságok / Dokumentumpanel megjelenítése úton érhető el.</w:t>
       </w:r>
     </w:p>
     <w:p>
@@ -2553,7 +2876,7 @@
       </w:pPr>
       <w:r>
         <w:rPr>
-          <w:rStyle w:val="Kiemels"/>
+          <w:rStyle w:val="Emphasis"/>
         </w:rPr>
         <w:t>Kinézet ellenőrzése PDF-ben:</w:t>
       </w:r>
@@ -2577,142 +2900,87 @@
       <w:pPr>
         <w:pStyle w:val="Irodalomjegyzksor"/>
       </w:pPr>
-      <w:bookmarkStart w:id="17" w:name="_Ref332797594"/>
-      <w:r>
-        <w:t>Levendovszky, J., Jereb, L.,</w:t>
-      </w:r>
-      <w:r>
-        <w:t xml:space="preserve"> Elek, Zs., Vesztergombi, Gy.: </w:t>
-      </w:r>
-      <w:r>
-        <w:rPr>
-          <w:rStyle w:val="Irodalomjegyzkforrs"/>
-        </w:rPr>
-        <w:t>Adaptive statistical algorithms in network reliability analysis</w:t>
-      </w:r>
-      <w:r>
-        <w:t xml:space="preserve">, </w:t>
-      </w:r>
-      <w:r>
-        <w:t>Performance Evaluation - Elsevier</w:t>
-      </w:r>
-      <w:r>
-        <w:t>, Vol. 48, 2002, pp. 225-236</w:t>
-      </w:r>
+      <w:sdt>
+        <w:sdtPr>
+          <w:id w:val="251015663"/>
+          <w:citation/>
+        </w:sdtPr>
+        <w:sdtContent>
+          <w:bookmarkStart w:id="17" w:name="_Ref183355875"/>
+          <w:r>
+            <w:fldChar w:fldCharType="begin"/>
+          </w:r>
+          <w:r>
+            <w:instrText xml:space="preserve"> CITATION Saw20 \l 1038 </w:instrText>
+          </w:r>
+          <w:r>
+            <w:fldChar w:fldCharType="separate"/>
+          </w:r>
+          <w:r>
+            <w:t>(Sawhney, 2020 )</w:t>
+          </w:r>
+          <w:r>
+            <w:fldChar w:fldCharType="end"/>
+          </w:r>
+        </w:sdtContent>
+      </w:sdt>
       <w:bookmarkEnd w:id="17"/>
     </w:p>
     <w:p>
       <w:pPr>
         <w:pStyle w:val="Irodalomjegyzksor"/>
       </w:pPr>
-      <w:r>
-        <w:t>National Istrume</w:t>
-      </w:r>
-      <w:r>
-        <w:t>nts:</w:t>
-      </w:r>
-      <w:r>
-        <w:t xml:space="preserve"> </w:t>
-      </w:r>
-      <w:r>
-        <w:rPr>
-          <w:rStyle w:val="Irodalomjegyzkforrs"/>
-        </w:rPr>
-        <w:t>LabVIEW grafik</w:t>
-      </w:r>
-      <w:r>
-        <w:rPr>
-          <w:rStyle w:val="Irodalomjegyzkforrs"/>
-        </w:rPr>
-        <w:t>us fejlesztői környezet leírása</w:t>
-      </w:r>
-      <w:r>
-        <w:t>,</w:t>
-      </w:r>
-      <w:r>
-        <w:t xml:space="preserve"> </w:t>
-      </w:r>
-      <w:hyperlink r:id="rId11" w:history="1">
-        <w:r>
-          <w:rPr>
-            <w:rStyle w:val="Hiperhivatkozs"/>
-          </w:rPr>
-          <w:t>http://www.ni.com/</w:t>
-        </w:r>
-      </w:hyperlink>
-      <w:r>
-        <w:t xml:space="preserve"> </w:t>
-      </w:r>
-      <w:r>
-        <w:t>(</w:t>
-      </w:r>
-      <w:r>
-        <w:t>2010. nov.)</w:t>
-      </w:r>
+      <w:sdt>
+        <w:sdtPr>
+          <w:id w:val="1802802759"/>
+          <w:citation/>
+        </w:sdtPr>
+        <w:sdtContent>
+          <w:bookmarkStart w:id="18" w:name="_Ref183355924"/>
+          <w:r>
+            <w:fldChar w:fldCharType="begin"/>
+          </w:r>
+          <w:r>
+            <w:instrText xml:space="preserve"> CITATION FEM24 \l 1038 </w:instrText>
+          </w:r>
+          <w:r>
+            <w:fldChar w:fldCharType="separate"/>
+          </w:r>
+          <w:r>
+            <w:t>(Finite Element Method, 2024)</w:t>
+          </w:r>
+          <w:r>
+            <w:fldChar w:fldCharType="end"/>
+          </w:r>
+        </w:sdtContent>
+      </w:sdt>
+      <w:bookmarkEnd w:id="18"/>
     </w:p>
     <w:p>
       <w:pPr>
         <w:pStyle w:val="Irodalomjegyzksor"/>
       </w:pPr>
-      <w:r>
-        <w:t xml:space="preserve">Fowler, M.: </w:t>
-      </w:r>
-      <w:r>
-        <w:rPr>
-          <w:rStyle w:val="Irodalomjegyzkforrs"/>
-        </w:rPr>
-        <w:t>UML Distilled</w:t>
-      </w:r>
-      <w:r>
-        <w:t>, 3rd edition, ISBN 0-321-19368-7, Addison-Wesley, 2004</w:t>
-      </w:r>
-    </w:p>
-    <w:p>
-      <w:pPr>
-        <w:pStyle w:val="Irodalomjegyzksor"/>
-      </w:pPr>
-      <w:r>
-        <w:t xml:space="preserve">Wikipedia: </w:t>
-      </w:r>
-      <w:r>
-        <w:rPr>
-          <w:rStyle w:val="Irodalomjegyzkforrs"/>
-        </w:rPr>
-        <w:t>Evaluation strategy</w:t>
-      </w:r>
-      <w:r>
-        <w:t xml:space="preserve">, </w:t>
-      </w:r>
-      <w:hyperlink r:id="rId12" w:history="1">
-        <w:r>
-          <w:rPr>
-            <w:rStyle w:val="Hiperhivatkozs"/>
-          </w:rPr>
-          <w:t>http://en.wikipedia.org/wiki/Evaluation_strategy</w:t>
-        </w:r>
-      </w:hyperlink>
-      <w:r>
-        <w:t xml:space="preserve"> </w:t>
-      </w:r>
-      <w:r>
-        <w:t>(revision 18:11, 31 July 2012)</w:t>
-      </w:r>
+      <w:bookmarkStart w:id="19" w:name="_Ref183355930"/>
+      <w:r>
+        <w:t>https://www.investopedia.com/terms/m/montecarlosimulation.asp</w:t>
+      </w:r>
+      <w:bookmarkEnd w:id="19"/>
     </w:p>
     <w:p>
       <w:pPr>
         <w:pStyle w:val="Fejezetcimszmozsnlkl"/>
       </w:pPr>
-      <w:bookmarkStart w:id="18" w:name="_Toc59896140"/>
+      <w:bookmarkStart w:id="20" w:name="_Toc59896140"/>
       <w:r>
         <w:lastRenderedPageBreak/>
         <w:t>Függelék</w:t>
       </w:r>
-      <w:bookmarkEnd w:id="18"/>
+      <w:bookmarkEnd w:id="20"/>
     </w:p>
     <w:p/>
     <w:sectPr>
-      <w:headerReference w:type="even" r:id="rId13"/>
-      <w:footerReference w:type="default" r:id="rId14"/>
+      <w:headerReference w:type="even" r:id="rId11"/>
+      <w:footerReference w:type="default" r:id="rId12"/>
       <w:type w:val="continuous"/>
       <w:pgSz w:w="11907" w:h="16840" w:code="9"/>
       <w:pgMar w:top="1418" w:right="1418" w:bottom="1418" w:left="1418" w:header="709" w:footer="709" w:gutter="567"/>
@@ -2725,7 +2993,7 @@
 </file>
 
 <file path=word/endnotes.xml><?xml version="1.0" encoding="utf-8"?>
-<w:endnotes xmlns:wpc="http://schemas.microsoft.com/office/word/2010/wordprocessingCanvas" xmlns:cx="http://schemas.microsoft.com/office/drawing/2014/chartex" xmlns:cx1="http://schemas.microsoft.com/office/drawing/2015/9/8/chartex" xmlns:cx2="http://schemas.microsoft.com/office/drawing/2015/10/21/chartex" xmlns:cx3="http://schemas.microsoft.com/office/drawing/2016/5/9/chartex" xmlns:cx4="http://schemas.microsoft.com/office/drawing/2016/5/10/chartex" xmlns:cx5="http://schemas.microsoft.com/office/drawing/2016/5/11/chartex" xmlns:cx6="http://schemas.microsoft.com/office/drawing/2016/5/12/chartex" xmlns:cx7="http://schemas.microsoft.com/office/drawing/2016/5/13/chartex" xmlns:cx8="http://schemas.microsoft.com/office/drawing/2016/5/14/chartex" xmlns:mc="http://schemas.openxmlformats.org/markup-compatibility/2006" xmlns:aink="http://schemas.microsoft.com/office/drawing/2016/ink" xmlns:am3d="http://schemas.microsoft.com/office/drawing/2017/model3d" xmlns:o="urn:schemas-microsoft-com:office:office" xmlns:r="http://schemas.openxmlformats.org/officeDocument/2006/relationships" xmlns:m="http://schemas.openxmlformats.org/officeDocument/2006/math" xmlns:v="urn:schemas-microsoft-com:vml" xmlns:wp14="http://schemas.microsoft.com/office/word/2010/wordprocessingDrawing" xmlns:wp="http://schemas.openxmlformats.org/drawingml/2006/wordprocessingDrawing" xmlns:w10="urn:schemas-microsoft-com:office:word" xmlns:w="http://schemas.openxmlformats.org/wordprocessingml/2006/main" xmlns:w14="http://schemas.microsoft.com/office/word/2010/wordml" xmlns:w15="http://schemas.microsoft.com/office/word/2012/wordml" xmlns:w16cex="http://schemas.microsoft.com/office/word/2018/wordml/cex" xmlns:w16cid="http://schemas.microsoft.com/office/word/2016/wordml/cid" xmlns:w16="http://schemas.microsoft.com/office/word/2018/wordml" xmlns:w16sdtdh="http://schemas.microsoft.com/office/word/2020/wordml/sdtdatahash" xmlns:w16se="http://schemas.microsoft.com/office/word/2015/wordml/symex" xmlns:wpg="http://schemas.microsoft.com/office/word/2010/wordprocessingGroup" xmlns:wpi="http://schemas.microsoft.com/office/word/2010/wordprocessingInk" xmlns:wne="http://schemas.microsoft.com/office/word/2006/wordml" xmlns:wps="http://schemas.microsoft.com/office/word/2010/wordprocessingShape" mc:Ignorable="w14 w15 w16se w16cid w16 w16cex w16sdtdh wp14">
+<w:endnotes xmlns:wpc="http://schemas.microsoft.com/office/word/2010/wordprocessingCanvas" xmlns:cx="http://schemas.microsoft.com/office/drawing/2014/chartex" xmlns:cx1="http://schemas.microsoft.com/office/drawing/2015/9/8/chartex" xmlns:cx2="http://schemas.microsoft.com/office/drawing/2015/10/21/chartex" xmlns:cx3="http://schemas.microsoft.com/office/drawing/2016/5/9/chartex" xmlns:cx4="http://schemas.microsoft.com/office/drawing/2016/5/10/chartex" xmlns:cx5="http://schemas.microsoft.com/office/drawing/2016/5/11/chartex" xmlns:cx6="http://schemas.microsoft.com/office/drawing/2016/5/12/chartex" xmlns:cx7="http://schemas.microsoft.com/office/drawing/2016/5/13/chartex" xmlns:cx8="http://schemas.microsoft.com/office/drawing/2016/5/14/chartex" xmlns:mc="http://schemas.openxmlformats.org/markup-compatibility/2006" xmlns:aink="http://schemas.microsoft.com/office/drawing/2016/ink" xmlns:am3d="http://schemas.microsoft.com/office/drawing/2017/model3d" xmlns:o="urn:schemas-microsoft-com:office:office" xmlns:oel="http://schemas.microsoft.com/office/2019/extlst" xmlns:r="http://schemas.openxmlformats.org/officeDocument/2006/relationships" xmlns:m="http://schemas.openxmlformats.org/officeDocument/2006/math" xmlns:v="urn:schemas-microsoft-com:vml" xmlns:wp14="http://schemas.microsoft.com/office/word/2010/wordprocessingDrawing" xmlns:wp="http://schemas.openxmlformats.org/drawingml/2006/wordprocessingDrawing" xmlns:w10="urn:schemas-microsoft-com:office:word" xmlns:w="http://schemas.openxmlformats.org/wordprocessingml/2006/main" xmlns:w14="http://schemas.microsoft.com/office/word/2010/wordml" xmlns:w15="http://schemas.microsoft.com/office/word/2012/wordml" xmlns:w16cex="http://schemas.microsoft.com/office/word/2018/wordml/cex" xmlns:w16cid="http://schemas.microsoft.com/office/word/2016/wordml/cid" xmlns:w16="http://schemas.microsoft.com/office/word/2018/wordml" xmlns:w16du="http://schemas.microsoft.com/office/word/2023/wordml/word16du" xmlns:w16sdtdh="http://schemas.microsoft.com/office/word/2020/wordml/sdtdatahash" xmlns:w16se="http://schemas.microsoft.com/office/word/2015/wordml/symex" xmlns:wpg="http://schemas.microsoft.com/office/word/2010/wordprocessingGroup" xmlns:wpi="http://schemas.microsoft.com/office/word/2010/wordprocessingInk" xmlns:wne="http://schemas.microsoft.com/office/word/2006/wordml" xmlns:wps="http://schemas.microsoft.com/office/word/2010/wordprocessingShape" mc:Ignorable="w14 w15 w16se w16cid w16 w16cex w16sdtdh w16du wp14">
   <w:endnote w:type="separator" w:id="-1">
     <w:p>
       <w:r>
@@ -2744,7 +3012,7 @@
 </file>
 
 <file path=word/footer1.xml><?xml version="1.0" encoding="utf-8"?>
-<w:ftr xmlns:wpc="http://schemas.microsoft.com/office/word/2010/wordprocessingCanvas" xmlns:cx="http://schemas.microsoft.com/office/drawing/2014/chartex" xmlns:cx1="http://schemas.microsoft.com/office/drawing/2015/9/8/chartex" xmlns:cx2="http://schemas.microsoft.com/office/drawing/2015/10/21/chartex" xmlns:cx3="http://schemas.microsoft.com/office/drawing/2016/5/9/chartex" xmlns:cx4="http://schemas.microsoft.com/office/drawing/2016/5/10/chartex" xmlns:cx5="http://schemas.microsoft.com/office/drawing/2016/5/11/chartex" xmlns:cx6="http://schemas.microsoft.com/office/drawing/2016/5/12/chartex" xmlns:cx7="http://schemas.microsoft.com/office/drawing/2016/5/13/chartex" xmlns:cx8="http://schemas.microsoft.com/office/drawing/2016/5/14/chartex" xmlns:mc="http://schemas.openxmlformats.org/markup-compatibility/2006" xmlns:aink="http://schemas.microsoft.com/office/drawing/2016/ink" xmlns:am3d="http://schemas.microsoft.com/office/drawing/2017/model3d" xmlns:o="urn:schemas-microsoft-com:office:office" xmlns:r="http://schemas.openxmlformats.org/officeDocument/2006/relationships" xmlns:m="http://schemas.openxmlformats.org/officeDocument/2006/math" xmlns:v="urn:schemas-microsoft-com:vml" xmlns:wp14="http://schemas.microsoft.com/office/word/2010/wordprocessingDrawing" xmlns:wp="http://schemas.openxmlformats.org/drawingml/2006/wordprocessingDrawing" xmlns:w10="urn:schemas-microsoft-com:office:word" xmlns:w="http://schemas.openxmlformats.org/wordprocessingml/2006/main" xmlns:w14="http://schemas.microsoft.com/office/word/2010/wordml" xmlns:w15="http://schemas.microsoft.com/office/word/2012/wordml" xmlns:w16cex="http://schemas.microsoft.com/office/word/2018/wordml/cex" xmlns:w16cid="http://schemas.microsoft.com/office/word/2016/wordml/cid" xmlns:w16="http://schemas.microsoft.com/office/word/2018/wordml" xmlns:w16sdtdh="http://schemas.microsoft.com/office/word/2020/wordml/sdtdatahash" xmlns:w16se="http://schemas.microsoft.com/office/word/2015/wordml/symex" xmlns:wpg="http://schemas.microsoft.com/office/word/2010/wordprocessingGroup" xmlns:wpi="http://schemas.microsoft.com/office/word/2010/wordprocessingInk" xmlns:wne="http://schemas.microsoft.com/office/word/2006/wordml" xmlns:wps="http://schemas.microsoft.com/office/word/2010/wordprocessingShape" mc:Ignorable="w14 w15 w16se w16cid w16 w16cex w16sdtdh wp14">
+<w:ftr xmlns:wpc="http://schemas.microsoft.com/office/word/2010/wordprocessingCanvas" xmlns:cx="http://schemas.microsoft.com/office/drawing/2014/chartex" xmlns:cx1="http://schemas.microsoft.com/office/drawing/2015/9/8/chartex" xmlns:cx2="http://schemas.microsoft.com/office/drawing/2015/10/21/chartex" xmlns:cx3="http://schemas.microsoft.com/office/drawing/2016/5/9/chartex" xmlns:cx4="http://schemas.microsoft.com/office/drawing/2016/5/10/chartex" xmlns:cx5="http://schemas.microsoft.com/office/drawing/2016/5/11/chartex" xmlns:cx6="http://schemas.microsoft.com/office/drawing/2016/5/12/chartex" xmlns:cx7="http://schemas.microsoft.com/office/drawing/2016/5/13/chartex" xmlns:cx8="http://schemas.microsoft.com/office/drawing/2016/5/14/chartex" xmlns:mc="http://schemas.openxmlformats.org/markup-compatibility/2006" xmlns:aink="http://schemas.microsoft.com/office/drawing/2016/ink" xmlns:am3d="http://schemas.microsoft.com/office/drawing/2017/model3d" xmlns:o="urn:schemas-microsoft-com:office:office" xmlns:oel="http://schemas.microsoft.com/office/2019/extlst" xmlns:r="http://schemas.openxmlformats.org/officeDocument/2006/relationships" xmlns:m="http://schemas.openxmlformats.org/officeDocument/2006/math" xmlns:v="urn:schemas-microsoft-com:vml" xmlns:wp14="http://schemas.microsoft.com/office/word/2010/wordprocessingDrawing" xmlns:wp="http://schemas.openxmlformats.org/drawingml/2006/wordprocessingDrawing" xmlns:w10="urn:schemas-microsoft-com:office:word" xmlns:w="http://schemas.openxmlformats.org/wordprocessingml/2006/main" xmlns:w14="http://schemas.microsoft.com/office/word/2010/wordml" xmlns:w15="http://schemas.microsoft.com/office/word/2012/wordml" xmlns:w16cex="http://schemas.microsoft.com/office/word/2018/wordml/cex" xmlns:w16cid="http://schemas.microsoft.com/office/word/2016/wordml/cid" xmlns:w16="http://schemas.microsoft.com/office/word/2018/wordml" xmlns:w16du="http://schemas.microsoft.com/office/word/2023/wordml/word16du" xmlns:w16sdtdh="http://schemas.microsoft.com/office/word/2020/wordml/sdtdatahash" xmlns:w16se="http://schemas.microsoft.com/office/word/2015/wordml/symex" xmlns:wpg="http://schemas.microsoft.com/office/word/2010/wordprocessingGroup" xmlns:wpi="http://schemas.microsoft.com/office/word/2010/wordprocessingInk" xmlns:wne="http://schemas.microsoft.com/office/word/2006/wordml" xmlns:wps="http://schemas.microsoft.com/office/word/2010/wordprocessingShape" mc:Ignorable="w14 w15 w16se w16cid w16 w16cex w16sdtdh w16du wp14">
   <w:p>
     <w:pPr>
       <w:jc w:val="right"/>
@@ -2754,45 +3022,45 @@
 </file>
 
 <file path=word/footer2.xml><?xml version="1.0" encoding="utf-8"?>
-<w:ftr xmlns:wpc="http://schemas.microsoft.com/office/word/2010/wordprocessingCanvas" xmlns:cx="http://schemas.microsoft.com/office/drawing/2014/chartex" xmlns:cx1="http://schemas.microsoft.com/office/drawing/2015/9/8/chartex" xmlns:cx2="http://schemas.microsoft.com/office/drawing/2015/10/21/chartex" xmlns:cx3="http://schemas.microsoft.com/office/drawing/2016/5/9/chartex" xmlns:cx4="http://schemas.microsoft.com/office/drawing/2016/5/10/chartex" xmlns:cx5="http://schemas.microsoft.com/office/drawing/2016/5/11/chartex" xmlns:cx6="http://schemas.microsoft.com/office/drawing/2016/5/12/chartex" xmlns:cx7="http://schemas.microsoft.com/office/drawing/2016/5/13/chartex" xmlns:cx8="http://schemas.microsoft.com/office/drawing/2016/5/14/chartex" xmlns:mc="http://schemas.openxmlformats.org/markup-compatibility/2006" xmlns:aink="http://schemas.microsoft.com/office/drawing/2016/ink" xmlns:am3d="http://schemas.microsoft.com/office/drawing/2017/model3d" xmlns:o="urn:schemas-microsoft-com:office:office" xmlns:r="http://schemas.openxmlformats.org/officeDocument/2006/relationships" xmlns:m="http://schemas.openxmlformats.org/officeDocument/2006/math" xmlns:v="urn:schemas-microsoft-com:vml" xmlns:wp14="http://schemas.microsoft.com/office/word/2010/wordprocessingDrawing" xmlns:wp="http://schemas.openxmlformats.org/drawingml/2006/wordprocessingDrawing" xmlns:w10="urn:schemas-microsoft-com:office:word" xmlns:w="http://schemas.openxmlformats.org/wordprocessingml/2006/main" xmlns:w14="http://schemas.microsoft.com/office/word/2010/wordml" xmlns:w15="http://schemas.microsoft.com/office/word/2012/wordml" xmlns:w16cex="http://schemas.microsoft.com/office/word/2018/wordml/cex" xmlns:w16cid="http://schemas.microsoft.com/office/word/2016/wordml/cid" xmlns:w16="http://schemas.microsoft.com/office/word/2018/wordml" xmlns:w16sdtdh="http://schemas.microsoft.com/office/word/2020/wordml/sdtdatahash" xmlns:w16se="http://schemas.microsoft.com/office/word/2015/wordml/symex" xmlns:wpg="http://schemas.microsoft.com/office/word/2010/wordprocessingGroup" xmlns:wpi="http://schemas.microsoft.com/office/word/2010/wordprocessingInk" xmlns:wne="http://schemas.microsoft.com/office/word/2006/wordml" xmlns:wps="http://schemas.microsoft.com/office/word/2010/wordprocessingShape" mc:Ignorable="w14 w15 w16se w16cid w16 w16cex w16sdtdh wp14">
+<w:ftr xmlns:wpc="http://schemas.microsoft.com/office/word/2010/wordprocessingCanvas" xmlns:cx="http://schemas.microsoft.com/office/drawing/2014/chartex" xmlns:cx1="http://schemas.microsoft.com/office/drawing/2015/9/8/chartex" xmlns:cx2="http://schemas.microsoft.com/office/drawing/2015/10/21/chartex" xmlns:cx3="http://schemas.microsoft.com/office/drawing/2016/5/9/chartex" xmlns:cx4="http://schemas.microsoft.com/office/drawing/2016/5/10/chartex" xmlns:cx5="http://schemas.microsoft.com/office/drawing/2016/5/11/chartex" xmlns:cx6="http://schemas.microsoft.com/office/drawing/2016/5/12/chartex" xmlns:cx7="http://schemas.microsoft.com/office/drawing/2016/5/13/chartex" xmlns:cx8="http://schemas.microsoft.com/office/drawing/2016/5/14/chartex" xmlns:mc="http://schemas.openxmlformats.org/markup-compatibility/2006" xmlns:aink="http://schemas.microsoft.com/office/drawing/2016/ink" xmlns:am3d="http://schemas.microsoft.com/office/drawing/2017/model3d" xmlns:o="urn:schemas-microsoft-com:office:office" xmlns:oel="http://schemas.microsoft.com/office/2019/extlst" xmlns:r="http://schemas.openxmlformats.org/officeDocument/2006/relationships" xmlns:m="http://schemas.openxmlformats.org/officeDocument/2006/math" xmlns:v="urn:schemas-microsoft-com:vml" xmlns:wp14="http://schemas.microsoft.com/office/word/2010/wordprocessingDrawing" xmlns:wp="http://schemas.openxmlformats.org/drawingml/2006/wordprocessingDrawing" xmlns:w10="urn:schemas-microsoft-com:office:word" xmlns:w="http://schemas.openxmlformats.org/wordprocessingml/2006/main" xmlns:w14="http://schemas.microsoft.com/office/word/2010/wordml" xmlns:w15="http://schemas.microsoft.com/office/word/2012/wordml" xmlns:w16cex="http://schemas.microsoft.com/office/word/2018/wordml/cex" xmlns:w16cid="http://schemas.microsoft.com/office/word/2016/wordml/cid" xmlns:w16="http://schemas.microsoft.com/office/word/2018/wordml" xmlns:w16du="http://schemas.microsoft.com/office/word/2023/wordml/word16du" xmlns:w16sdtdh="http://schemas.microsoft.com/office/word/2020/wordml/sdtdatahash" xmlns:w16se="http://schemas.microsoft.com/office/word/2015/wordml/symex" xmlns:wpg="http://schemas.microsoft.com/office/word/2010/wordprocessingGroup" xmlns:wpi="http://schemas.microsoft.com/office/word/2010/wordprocessingInk" xmlns:wne="http://schemas.microsoft.com/office/word/2006/wordml" xmlns:wps="http://schemas.microsoft.com/office/word/2010/wordprocessingShape" mc:Ignorable="w14 w15 w16se w16cid w16 w16cex w16sdtdh w16du wp14">
   <w:p>
     <w:pPr>
-      <w:pStyle w:val="llb"/>
+      <w:pStyle w:val="Footer"/>
     </w:pPr>
     <w:r>
       <w:rPr>
-        <w:rStyle w:val="Oldalszm"/>
+        <w:rStyle w:val="PageNumber"/>
       </w:rPr>
       <w:tab/>
     </w:r>
     <w:r>
       <w:rPr>
-        <w:rStyle w:val="Oldalszm"/>
+        <w:rStyle w:val="PageNumber"/>
       </w:rPr>
       <w:fldChar w:fldCharType="begin"/>
     </w:r>
     <w:r>
       <w:rPr>
-        <w:rStyle w:val="Oldalszm"/>
+        <w:rStyle w:val="PageNumber"/>
       </w:rPr>
       <w:instrText xml:space="preserve"> PAGE </w:instrText>
     </w:r>
     <w:r>
       <w:rPr>
-        <w:rStyle w:val="Oldalszm"/>
+        <w:rStyle w:val="PageNumber"/>
       </w:rPr>
       <w:fldChar w:fldCharType="separate"/>
     </w:r>
     <w:r>
       <w:rPr>
-        <w:rStyle w:val="Oldalszm"/>
+        <w:rStyle w:val="PageNumber"/>
         <w:noProof/>
       </w:rPr>
       <w:t>12</w:t>
     </w:r>
     <w:r>
       <w:rPr>
-        <w:rStyle w:val="Oldalszm"/>
+        <w:rStyle w:val="PageNumber"/>
       </w:rPr>
       <w:fldChar w:fldCharType="end"/>
     </w:r>
@@ -2801,7 +3069,7 @@
 </file>
 
 <file path=word/footnotes.xml><?xml version="1.0" encoding="utf-8"?>
-<w:footnotes xmlns:wpc="http://schemas.microsoft.com/office/word/2010/wordprocessingCanvas" xmlns:cx="http://schemas.microsoft.com/office/drawing/2014/chartex" xmlns:cx1="http://schemas.microsoft.com/office/drawing/2015/9/8/chartex" xmlns:cx2="http://schemas.microsoft.com/office/drawing/2015/10/21/chartex" xmlns:cx3="http://schemas.microsoft.com/office/drawing/2016/5/9/chartex" xmlns:cx4="http://schemas.microsoft.com/office/drawing/2016/5/10/chartex" xmlns:cx5="http://schemas.microsoft.com/office/drawing/2016/5/11/chartex" xmlns:cx6="http://schemas.microsoft.com/office/drawing/2016/5/12/chartex" xmlns:cx7="http://schemas.microsoft.com/office/drawing/2016/5/13/chartex" xmlns:cx8="http://schemas.microsoft.com/office/drawing/2016/5/14/chartex" xmlns:mc="http://schemas.openxmlformats.org/markup-compatibility/2006" xmlns:aink="http://schemas.microsoft.com/office/drawing/2016/ink" xmlns:am3d="http://schemas.microsoft.com/office/drawing/2017/model3d" xmlns:o="urn:schemas-microsoft-com:office:office" xmlns:r="http://schemas.openxmlformats.org/officeDocument/2006/relationships" xmlns:m="http://schemas.openxmlformats.org/officeDocument/2006/math" xmlns:v="urn:schemas-microsoft-com:vml" xmlns:wp14="http://schemas.microsoft.com/office/word/2010/wordprocessingDrawing" xmlns:wp="http://schemas.openxmlformats.org/drawingml/2006/wordprocessingDrawing" xmlns:w10="urn:schemas-microsoft-com:office:word" xmlns:w="http://schemas.openxmlformats.org/wordprocessingml/2006/main" xmlns:w14="http://schemas.microsoft.com/office/word/2010/wordml" xmlns:w15="http://schemas.microsoft.com/office/word/2012/wordml" xmlns:w16cex="http://schemas.microsoft.com/office/word/2018/wordml/cex" xmlns:w16cid="http://schemas.microsoft.com/office/word/2016/wordml/cid" xmlns:w16="http://schemas.microsoft.com/office/word/2018/wordml" xmlns:w16sdtdh="http://schemas.microsoft.com/office/word/2020/wordml/sdtdatahash" xmlns:w16se="http://schemas.microsoft.com/office/word/2015/wordml/symex" xmlns:wpg="http://schemas.microsoft.com/office/word/2010/wordprocessingGroup" xmlns:wpi="http://schemas.microsoft.com/office/word/2010/wordprocessingInk" xmlns:wne="http://schemas.microsoft.com/office/word/2006/wordml" xmlns:wps="http://schemas.microsoft.com/office/word/2010/wordprocessingShape" mc:Ignorable="w14 w15 w16se w16cid w16 w16cex w16sdtdh wp14">
+<w:footnotes xmlns:wpc="http://schemas.microsoft.com/office/word/2010/wordprocessingCanvas" xmlns:cx="http://schemas.microsoft.com/office/drawing/2014/chartex" xmlns:cx1="http://schemas.microsoft.com/office/drawing/2015/9/8/chartex" xmlns:cx2="http://schemas.microsoft.com/office/drawing/2015/10/21/chartex" xmlns:cx3="http://schemas.microsoft.com/office/drawing/2016/5/9/chartex" xmlns:cx4="http://schemas.microsoft.com/office/drawing/2016/5/10/chartex" xmlns:cx5="http://schemas.microsoft.com/office/drawing/2016/5/11/chartex" xmlns:cx6="http://schemas.microsoft.com/office/drawing/2016/5/12/chartex" xmlns:cx7="http://schemas.microsoft.com/office/drawing/2016/5/13/chartex" xmlns:cx8="http://schemas.microsoft.com/office/drawing/2016/5/14/chartex" xmlns:mc="http://schemas.openxmlformats.org/markup-compatibility/2006" xmlns:aink="http://schemas.microsoft.com/office/drawing/2016/ink" xmlns:am3d="http://schemas.microsoft.com/office/drawing/2017/model3d" xmlns:o="urn:schemas-microsoft-com:office:office" xmlns:oel="http://schemas.microsoft.com/office/2019/extlst" xmlns:r="http://schemas.openxmlformats.org/officeDocument/2006/relationships" xmlns:m="http://schemas.openxmlformats.org/officeDocument/2006/math" xmlns:v="urn:schemas-microsoft-com:vml" xmlns:wp14="http://schemas.microsoft.com/office/word/2010/wordprocessingDrawing" xmlns:wp="http://schemas.openxmlformats.org/drawingml/2006/wordprocessingDrawing" xmlns:w10="urn:schemas-microsoft-com:office:word" xmlns:w="http://schemas.openxmlformats.org/wordprocessingml/2006/main" xmlns:w14="http://schemas.microsoft.com/office/word/2010/wordml" xmlns:w15="http://schemas.microsoft.com/office/word/2012/wordml" xmlns:w16cex="http://schemas.microsoft.com/office/word/2018/wordml/cex" xmlns:w16cid="http://schemas.microsoft.com/office/word/2016/wordml/cid" xmlns:w16="http://schemas.microsoft.com/office/word/2018/wordml" xmlns:w16du="http://schemas.microsoft.com/office/word/2023/wordml/word16du" xmlns:w16sdtdh="http://schemas.microsoft.com/office/word/2020/wordml/sdtdatahash" xmlns:w16se="http://schemas.microsoft.com/office/word/2015/wordml/symex" xmlns:wpg="http://schemas.microsoft.com/office/word/2010/wordprocessingGroup" xmlns:wpi="http://schemas.microsoft.com/office/word/2010/wordprocessingInk" xmlns:wne="http://schemas.microsoft.com/office/word/2006/wordml" xmlns:wps="http://schemas.microsoft.com/office/word/2010/wordprocessingShape" mc:Ignorable="w14 w15 w16se w16cid w16 w16cex w16sdtdh w16du wp14">
   <w:footnote w:type="separator" w:id="-1">
     <w:p>
       <w:r>
@@ -2820,7 +3088,7 @@
 </file>
 
 <file path=word/header1.xml><?xml version="1.0" encoding="utf-8"?>
-<w:hdr xmlns:wpc="http://schemas.microsoft.com/office/word/2010/wordprocessingCanvas" xmlns:cx="http://schemas.microsoft.com/office/drawing/2014/chartex" xmlns:cx1="http://schemas.microsoft.com/office/drawing/2015/9/8/chartex" xmlns:cx2="http://schemas.microsoft.com/office/drawing/2015/10/21/chartex" xmlns:cx3="http://schemas.microsoft.com/office/drawing/2016/5/9/chartex" xmlns:cx4="http://schemas.microsoft.com/office/drawing/2016/5/10/chartex" xmlns:cx5="http://schemas.microsoft.com/office/drawing/2016/5/11/chartex" xmlns:cx6="http://schemas.microsoft.com/office/drawing/2016/5/12/chartex" xmlns:cx7="http://schemas.microsoft.com/office/drawing/2016/5/13/chartex" xmlns:cx8="http://schemas.microsoft.com/office/drawing/2016/5/14/chartex" xmlns:mc="http://schemas.openxmlformats.org/markup-compatibility/2006" xmlns:aink="http://schemas.microsoft.com/office/drawing/2016/ink" xmlns:am3d="http://schemas.microsoft.com/office/drawing/2017/model3d" xmlns:o="urn:schemas-microsoft-com:office:office" xmlns:r="http://schemas.openxmlformats.org/officeDocument/2006/relationships" xmlns:m="http://schemas.openxmlformats.org/officeDocument/2006/math" xmlns:v="urn:schemas-microsoft-com:vml" xmlns:wp14="http://schemas.microsoft.com/office/word/2010/wordprocessingDrawing" xmlns:wp="http://schemas.openxmlformats.org/drawingml/2006/wordprocessingDrawing" xmlns:w10="urn:schemas-microsoft-com:office:word" xmlns:w="http://schemas.openxmlformats.org/wordprocessingml/2006/main" xmlns:w14="http://schemas.microsoft.com/office/word/2010/wordml" xmlns:w15="http://schemas.microsoft.com/office/word/2012/wordml" xmlns:w16cex="http://schemas.microsoft.com/office/word/2018/wordml/cex" xmlns:w16cid="http://schemas.microsoft.com/office/word/2016/wordml/cid" xmlns:w16="http://schemas.microsoft.com/office/word/2018/wordml" xmlns:w16sdtdh="http://schemas.microsoft.com/office/word/2020/wordml/sdtdatahash" xmlns:w16se="http://schemas.microsoft.com/office/word/2015/wordml/symex" xmlns:wpg="http://schemas.microsoft.com/office/word/2010/wordprocessingGroup" xmlns:wpi="http://schemas.microsoft.com/office/word/2010/wordprocessingInk" xmlns:wne="http://schemas.microsoft.com/office/word/2006/wordml" xmlns:wps="http://schemas.microsoft.com/office/word/2010/wordprocessingShape" mc:Ignorable="w14 w15 w16se w16cid w16 w16cex w16sdtdh wp14">
+<w:hdr xmlns:wpc="http://schemas.microsoft.com/office/word/2010/wordprocessingCanvas" xmlns:cx="http://schemas.microsoft.com/office/drawing/2014/chartex" xmlns:cx1="http://schemas.microsoft.com/office/drawing/2015/9/8/chartex" xmlns:cx2="http://schemas.microsoft.com/office/drawing/2015/10/21/chartex" xmlns:cx3="http://schemas.microsoft.com/office/drawing/2016/5/9/chartex" xmlns:cx4="http://schemas.microsoft.com/office/drawing/2016/5/10/chartex" xmlns:cx5="http://schemas.microsoft.com/office/drawing/2016/5/11/chartex" xmlns:cx6="http://schemas.microsoft.com/office/drawing/2016/5/12/chartex" xmlns:cx7="http://schemas.microsoft.com/office/drawing/2016/5/13/chartex" xmlns:cx8="http://schemas.microsoft.com/office/drawing/2016/5/14/chartex" xmlns:mc="http://schemas.openxmlformats.org/markup-compatibility/2006" xmlns:aink="http://schemas.microsoft.com/office/drawing/2016/ink" xmlns:am3d="http://schemas.microsoft.com/office/drawing/2017/model3d" xmlns:o="urn:schemas-microsoft-com:office:office" xmlns:oel="http://schemas.microsoft.com/office/2019/extlst" xmlns:r="http://schemas.openxmlformats.org/officeDocument/2006/relationships" xmlns:m="http://schemas.openxmlformats.org/officeDocument/2006/math" xmlns:v="urn:schemas-microsoft-com:vml" xmlns:wp14="http://schemas.microsoft.com/office/word/2010/wordprocessingDrawing" xmlns:wp="http://schemas.openxmlformats.org/drawingml/2006/wordprocessingDrawing" xmlns:w10="urn:schemas-microsoft-com:office:word" xmlns:w="http://schemas.openxmlformats.org/wordprocessingml/2006/main" xmlns:w14="http://schemas.microsoft.com/office/word/2010/wordml" xmlns:w15="http://schemas.microsoft.com/office/word/2012/wordml" xmlns:w16cex="http://schemas.microsoft.com/office/word/2018/wordml/cex" xmlns:w16cid="http://schemas.microsoft.com/office/word/2016/wordml/cid" xmlns:w16="http://schemas.microsoft.com/office/word/2018/wordml" xmlns:w16du="http://schemas.microsoft.com/office/word/2023/wordml/word16du" xmlns:w16sdtdh="http://schemas.microsoft.com/office/word/2020/wordml/sdtdatahash" xmlns:w16se="http://schemas.microsoft.com/office/word/2015/wordml/symex" xmlns:wpg="http://schemas.microsoft.com/office/word/2010/wordprocessingGroup" xmlns:wpi="http://schemas.microsoft.com/office/word/2010/wordprocessingInk" xmlns:wne="http://schemas.microsoft.com/office/word/2006/wordml" xmlns:wps="http://schemas.microsoft.com/office/word/2010/wordprocessingShape" mc:Ignorable="w14 w15 w16se w16cid w16 w16cex w16sdtdh w16du wp14">
   <w:p/>
   <w:p/>
   <w:p/>
@@ -2828,7 +3096,7 @@
 </file>
 
 <file path=word/numbering.xml><?xml version="1.0" encoding="utf-8"?>
-<w:numbering xmlns:wpc="http://schemas.microsoft.com/office/word/2010/wordprocessingCanvas" xmlns:cx="http://schemas.microsoft.com/office/drawing/2014/chartex" xmlns:cx1="http://schemas.microsoft.com/office/drawing/2015/9/8/chartex" xmlns:cx2="http://schemas.microsoft.com/office/drawing/2015/10/21/chartex" xmlns:cx3="http://schemas.microsoft.com/office/drawing/2016/5/9/chartex" xmlns:cx4="http://schemas.microsoft.com/office/drawing/2016/5/10/chartex" xmlns:cx5="http://schemas.microsoft.com/office/drawing/2016/5/11/chartex" xmlns:cx6="http://schemas.microsoft.com/office/drawing/2016/5/12/chartex" xmlns:cx7="http://schemas.microsoft.com/office/drawing/2016/5/13/chartex" xmlns:cx8="http://schemas.microsoft.com/office/drawing/2016/5/14/chartex" xmlns:mc="http://schemas.openxmlformats.org/markup-compatibility/2006" xmlns:aink="http://schemas.microsoft.com/office/drawing/2016/ink" xmlns:am3d="http://schemas.microsoft.com/office/drawing/2017/model3d" xmlns:o="urn:schemas-microsoft-com:office:office" xmlns:r="http://schemas.openxmlformats.org/officeDocument/2006/relationships" xmlns:m="http://schemas.openxmlformats.org/officeDocument/2006/math" xmlns:v="urn:schemas-microsoft-com:vml" xmlns:wp14="http://schemas.microsoft.com/office/word/2010/wordprocessingDrawing" xmlns:wp="http://schemas.openxmlformats.org/drawingml/2006/wordprocessingDrawing" xmlns:w10="urn:schemas-microsoft-com:office:word" xmlns:w="http://schemas.openxmlformats.org/wordprocessingml/2006/main" xmlns:w14="http://schemas.microsoft.com/office/word/2010/wordml" xmlns:w15="http://schemas.microsoft.com/office/word/2012/wordml" xmlns:w16cex="http://schemas.microsoft.com/office/word/2018/wordml/cex" xmlns:w16cid="http://schemas.microsoft.com/office/word/2016/wordml/cid" xmlns:w16="http://schemas.microsoft.com/office/word/2018/wordml" xmlns:w16sdtdh="http://schemas.microsoft.com/office/word/2020/wordml/sdtdatahash" xmlns:w16se="http://schemas.microsoft.com/office/word/2015/wordml/symex" xmlns:wpg="http://schemas.microsoft.com/office/word/2010/wordprocessingGroup" xmlns:wpi="http://schemas.microsoft.com/office/word/2010/wordprocessingInk" xmlns:wne="http://schemas.microsoft.com/office/word/2006/wordml" xmlns:wps="http://schemas.microsoft.com/office/word/2010/wordprocessingShape" mc:Ignorable="w14 w15 w16se w16cid w16 w16cex w16sdtdh wp14">
+<w:numbering xmlns:wpc="http://schemas.microsoft.com/office/word/2010/wordprocessingCanvas" xmlns:cx="http://schemas.microsoft.com/office/drawing/2014/chartex" xmlns:cx1="http://schemas.microsoft.com/office/drawing/2015/9/8/chartex" xmlns:cx2="http://schemas.microsoft.com/office/drawing/2015/10/21/chartex" xmlns:cx3="http://schemas.microsoft.com/office/drawing/2016/5/9/chartex" xmlns:cx4="http://schemas.microsoft.com/office/drawing/2016/5/10/chartex" xmlns:cx5="http://schemas.microsoft.com/office/drawing/2016/5/11/chartex" xmlns:cx6="http://schemas.microsoft.com/office/drawing/2016/5/12/chartex" xmlns:cx7="http://schemas.microsoft.com/office/drawing/2016/5/13/chartex" xmlns:cx8="http://schemas.microsoft.com/office/drawing/2016/5/14/chartex" xmlns:mc="http://schemas.openxmlformats.org/markup-compatibility/2006" xmlns:aink="http://schemas.microsoft.com/office/drawing/2016/ink" xmlns:am3d="http://schemas.microsoft.com/office/drawing/2017/model3d" xmlns:o="urn:schemas-microsoft-com:office:office" xmlns:oel="http://schemas.microsoft.com/office/2019/extlst" xmlns:r="http://schemas.openxmlformats.org/officeDocument/2006/relationships" xmlns:m="http://schemas.openxmlformats.org/officeDocument/2006/math" xmlns:v="urn:schemas-microsoft-com:vml" xmlns:wp14="http://schemas.microsoft.com/office/word/2010/wordprocessingDrawing" xmlns:wp="http://schemas.openxmlformats.org/drawingml/2006/wordprocessingDrawing" xmlns:w10="urn:schemas-microsoft-com:office:word" xmlns:w="http://schemas.openxmlformats.org/wordprocessingml/2006/main" xmlns:w14="http://schemas.microsoft.com/office/word/2010/wordml" xmlns:w15="http://schemas.microsoft.com/office/word/2012/wordml" xmlns:w16cex="http://schemas.microsoft.com/office/word/2018/wordml/cex" xmlns:w16cid="http://schemas.microsoft.com/office/word/2016/wordml/cid" xmlns:w16="http://schemas.microsoft.com/office/word/2018/wordml" xmlns:w16du="http://schemas.microsoft.com/office/word/2023/wordml/word16du" xmlns:w16sdtdh="http://schemas.microsoft.com/office/word/2020/wordml/sdtdatahash" xmlns:w16se="http://schemas.microsoft.com/office/word/2015/wordml/symex" xmlns:wpg="http://schemas.microsoft.com/office/word/2010/wordprocessingGroup" xmlns:wpi="http://schemas.microsoft.com/office/word/2010/wordprocessingInk" xmlns:wne="http://schemas.microsoft.com/office/word/2006/wordml" xmlns:wps="http://schemas.microsoft.com/office/word/2010/wordprocessingShape" mc:Ignorable="w14 w15 w16se w16cid w16 w16cex w16sdtdh w16du wp14">
   <w:abstractNum w:abstractNumId="0" w15:restartNumberingAfterBreak="0">
     <w:nsid w:val="FFFFFF7C"/>
     <w:multiLevelType w:val="singleLevel"/>
@@ -4210,7 +4478,7 @@
     <w:lvl w:ilvl="0">
       <w:start w:val="1"/>
       <w:numFmt w:val="decimal"/>
-      <w:pStyle w:val="Cmsor1"/>
+      <w:pStyle w:val="Heading1"/>
       <w:suff w:val="space"/>
       <w:lvlText w:val="%1"/>
       <w:lvlJc w:val="left"/>
@@ -4224,7 +4492,7 @@
     <w:lvl w:ilvl="1">
       <w:start w:val="1"/>
       <w:numFmt w:val="decimal"/>
-      <w:pStyle w:val="Cmsor2"/>
+      <w:pStyle w:val="Heading2"/>
       <w:suff w:val="space"/>
       <w:lvlText w:val="%1.%2"/>
       <w:lvlJc w:val="left"/>
@@ -4238,7 +4506,7 @@
     <w:lvl w:ilvl="2">
       <w:start w:val="1"/>
       <w:numFmt w:val="decimal"/>
-      <w:pStyle w:val="Cmsor3"/>
+      <w:pStyle w:val="Heading3"/>
       <w:suff w:val="space"/>
       <w:lvlText w:val="%1.%2.%3"/>
       <w:lvlJc w:val="left"/>
@@ -4252,7 +4520,7 @@
     <w:lvl w:ilvl="3">
       <w:start w:val="1"/>
       <w:numFmt w:val="decimal"/>
-      <w:pStyle w:val="Cmsor4"/>
+      <w:pStyle w:val="Heading4"/>
       <w:suff w:val="space"/>
       <w:lvlText w:val="%1.%2.%3.%4"/>
       <w:lvlJc w:val="left"/>
@@ -4266,7 +4534,7 @@
     <w:lvl w:ilvl="4">
       <w:start w:val="1"/>
       <w:numFmt w:val="decimal"/>
-      <w:pStyle w:val="Cmsor5"/>
+      <w:pStyle w:val="Heading5"/>
       <w:lvlText w:val="%1.%2.%3.%4.%5"/>
       <w:lvlJc w:val="left"/>
       <w:pPr>
@@ -4282,7 +4550,7 @@
     <w:lvl w:ilvl="5">
       <w:start w:val="1"/>
       <w:numFmt w:val="decimal"/>
-      <w:pStyle w:val="Cmsor6"/>
+      <w:pStyle w:val="Heading6"/>
       <w:lvlText w:val="%1.%2.%3.%4.%5.%6"/>
       <w:lvlJc w:val="left"/>
       <w:pPr>
@@ -4298,7 +4566,7 @@
     <w:lvl w:ilvl="6">
       <w:start w:val="1"/>
       <w:numFmt w:val="decimal"/>
-      <w:pStyle w:val="Cmsor7"/>
+      <w:pStyle w:val="Heading7"/>
       <w:lvlText w:val="%1.%2.%3.%4.%5.%6.%7"/>
       <w:lvlJc w:val="left"/>
       <w:pPr>
@@ -4314,7 +4582,7 @@
     <w:lvl w:ilvl="7">
       <w:start w:val="1"/>
       <w:numFmt w:val="decimal"/>
-      <w:pStyle w:val="Cmsor8"/>
+      <w:pStyle w:val="Heading8"/>
       <w:lvlText w:val="%1.%2.%3.%4.%5.%6.%7.%8"/>
       <w:lvlJc w:val="left"/>
       <w:pPr>
@@ -4330,7 +4598,7 @@
     <w:lvl w:ilvl="8">
       <w:start w:val="1"/>
       <w:numFmt w:val="decimal"/>
-      <w:pStyle w:val="Cmsor9"/>
+      <w:pStyle w:val="Heading9"/>
       <w:lvlText w:val="%1.%2.%3.%4.%5.%6.%7.%8.%9"/>
       <w:lvlJc w:val="left"/>
       <w:pPr>
@@ -4487,70 +4755,70 @@
       </w:rPr>
     </w:lvl>
   </w:abstractNum>
-  <w:num w:numId="1">
+  <w:num w:numId="1" w16cid:durableId="1675838155">
     <w:abstractNumId w:val="10"/>
   </w:num>
-  <w:num w:numId="2">
+  <w:num w:numId="2" w16cid:durableId="1836991430">
     <w:abstractNumId w:val="20"/>
   </w:num>
-  <w:num w:numId="3">
+  <w:num w:numId="3" w16cid:durableId="891573526">
     <w:abstractNumId w:val="12"/>
   </w:num>
-  <w:num w:numId="4">
+  <w:num w:numId="4" w16cid:durableId="729692673">
     <w:abstractNumId w:val="16"/>
   </w:num>
-  <w:num w:numId="5">
+  <w:num w:numId="5" w16cid:durableId="1064180354">
     <w:abstractNumId w:val="17"/>
   </w:num>
-  <w:num w:numId="6">
+  <w:num w:numId="6" w16cid:durableId="858009432">
     <w:abstractNumId w:val="18"/>
   </w:num>
-  <w:num w:numId="7">
+  <w:num w:numId="7" w16cid:durableId="1913807814">
     <w:abstractNumId w:val="13"/>
   </w:num>
-  <w:num w:numId="8">
+  <w:num w:numId="8" w16cid:durableId="760687161">
     <w:abstractNumId w:val="11"/>
   </w:num>
-  <w:num w:numId="9">
+  <w:num w:numId="9" w16cid:durableId="2126148652">
     <w:abstractNumId w:val="14"/>
   </w:num>
-  <w:num w:numId="10">
+  <w:num w:numId="10" w16cid:durableId="675152112">
     <w:abstractNumId w:val="21"/>
   </w:num>
-  <w:num w:numId="11">
+  <w:num w:numId="11" w16cid:durableId="1417094765">
     <w:abstractNumId w:val="15"/>
   </w:num>
-  <w:num w:numId="12">
+  <w:num w:numId="12" w16cid:durableId="1415588961">
     <w:abstractNumId w:val="19"/>
   </w:num>
-  <w:num w:numId="13">
+  <w:num w:numId="13" w16cid:durableId="1492286194">
     <w:abstractNumId w:val="9"/>
   </w:num>
-  <w:num w:numId="14">
+  <w:num w:numId="14" w16cid:durableId="1843348622">
     <w:abstractNumId w:val="7"/>
   </w:num>
-  <w:num w:numId="15">
+  <w:num w:numId="15" w16cid:durableId="1258176493">
     <w:abstractNumId w:val="6"/>
   </w:num>
-  <w:num w:numId="16">
+  <w:num w:numId="16" w16cid:durableId="1055276512">
     <w:abstractNumId w:val="5"/>
   </w:num>
-  <w:num w:numId="17">
+  <w:num w:numId="17" w16cid:durableId="1650475320">
     <w:abstractNumId w:val="4"/>
   </w:num>
-  <w:num w:numId="18">
+  <w:num w:numId="18" w16cid:durableId="502011117">
     <w:abstractNumId w:val="8"/>
   </w:num>
-  <w:num w:numId="19">
+  <w:num w:numId="19" w16cid:durableId="464592603">
     <w:abstractNumId w:val="3"/>
   </w:num>
-  <w:num w:numId="20">
+  <w:num w:numId="20" w16cid:durableId="484443238">
     <w:abstractNumId w:val="2"/>
   </w:num>
-  <w:num w:numId="21">
+  <w:num w:numId="21" w16cid:durableId="1181818687">
     <w:abstractNumId w:val="1"/>
   </w:num>
-  <w:num w:numId="22">
+  <w:num w:numId="22" w16cid:durableId="435949731">
     <w:abstractNumId w:val="0"/>
   </w:num>
   <w:numIdMacAtCleanup w:val="12"/>
@@ -4558,7 +4826,7 @@
 </file>
 
 <file path=word/styles.xml><?xml version="1.0" encoding="utf-8"?>
-<w:styles xmlns:mc="http://schemas.openxmlformats.org/markup-compatibility/2006" xmlns:r="http://schemas.openxmlformats.org/officeDocument/2006/relationships" xmlns:w="http://schemas.openxmlformats.org/wordprocessingml/2006/main" xmlns:w14="http://schemas.microsoft.com/office/word/2010/wordml" xmlns:w15="http://schemas.microsoft.com/office/word/2012/wordml" xmlns:w16cex="http://schemas.microsoft.com/office/word/2018/wordml/cex" xmlns:w16cid="http://schemas.microsoft.com/office/word/2016/wordml/cid" xmlns:w16="http://schemas.microsoft.com/office/word/2018/wordml" xmlns:w16sdtdh="http://schemas.microsoft.com/office/word/2020/wordml/sdtdatahash" xmlns:w16se="http://schemas.microsoft.com/office/word/2015/wordml/symex" mc:Ignorable="w14 w15 w16se w16cid w16 w16cex w16sdtdh">
+<w:styles xmlns:mc="http://schemas.openxmlformats.org/markup-compatibility/2006" xmlns:r="http://schemas.openxmlformats.org/officeDocument/2006/relationships" xmlns:w="http://schemas.openxmlformats.org/wordprocessingml/2006/main" xmlns:w14="http://schemas.microsoft.com/office/word/2010/wordml" xmlns:w15="http://schemas.microsoft.com/office/word/2012/wordml" xmlns:w16cex="http://schemas.microsoft.com/office/word/2018/wordml/cex" xmlns:w16cid="http://schemas.microsoft.com/office/word/2016/wordml/cid" xmlns:w16="http://schemas.microsoft.com/office/word/2018/wordml" xmlns:w16du="http://schemas.microsoft.com/office/word/2023/wordml/word16du" xmlns:w16sdtdh="http://schemas.microsoft.com/office/word/2020/wordml/sdtdatahash" xmlns:w16se="http://schemas.microsoft.com/office/word/2015/wordml/symex" mc:Ignorable="w14 w15 w16se w16cid w16 w16cex w16sdtdh w16du">
   <w:docDefaults>
     <w:rPrDefault>
       <w:rPr>
@@ -4570,7 +4838,7 @@
   </w:docDefaults>
   <w:latentStyles w:defLockedState="0" w:defUIPriority="0" w:defSemiHidden="0" w:defUnhideWhenUsed="0" w:defQFormat="0" w:count="376">
     <w:lsdException w:name="Normal" w:qFormat="1"/>
-    <w:lsdException w:name="heading 1" w:qFormat="1"/>
+    <w:lsdException w:name="heading 1" w:uiPriority="9" w:qFormat="1"/>
     <w:lsdException w:name="heading 2" w:qFormat="1"/>
     <w:lsdException w:name="heading 3" w:qFormat="1"/>
     <w:lsdException w:name="heading 4" w:qFormat="1"/>
@@ -4853,7 +5121,7 @@
     <w:lsdException w:name="Unresolved Mention" w:semiHidden="1" w:uiPriority="99" w:unhideWhenUsed="1"/>
     <w:lsdException w:name="Smart Link" w:semiHidden="1" w:uiPriority="99" w:unhideWhenUsed="1"/>
   </w:latentStyles>
-  <w:style w:type="paragraph" w:default="1" w:styleId="Norml">
+  <w:style w:type="paragraph" w:default="1" w:styleId="Normal">
     <w:name w:val="Normal"/>
     <w:qFormat/>
     <w:rsid w:val="009A32B9"/>
@@ -4868,11 +5136,13 @@
       <w:lang w:eastAsia="en-US"/>
     </w:rPr>
   </w:style>
-  <w:style w:type="paragraph" w:styleId="Cmsor1">
+  <w:style w:type="paragraph" w:styleId="Heading1">
     <w:name w:val="heading 1"/>
-    <w:basedOn w:val="Norml"/>
-    <w:next w:val="Norml"/>
+    <w:basedOn w:val="Normal"/>
+    <w:next w:val="Normal"/>
+    <w:link w:val="Heading1Char"/>
     <w:autoRedefine/>
+    <w:uiPriority w:val="9"/>
     <w:qFormat/>
     <w:pPr>
       <w:keepNext/>
@@ -4892,10 +5162,10 @@
       <w:szCs w:val="32"/>
     </w:rPr>
   </w:style>
-  <w:style w:type="paragraph" w:styleId="Cmsor2">
+  <w:style w:type="paragraph" w:styleId="Heading2">
     <w:name w:val="heading 2"/>
-    <w:basedOn w:val="Norml"/>
-    <w:next w:val="Norml"/>
+    <w:basedOn w:val="Normal"/>
+    <w:next w:val="Normal"/>
     <w:autoRedefine/>
     <w:qFormat/>
     <w:pPr>
@@ -4916,10 +5186,10 @@
       <w:szCs w:val="28"/>
     </w:rPr>
   </w:style>
-  <w:style w:type="paragraph" w:styleId="Cmsor3">
+  <w:style w:type="paragraph" w:styleId="Heading3">
     <w:name w:val="heading 3"/>
-    <w:basedOn w:val="Norml"/>
-    <w:next w:val="Norml"/>
+    <w:basedOn w:val="Normal"/>
+    <w:next w:val="Normal"/>
     <w:autoRedefine/>
     <w:qFormat/>
     <w:pPr>
@@ -4939,10 +5209,10 @@
       <w:szCs w:val="26"/>
     </w:rPr>
   </w:style>
-  <w:style w:type="paragraph" w:styleId="Cmsor4">
+  <w:style w:type="paragraph" w:styleId="Heading4">
     <w:name w:val="heading 4"/>
-    <w:basedOn w:val="Norml"/>
-    <w:next w:val="Norml"/>
+    <w:basedOn w:val="Normal"/>
+    <w:next w:val="Normal"/>
     <w:autoRedefine/>
     <w:qFormat/>
     <w:pPr>
@@ -4960,10 +5230,10 @@
       <w:szCs w:val="28"/>
     </w:rPr>
   </w:style>
-  <w:style w:type="paragraph" w:styleId="Cmsor5">
+  <w:style w:type="paragraph" w:styleId="Heading5">
     <w:name w:val="heading 5"/>
-    <w:basedOn w:val="Norml"/>
-    <w:next w:val="Norml"/>
+    <w:basedOn w:val="Normal"/>
+    <w:next w:val="Normal"/>
     <w:pPr>
       <w:numPr>
         <w:ilvl w:val="4"/>
@@ -4981,10 +5251,10 @@
       <w:szCs w:val="26"/>
     </w:rPr>
   </w:style>
-  <w:style w:type="paragraph" w:styleId="Cmsor6">
+  <w:style w:type="paragraph" w:styleId="Heading6">
     <w:name w:val="heading 6"/>
-    <w:basedOn w:val="Norml"/>
-    <w:next w:val="Norml"/>
+    <w:basedOn w:val="Normal"/>
+    <w:next w:val="Normal"/>
     <w:pPr>
       <w:numPr>
         <w:ilvl w:val="5"/>
@@ -5000,10 +5270,10 @@
       <w:szCs w:val="22"/>
     </w:rPr>
   </w:style>
-  <w:style w:type="paragraph" w:styleId="Cmsor7">
+  <w:style w:type="paragraph" w:styleId="Heading7">
     <w:name w:val="heading 7"/>
-    <w:basedOn w:val="Norml"/>
-    <w:next w:val="Norml"/>
+    <w:basedOn w:val="Normal"/>
+    <w:next w:val="Normal"/>
     <w:pPr>
       <w:numPr>
         <w:ilvl w:val="6"/>
@@ -5013,10 +5283,10 @@
       <w:outlineLvl w:val="6"/>
     </w:pPr>
   </w:style>
-  <w:style w:type="paragraph" w:styleId="Cmsor8">
+  <w:style w:type="paragraph" w:styleId="Heading8">
     <w:name w:val="heading 8"/>
-    <w:basedOn w:val="Norml"/>
-    <w:next w:val="Norml"/>
+    <w:basedOn w:val="Normal"/>
+    <w:next w:val="Normal"/>
     <w:pPr>
       <w:numPr>
         <w:ilvl w:val="7"/>
@@ -5030,10 +5300,10 @@
       <w:iCs/>
     </w:rPr>
   </w:style>
-  <w:style w:type="paragraph" w:styleId="Cmsor9">
+  <w:style w:type="paragraph" w:styleId="Heading9">
     <w:name w:val="heading 9"/>
-    <w:basedOn w:val="Norml"/>
-    <w:next w:val="Norml"/>
+    <w:basedOn w:val="Normal"/>
+    <w:next w:val="Normal"/>
     <w:pPr>
       <w:numPr>
         <w:ilvl w:val="8"/>
@@ -5048,13 +5318,13 @@
       <w:szCs w:val="22"/>
     </w:rPr>
   </w:style>
-  <w:style w:type="character" w:default="1" w:styleId="Bekezdsalapbettpusa">
+  <w:style w:type="character" w:default="1" w:styleId="DefaultParagraphFont">
     <w:name w:val="Default Paragraph Font"/>
     <w:uiPriority w:val="1"/>
     <w:semiHidden/>
     <w:unhideWhenUsed/>
   </w:style>
-  <w:style w:type="table" w:default="1" w:styleId="Normltblzat">
+  <w:style w:type="table" w:default="1" w:styleId="TableNormal">
     <w:name w:val="Normal Table"/>
     <w:uiPriority w:val="99"/>
     <w:semiHidden/>
@@ -5069,15 +5339,15 @@
       </w:tblCellMar>
     </w:tblPr>
   </w:style>
-  <w:style w:type="numbering" w:default="1" w:styleId="Nemlista">
+  <w:style w:type="numbering" w:default="1" w:styleId="NoList">
     <w:name w:val="No List"/>
     <w:uiPriority w:val="99"/>
     <w:semiHidden/>
     <w:unhideWhenUsed/>
   </w:style>
-  <w:style w:type="paragraph" w:styleId="lfej">
+  <w:style w:type="paragraph" w:styleId="Header">
     <w:name w:val="header"/>
-    <w:basedOn w:val="Norml"/>
+    <w:basedOn w:val="Normal"/>
     <w:rsid w:val="00C00B3C"/>
     <w:pPr>
       <w:tabs>
@@ -5087,10 +5357,10 @@
       <w:ind w:firstLine="0"/>
     </w:pPr>
   </w:style>
-  <w:style w:type="paragraph" w:styleId="Cm">
+  <w:style w:type="paragraph" w:styleId="Title">
     <w:name w:val="Title"/>
-    <w:basedOn w:val="Norml"/>
-    <w:next w:val="Alcm"/>
+    <w:basedOn w:val="Normal"/>
+    <w:next w:val="Subtitle"/>
     <w:autoRedefine/>
     <w:rsid w:val="00730B3C"/>
     <w:pPr>
@@ -5111,7 +5381,7 @@
   </w:style>
   <w:style w:type="paragraph" w:customStyle="1" w:styleId="Cmlapszerz">
     <w:name w:val="Címlap szerző"/>
-    <w:basedOn w:val="Norml"/>
+    <w:basedOn w:val="Normal"/>
     <w:autoRedefine/>
     <w:rsid w:val="00171054"/>
     <w:pPr>
@@ -5125,9 +5395,9 @@
       <w:sz w:val="40"/>
     </w:rPr>
   </w:style>
-  <w:style w:type="paragraph" w:styleId="Alcm">
+  <w:style w:type="paragraph" w:styleId="Subtitle">
     <w:name w:val="Subtitle"/>
-    <w:basedOn w:val="Norml"/>
+    <w:basedOn w:val="Normal"/>
     <w:autoRedefine/>
     <w:rsid w:val="009C1C93"/>
     <w:pPr>
@@ -5142,9 +5412,9 @@
       <w:sz w:val="32"/>
     </w:rPr>
   </w:style>
-  <w:style w:type="paragraph" w:styleId="llb">
+  <w:style w:type="paragraph" w:styleId="Footer">
     <w:name w:val="footer"/>
-    <w:basedOn w:val="Norml"/>
+    <w:basedOn w:val="Normal"/>
     <w:rsid w:val="00C00B3C"/>
     <w:pPr>
       <w:tabs>
@@ -5154,10 +5424,10 @@
       <w:ind w:firstLine="0"/>
     </w:pPr>
   </w:style>
-  <w:style w:type="paragraph" w:styleId="TJ2">
+  <w:style w:type="paragraph" w:styleId="TOC2">
     <w:name w:val="toc 2"/>
-    <w:basedOn w:val="Norml"/>
-    <w:next w:val="Norml"/>
+    <w:basedOn w:val="Normal"/>
+    <w:next w:val="Normal"/>
     <w:autoRedefine/>
     <w:uiPriority w:val="39"/>
     <w:rsid w:val="009C1C93"/>
@@ -5166,10 +5436,10 @@
       <w:ind w:left="238" w:firstLine="0"/>
     </w:pPr>
   </w:style>
-  <w:style w:type="paragraph" w:styleId="Szvegtrzs">
+  <w:style w:type="paragraph" w:styleId="BodyText">
     <w:name w:val="Body Text"/>
-    <w:basedOn w:val="Norml"/>
-    <w:link w:val="SzvegtrzsChar"/>
+    <w:basedOn w:val="Normal"/>
+    <w:link w:val="BodyTextChar"/>
     <w:pPr>
       <w:spacing w:before="360"/>
       <w:ind w:firstLine="0"/>
@@ -5177,8 +5447,8 @@
   </w:style>
   <w:style w:type="paragraph" w:customStyle="1" w:styleId="Nyilatkozatcm">
     <w:name w:val="Nyilatkozat cím"/>
-    <w:basedOn w:val="Norml"/>
-    <w:next w:val="Norml"/>
+    <w:basedOn w:val="Normal"/>
+    <w:next w:val="Normal"/>
     <w:autoRedefine/>
     <w:pPr>
       <w:keepNext/>
@@ -5201,10 +5471,10 @@
       <w:spacing w:before="240" w:after="960"/>
     </w:pPr>
   </w:style>
-  <w:style w:type="paragraph" w:styleId="TJ1">
+  <w:style w:type="paragraph" w:styleId="TOC1">
     <w:name w:val="toc 1"/>
-    <w:basedOn w:val="Norml"/>
-    <w:next w:val="Norml"/>
+    <w:basedOn w:val="Normal"/>
+    <w:next w:val="Normal"/>
     <w:autoRedefine/>
     <w:uiPriority w:val="39"/>
     <w:rsid w:val="00D1632F"/>
@@ -5219,10 +5489,10 @@
       <w:b/>
     </w:rPr>
   </w:style>
-  <w:style w:type="paragraph" w:styleId="TJ3">
+  <w:style w:type="paragraph" w:styleId="TOC3">
     <w:name w:val="toc 3"/>
-    <w:basedOn w:val="Norml"/>
-    <w:next w:val="Norml"/>
+    <w:basedOn w:val="Normal"/>
+    <w:next w:val="Normal"/>
     <w:autoRedefine/>
     <w:uiPriority w:val="39"/>
     <w:rsid w:val="009C1C93"/>
@@ -5231,10 +5501,10 @@
       <w:ind w:left="482" w:firstLine="0"/>
     </w:pPr>
   </w:style>
-  <w:style w:type="paragraph" w:styleId="TJ4">
+  <w:style w:type="paragraph" w:styleId="TOC4">
     <w:name w:val="toc 4"/>
-    <w:basedOn w:val="Norml"/>
-    <w:next w:val="Norml"/>
+    <w:basedOn w:val="Normal"/>
+    <w:next w:val="Normal"/>
     <w:autoRedefine/>
     <w:semiHidden/>
     <w:rsid w:val="009C1C93"/>
@@ -5243,10 +5513,10 @@
       <w:ind w:left="720" w:firstLine="0"/>
     </w:pPr>
   </w:style>
-  <w:style w:type="paragraph" w:styleId="TJ5">
+  <w:style w:type="paragraph" w:styleId="TOC5">
     <w:name w:val="toc 5"/>
-    <w:basedOn w:val="Norml"/>
-    <w:next w:val="Norml"/>
+    <w:basedOn w:val="Normal"/>
+    <w:next w:val="Normal"/>
     <w:autoRedefine/>
     <w:semiHidden/>
     <w:rsid w:val="009C1C93"/>
@@ -5255,10 +5525,10 @@
       <w:ind w:left="958" w:firstLine="0"/>
     </w:pPr>
   </w:style>
-  <w:style w:type="paragraph" w:styleId="TJ6">
+  <w:style w:type="paragraph" w:styleId="TOC6">
     <w:name w:val="toc 6"/>
-    <w:basedOn w:val="Norml"/>
-    <w:next w:val="Norml"/>
+    <w:basedOn w:val="Normal"/>
+    <w:next w:val="Normal"/>
     <w:autoRedefine/>
     <w:semiHidden/>
     <w:rsid w:val="009C1C93"/>
@@ -5267,37 +5537,37 @@
       <w:ind w:left="1202"/>
     </w:pPr>
   </w:style>
-  <w:style w:type="paragraph" w:styleId="TJ7">
+  <w:style w:type="paragraph" w:styleId="TOC7">
     <w:name w:val="toc 7"/>
-    <w:basedOn w:val="Norml"/>
-    <w:next w:val="Norml"/>
+    <w:basedOn w:val="Normal"/>
+    <w:next w:val="Normal"/>
     <w:autoRedefine/>
     <w:semiHidden/>
     <w:pPr>
       <w:ind w:left="1440"/>
     </w:pPr>
   </w:style>
-  <w:style w:type="paragraph" w:styleId="TJ8">
+  <w:style w:type="paragraph" w:styleId="TOC8">
     <w:name w:val="toc 8"/>
-    <w:basedOn w:val="Norml"/>
-    <w:next w:val="Norml"/>
+    <w:basedOn w:val="Normal"/>
+    <w:next w:val="Normal"/>
     <w:autoRedefine/>
     <w:semiHidden/>
     <w:pPr>
       <w:ind w:left="1680"/>
     </w:pPr>
   </w:style>
-  <w:style w:type="paragraph" w:styleId="TJ9">
+  <w:style w:type="paragraph" w:styleId="TOC9">
     <w:name w:val="toc 9"/>
-    <w:basedOn w:val="Norml"/>
-    <w:next w:val="Norml"/>
+    <w:basedOn w:val="Normal"/>
+    <w:next w:val="Normal"/>
     <w:autoRedefine/>
     <w:semiHidden/>
     <w:pPr>
       <w:ind w:left="1920"/>
     </w:pPr>
   </w:style>
-  <w:style w:type="character" w:styleId="Hiperhivatkozs">
+  <w:style w:type="character" w:styleId="Hyperlink">
     <w:name w:val="Hyperlink"/>
     <w:uiPriority w:val="99"/>
     <w:rPr>
@@ -5305,13 +5575,13 @@
       <w:u w:val="single"/>
     </w:rPr>
   </w:style>
-  <w:style w:type="character" w:styleId="Oldalszm">
+  <w:style w:type="character" w:styleId="PageNumber">
     <w:name w:val="page number"/>
-    <w:basedOn w:val="Bekezdsalapbettpusa"/>
+    <w:basedOn w:val="DefaultParagraphFont"/>
   </w:style>
   <w:style w:type="paragraph" w:customStyle="1" w:styleId="Irodalomjegyzksor">
     <w:name w:val="Irodalomjegyzék sor"/>
-    <w:basedOn w:val="Norml"/>
+    <w:basedOn w:val="Normal"/>
     <w:autoRedefine/>
     <w:qFormat/>
     <w:rsid w:val="00B96880"/>
@@ -5331,9 +5601,9 @@
       <w:noProof/>
     </w:rPr>
   </w:style>
-  <w:style w:type="paragraph" w:styleId="Lbjegyzetszveg">
+  <w:style w:type="paragraph" w:styleId="FootnoteText">
     <w:name w:val="footnote text"/>
-    <w:basedOn w:val="Norml"/>
+    <w:basedOn w:val="Normal"/>
     <w:semiHidden/>
     <w:rsid w:val="00B50CAA"/>
     <w:rPr>
@@ -5343,8 +5613,8 @@
   </w:style>
   <w:style w:type="paragraph" w:customStyle="1" w:styleId="Fejezetcimszmozsnlkl">
     <w:name w:val="Fejezetcim számozás nélkül"/>
-    <w:basedOn w:val="Cmsor1"/>
-    <w:next w:val="Norml"/>
+    <w:basedOn w:val="Heading1"/>
+    <w:next w:val="Normal"/>
     <w:rsid w:val="00D1632F"/>
     <w:pPr>
       <w:numPr>
@@ -5353,10 +5623,10 @@
       <w:spacing w:before="240"/>
     </w:pPr>
   </w:style>
-  <w:style w:type="paragraph" w:styleId="Kpalrs">
+  <w:style w:type="paragraph" w:styleId="Caption">
     <w:name w:val="caption"/>
-    <w:basedOn w:val="Norml"/>
-    <w:next w:val="Norml"/>
+    <w:basedOn w:val="Normal"/>
+    <w:next w:val="Normal"/>
     <w:autoRedefine/>
     <w:qFormat/>
     <w:rsid w:val="002841F9"/>
@@ -5374,7 +5644,7 @@
   </w:style>
   <w:style w:type="paragraph" w:customStyle="1" w:styleId="Source">
     <w:name w:val="Source"/>
-    <w:basedOn w:val="Norml"/>
+    <w:basedOn w:val="Normal"/>
     <w:autoRedefine/>
     <w:pPr>
       <w:keepNext/>
@@ -5394,7 +5664,7 @@
       <w:sz w:val="20"/>
     </w:rPr>
   </w:style>
-  <w:style w:type="character" w:styleId="Lbjegyzet-hivatkozs">
+  <w:style w:type="character" w:styleId="FootnoteReference">
     <w:name w:val="footnote reference"/>
     <w:semiHidden/>
     <w:rsid w:val="00B50CAA"/>
@@ -5402,10 +5672,10 @@
       <w:vertAlign w:val="superscript"/>
     </w:rPr>
   </w:style>
-  <w:style w:type="paragraph" w:styleId="Buborkszveg">
+  <w:style w:type="paragraph" w:styleId="BalloonText">
     <w:name w:val="Balloon Text"/>
-    <w:basedOn w:val="Norml"/>
-    <w:link w:val="BuborkszvegChar"/>
+    <w:basedOn w:val="Normal"/>
+    <w:link w:val="BalloonTextChar"/>
     <w:rsid w:val="00350AEC"/>
     <w:pPr>
       <w:spacing w:line="240" w:lineRule="auto"/>
@@ -5416,9 +5686,9 @@
       <w:szCs w:val="16"/>
     </w:rPr>
   </w:style>
-  <w:style w:type="character" w:customStyle="1" w:styleId="BuborkszvegChar">
-    <w:name w:val="Buborékszöveg Char"/>
-    <w:link w:val="Buborkszveg"/>
+  <w:style w:type="character" w:customStyle="1" w:styleId="BalloonTextChar">
+    <w:name w:val="Balloon Text Char"/>
+    <w:link w:val="BalloonText"/>
     <w:rsid w:val="00350AEC"/>
     <w:rPr>
       <w:rFonts w:ascii="Tahoma" w:hAnsi="Tahoma" w:cs="Tahoma"/>
@@ -5429,7 +5699,7 @@
   </w:style>
   <w:style w:type="numbering" w:customStyle="1" w:styleId="tmutat-felsorols">
     <w:name w:val="Útmutató - felsorolás"/>
-    <w:basedOn w:val="Nemlista"/>
+    <w:basedOn w:val="NoList"/>
     <w:rsid w:val="000062F4"/>
     <w:pPr>
       <w:numPr>
@@ -5439,7 +5709,7 @@
   </w:style>
   <w:style w:type="paragraph" w:customStyle="1" w:styleId="tmutat">
     <w:name w:val="Útmutató"/>
-    <w:basedOn w:val="Norml"/>
+    <w:basedOn w:val="Normal"/>
     <w:rsid w:val="00267677"/>
     <w:pPr>
       <w:spacing w:line="240" w:lineRule="auto"/>
@@ -5450,9 +5720,9 @@
       <w:szCs w:val="22"/>
     </w:rPr>
   </w:style>
-  <w:style w:type="character" w:customStyle="1" w:styleId="SzvegtrzsChar">
-    <w:name w:val="Szövegtörzs Char"/>
-    <w:link w:val="Szvegtrzs"/>
+  <w:style w:type="character" w:customStyle="1" w:styleId="BodyTextChar">
+    <w:name w:val="Body Text Char"/>
+    <w:link w:val="BodyText"/>
     <w:rsid w:val="0090541F"/>
     <w:rPr>
       <w:sz w:val="24"/>
@@ -5474,7 +5744,7 @@
   </w:style>
   <w:style w:type="numbering" w:customStyle="1" w:styleId="tmutatfelsorols">
     <w:name w:val="Útmutató felsorolás"/>
-    <w:basedOn w:val="Nemlista"/>
+    <w:basedOn w:val="NoList"/>
     <w:rsid w:val="003A4CDB"/>
     <w:pPr>
       <w:numPr>
@@ -5484,7 +5754,7 @@
   </w:style>
   <w:style w:type="numbering" w:customStyle="1" w:styleId="StyleOutlinenumberedSymbolsymbol11ptBoldLeft0cm">
     <w:name w:val="Style Outline numbered Symbol (symbol) 11 pt Bold Left:  0 cm ..."/>
-    <w:basedOn w:val="Nemlista"/>
+    <w:basedOn w:val="NoList"/>
     <w:rsid w:val="003A4CDB"/>
     <w:pPr>
       <w:numPr>
@@ -5494,7 +5764,7 @@
   </w:style>
   <w:style w:type="numbering" w:customStyle="1" w:styleId="StyleOutlinenumberedSymbolsymbol11ptBoldLeft0cm1">
     <w:name w:val="Style Outline numbered Symbol (symbol) 11 pt Bold Left:  0 cm ...1"/>
-    <w:basedOn w:val="Nemlista"/>
+    <w:basedOn w:val="NoList"/>
     <w:rsid w:val="003A4CDB"/>
     <w:pPr>
       <w:numPr>
@@ -5504,7 +5774,7 @@
   </w:style>
   <w:style w:type="paragraph" w:customStyle="1" w:styleId="Nyilatkozatszveg">
     <w:name w:val="Nyilatkozat szöveg"/>
-    <w:basedOn w:val="Norml"/>
+    <w:basedOn w:val="Normal"/>
     <w:rsid w:val="00854BDC"/>
     <w:pPr>
       <w:ind w:firstLine="0"/>
@@ -5527,7 +5797,7 @@
   </w:style>
   <w:style w:type="paragraph" w:customStyle="1" w:styleId="Cmlaplog">
     <w:name w:val="Címlap logó"/>
-    <w:basedOn w:val="Norml"/>
+    <w:basedOn w:val="Normal"/>
     <w:rsid w:val="00D429F2"/>
     <w:pPr>
       <w:ind w:firstLine="0"/>
@@ -5539,7 +5809,7 @@
   </w:style>
   <w:style w:type="paragraph" w:customStyle="1" w:styleId="Cmlapkarstanszk">
     <w:name w:val="Címlap kar és tanszék"/>
-    <w:basedOn w:val="Norml"/>
+    <w:basedOn w:val="Normal"/>
     <w:rsid w:val="00171054"/>
     <w:pPr>
       <w:spacing w:after="0" w:line="240" w:lineRule="auto"/>
@@ -5552,7 +5822,7 @@
   </w:style>
   <w:style w:type="paragraph" w:customStyle="1" w:styleId="Cmlapegyetem">
     <w:name w:val="Címlap egyetem"/>
-    <w:basedOn w:val="Norml"/>
+    <w:basedOn w:val="Normal"/>
     <w:rsid w:val="00171054"/>
     <w:pPr>
       <w:spacing w:before="120" w:after="0" w:line="240" w:lineRule="auto"/>
@@ -5567,7 +5837,7 @@
   </w:style>
   <w:style w:type="numbering" w:customStyle="1" w:styleId="tmutatszmozottlista">
     <w:name w:val="Útmutató számozott lista"/>
-    <w:basedOn w:val="Nemlista"/>
+    <w:basedOn w:val="NoList"/>
     <w:rsid w:val="00D429F2"/>
     <w:pPr>
       <w:numPr>
@@ -5577,7 +5847,7 @@
   </w:style>
   <w:style w:type="numbering" w:customStyle="1" w:styleId="Irodalomjegyzkttel">
     <w:name w:val="Irodalomjegyzék tétel"/>
-    <w:basedOn w:val="Nemlista"/>
+    <w:basedOn w:val="NoList"/>
     <w:rsid w:val="006F512E"/>
     <w:pPr>
       <w:numPr>
@@ -5611,7 +5881,7 @@
   </w:style>
   <w:style w:type="numbering" w:customStyle="1" w:styleId="tmutatlista">
     <w:name w:val="Útmutató lista"/>
-    <w:basedOn w:val="Nemlista"/>
+    <w:basedOn w:val="NoList"/>
     <w:rsid w:val="00267677"/>
     <w:pPr>
       <w:numPr>
@@ -5619,7 +5889,7 @@
       </w:numPr>
     </w:pPr>
   </w:style>
-  <w:style w:type="character" w:styleId="Knyvcme">
+  <w:style w:type="character" w:styleId="BookTitle">
     <w:name w:val="Book Title"/>
     <w:uiPriority w:val="33"/>
     <w:rsid w:val="003F5425"/>
@@ -5630,11 +5900,11 @@
       <w:spacing w:val="5"/>
     </w:rPr>
   </w:style>
-  <w:style w:type="paragraph" w:styleId="Kiemeltidzet">
+  <w:style w:type="paragraph" w:styleId="IntenseQuote">
     <w:name w:val="Intense Quote"/>
-    <w:basedOn w:val="Norml"/>
-    <w:next w:val="Norml"/>
-    <w:link w:val="KiemeltidzetChar"/>
+    <w:basedOn w:val="Normal"/>
+    <w:next w:val="Normal"/>
+    <w:link w:val="IntenseQuoteChar"/>
     <w:uiPriority w:val="30"/>
     <w:rsid w:val="003F5425"/>
     <w:pPr>
@@ -5652,9 +5922,9 @@
       <w:color w:val="4F81BD"/>
     </w:rPr>
   </w:style>
-  <w:style w:type="character" w:customStyle="1" w:styleId="KiemeltidzetChar">
-    <w:name w:val="Kiemelt idézet Char"/>
-    <w:link w:val="Kiemeltidzet"/>
+  <w:style w:type="character" w:customStyle="1" w:styleId="IntenseQuoteChar">
+    <w:name w:val="Intense Quote Char"/>
+    <w:link w:val="IntenseQuote"/>
     <w:uiPriority w:val="30"/>
     <w:rsid w:val="003F5425"/>
     <w:rPr>
@@ -5668,7 +5938,7 @@
       <w:lang w:eastAsia="en-US"/>
     </w:rPr>
   </w:style>
-  <w:style w:type="character" w:styleId="Ershivatkozs">
+  <w:style w:type="character" w:styleId="IntenseReference">
     <w:name w:val="Intense Reference"/>
     <w:uiPriority w:val="32"/>
     <w:rsid w:val="003F5425"/>
@@ -5681,7 +5951,7 @@
       <w:u w:val="single"/>
     </w:rPr>
   </w:style>
-  <w:style w:type="character" w:styleId="Finomhivatkozs">
+  <w:style w:type="character" w:styleId="SubtleReference">
     <w:name w:val="Subtle Reference"/>
     <w:uiPriority w:val="31"/>
     <w:rsid w:val="003F5425"/>
@@ -5691,16 +5961,16 @@
       <w:u w:val="single"/>
     </w:rPr>
   </w:style>
-  <w:style w:type="paragraph" w:styleId="Listaszerbekezds">
+  <w:style w:type="paragraph" w:styleId="ListParagraph">
     <w:name w:val="List Paragraph"/>
-    <w:basedOn w:val="Norml"/>
+    <w:basedOn w:val="Normal"/>
     <w:uiPriority w:val="34"/>
     <w:rsid w:val="003F5425"/>
     <w:pPr>
       <w:ind w:left="708"/>
     </w:pPr>
   </w:style>
-  <w:style w:type="character" w:styleId="Kiemels">
+  <w:style w:type="character" w:styleId="Emphasis">
     <w:name w:val="Emphasis"/>
     <w:qFormat/>
     <w:rsid w:val="003F5425"/>
@@ -5709,7 +5979,7 @@
       <w:iCs/>
     </w:rPr>
   </w:style>
-  <w:style w:type="character" w:styleId="Finomkiemels">
+  <w:style w:type="character" w:styleId="SubtleEmphasis">
     <w:name w:val="Subtle Emphasis"/>
     <w:uiPriority w:val="19"/>
     <w:rsid w:val="003F5425"/>
@@ -5719,7 +5989,7 @@
       <w:color w:val="808080"/>
     </w:rPr>
   </w:style>
-  <w:style w:type="character" w:styleId="Erskiemels">
+  <w:style w:type="character" w:styleId="IntenseEmphasis">
     <w:name w:val="Intense Emphasis"/>
     <w:uiPriority w:val="21"/>
     <w:rsid w:val="003F5425"/>
@@ -5731,11 +6001,11 @@
       <w:color w:val="4F81BD"/>
     </w:rPr>
   </w:style>
-  <w:style w:type="paragraph" w:styleId="Idzet">
+  <w:style w:type="paragraph" w:styleId="Quote">
     <w:name w:val="Quote"/>
-    <w:basedOn w:val="Norml"/>
-    <w:next w:val="Norml"/>
-    <w:link w:val="IdzetChar"/>
+    <w:basedOn w:val="Normal"/>
+    <w:next w:val="Normal"/>
+    <w:link w:val="QuoteChar"/>
     <w:uiPriority w:val="29"/>
     <w:rsid w:val="003F5425"/>
     <w:rPr>
@@ -5744,9 +6014,9 @@
       <w:color w:val="000000"/>
     </w:rPr>
   </w:style>
-  <w:style w:type="character" w:customStyle="1" w:styleId="IdzetChar">
-    <w:name w:val="Idézet Char"/>
-    <w:link w:val="Idzet"/>
+  <w:style w:type="character" w:customStyle="1" w:styleId="QuoteChar">
+    <w:name w:val="Quote Char"/>
+    <w:link w:val="Quote"/>
     <w:uiPriority w:val="29"/>
     <w:rsid w:val="003F5425"/>
     <w:rPr>
@@ -5758,7 +6028,7 @@
       <w:lang w:eastAsia="en-US"/>
     </w:rPr>
   </w:style>
-  <w:style w:type="paragraph" w:styleId="Nincstrkz">
+  <w:style w:type="paragraph" w:styleId="NoSpacing">
     <w:name w:val="No Spacing"/>
     <w:uiPriority w:val="1"/>
     <w:rsid w:val="003F5425"/>
@@ -5772,7 +6042,7 @@
       <w:lang w:eastAsia="en-US"/>
     </w:rPr>
   </w:style>
-  <w:style w:type="character" w:styleId="Kiemels2">
+  <w:style w:type="character" w:styleId="Strong">
     <w:name w:val="Strong"/>
     <w:qFormat/>
     <w:rsid w:val="003F5425"/>
@@ -5783,8 +6053,8 @@
   </w:style>
   <w:style w:type="paragraph" w:customStyle="1" w:styleId="Kp">
     <w:name w:val="Kép"/>
-    <w:basedOn w:val="Norml"/>
-    <w:next w:val="Kpalrs"/>
+    <w:basedOn w:val="Normal"/>
+    <w:next w:val="Caption"/>
     <w:qFormat/>
     <w:rsid w:val="002841F9"/>
     <w:pPr>
@@ -5804,7 +6074,7 @@
   </w:style>
   <w:style w:type="paragraph" w:customStyle="1" w:styleId="Kd">
     <w:name w:val="Kód"/>
-    <w:basedOn w:val="Norml"/>
+    <w:basedOn w:val="Normal"/>
     <w:qFormat/>
     <w:rsid w:val="00225F65"/>
     <w:pPr>
@@ -5829,10 +6099,10 @@
       <w:sz w:val="20"/>
     </w:rPr>
   </w:style>
-  <w:style w:type="paragraph" w:styleId="Tartalomjegyzkcmsora">
+  <w:style w:type="paragraph" w:styleId="TOCHeading">
     <w:name w:val="TOC Heading"/>
-    <w:basedOn w:val="Cmsor1"/>
-    <w:next w:val="Norml"/>
+    <w:basedOn w:val="Heading1"/>
+    <w:next w:val="Normal"/>
     <w:uiPriority w:val="39"/>
     <w:semiHidden/>
     <w:unhideWhenUsed/>
@@ -5860,7 +6130,7 @@
   <w:style w:type="paragraph" w:customStyle="1" w:styleId="Fejezetcmtartalomjegyzknlkl">
     <w:name w:val="Fejezetcím tartalomjegyzék nélkül"/>
     <w:basedOn w:val="Fejezetcimszmozsnlkl"/>
-    <w:next w:val="Norml"/>
+    <w:next w:val="Normal"/>
     <w:qFormat/>
     <w:rsid w:val="00B96880"/>
     <w:pPr>
@@ -5870,15 +6140,54 @@
       <w:noProof/>
     </w:rPr>
   </w:style>
-  <w:style w:type="character" w:styleId="Helyrzszveg">
+  <w:style w:type="character" w:styleId="PlaceholderText">
     <w:name w:val="Placeholder Text"/>
-    <w:basedOn w:val="Bekezdsalapbettpusa"/>
+    <w:basedOn w:val="DefaultParagraphFont"/>
     <w:uiPriority w:val="99"/>
     <w:semiHidden/>
     <w:rsid w:val="006B00FC"/>
     <w:rPr>
       <w:color w:val="808080"/>
     </w:rPr>
+  </w:style>
+  <w:style w:type="paragraph" w:styleId="Bibliography">
+    <w:name w:val="Bibliography"/>
+    <w:basedOn w:val="Normal"/>
+    <w:next w:val="Normal"/>
+    <w:uiPriority w:val="37"/>
+    <w:unhideWhenUsed/>
+    <w:rsid w:val="00ED1DF1"/>
+  </w:style>
+  <w:style w:type="character" w:customStyle="1" w:styleId="Heading1Char">
+    <w:name w:val="Heading 1 Char"/>
+    <w:basedOn w:val="DefaultParagraphFont"/>
+    <w:link w:val="Heading1"/>
+    <w:uiPriority w:val="9"/>
+    <w:rsid w:val="00ED1DF1"/>
+    <w:rPr>
+      <w:rFonts w:cs="Arial"/>
+      <w:b/>
+      <w:bCs/>
+      <w:kern w:val="32"/>
+      <w:sz w:val="36"/>
+      <w:szCs w:val="32"/>
+      <w:lang w:eastAsia="en-US"/>
+    </w:rPr>
+  </w:style>
+  <w:style w:type="table" w:styleId="TableGrid">
+    <w:name w:val="Table Grid"/>
+    <w:basedOn w:val="TableNormal"/>
+    <w:rsid w:val="00F12CBA"/>
+    <w:tblPr>
+      <w:tblBorders>
+        <w:top w:val="single" w:sz="4" w:space="0" w:color="auto"/>
+        <w:left w:val="single" w:sz="4" w:space="0" w:color="auto"/>
+        <w:bottom w:val="single" w:sz="4" w:space="0" w:color="auto"/>
+        <w:right w:val="single" w:sz="4" w:space="0" w:color="auto"/>
+        <w:insideH w:val="single" w:sz="4" w:space="0" w:color="auto"/>
+        <w:insideV w:val="single" w:sz="4" w:space="0" w:color="auto"/>
+      </w:tblBorders>
+    </w:tblPr>
   </w:style>
 </w:styles>
 </file>
@@ -6179,11 +6488,43 @@
 </file>
 
 <file path=customXml/item1.xml><?xml version="1.0" encoding="utf-8"?>
-<b:Sources xmlns:b="http://schemas.openxmlformats.org/officeDocument/2006/bibliography" xmlns="http://schemas.openxmlformats.org/officeDocument/2006/bibliography" SelectedStyle="\APA.XSL" StyleName="APA"/>
+<b:Sources xmlns:b="http://schemas.openxmlformats.org/officeDocument/2006/bibliography" xmlns="http://schemas.openxmlformats.org/officeDocument/2006/bibliography" SelectedStyle="\APASixthEditionOfficeOnline.xsl" StyleName="APA" Version="6">
+  <b:Source>
+    <b:Tag>Saw20</b:Tag>
+    <b:SourceType>JournalArticle</b:SourceType>
+    <b:Guid>{37625989-9990-42E0-B9B3-F7191673104B}</b:Guid>
+    <b:Title>Monte Carlo Geometry Processing: A Grid-Free Approach to PDE-Based Methods on Volumetric Domains</b:Title>
+    <b:Year>2020 </b:Year>
+    <b:Author>
+      <b:Author>
+        <b:NameList>
+          <b:Person>
+            <b:Last>Sawhney</b:Last>
+            <b:First>Rohan</b:First>
+            <b:Middle>and Crane, Keenan</b:Middle>
+          </b:Person>
+        </b:NameList>
+      </b:Author>
+    </b:Author>
+    <b:JournalName>ACM Trans. Graph.</b:JournalName>
+    <b:Pages>18</b:Pages>
+    <b:RefOrder>1</b:RefOrder>
+  </b:Source>
+  <b:Source>
+    <b:Tag>FEM24</b:Tag>
+    <b:SourceType>InternetSite</b:SourceType>
+    <b:Guid>{750690F5-6CF3-4B3A-B32C-A929213B72CA}</b:Guid>
+    <b:Title>Finite Element Method</b:Title>
+    <b:Year>2024</b:Year>
+    <b:InternetSiteTitle>Wikipedia</b:InternetSiteTitle>
+    <b:URL>https://en.wikipedia.org/wiki/Finite_element_method</b:URL>
+    <b:RefOrder>2</b:RefOrder>
+  </b:Source>
+</b:Sources>
 </file>
 
 <file path=customXml/itemProps1.xml><?xml version="1.0" encoding="utf-8"?>
-<ds:datastoreItem xmlns:ds="http://schemas.openxmlformats.org/officeDocument/2006/customXml" ds:itemID="{6D999C41-84D2-4295-B519-44B39DF20754}">
+<ds:datastoreItem xmlns:ds="http://schemas.openxmlformats.org/officeDocument/2006/customXml" ds:itemID="{0AD397ED-3027-4EA8-A445-0CDCF89368C0}">
   <ds:schemaRefs>
     <ds:schemaRef ds:uri="http://schemas.openxmlformats.org/officeDocument/2006/bibliography"/>
   </ds:schemaRefs>

</xml_diff>

<commit_message>
first part of section 3 done
</commit_message>
<xml_diff>
--- a/DiplomatervSablon_v3.2_hu.docx
+++ b/DiplomatervSablon_v3.2_hu.docx
@@ -3847,6 +3847,343 @@
       <w:pPr>
         <w:pStyle w:val="Heading2"/>
       </w:pPr>
+      <w:r>
+        <w:t>Használt technológiák</w:t>
+      </w:r>
+    </w:p>
+    <w:p>
+      <w:pPr>
+        <w:pStyle w:val="Heading3"/>
+      </w:pPr>
+      <w:r>
+        <w:t>Programozási nyelv</w:t>
+      </w:r>
+    </w:p>
+    <w:p>
+      <w:r>
+        <w:t xml:space="preserve">Mivel a legfontosabb szempont számomra a számítógép minél pontosabb irányítása, ezért a programot C++-ban implementáltam. A programom MSVC fordítóval, C++-17 standardban írtam. </w:t>
+      </w:r>
+    </w:p>
+    <w:p>
+      <w:r>
+        <w:t>A C++, hasonlóan a C-</w:t>
+      </w:r>
+      <w:proofErr w:type="spellStart"/>
+      <w:r>
+        <w:t>hez</w:t>
+      </w:r>
+      <w:proofErr w:type="spellEnd"/>
+      <w:r>
+        <w:t>,</w:t>
+      </w:r>
+      <w:r>
+        <w:t xml:space="preserve"> </w:t>
+      </w:r>
+      <w:r>
+        <w:t>a magas szintű programozási nyelvek között</w:t>
+      </w:r>
+      <w:r>
+        <w:t xml:space="preserve"> alacsony színtű hozzáférést biztosít a számítógéphez.</w:t>
+      </w:r>
+      <w:r>
+        <w:t xml:space="preserve"> A memória allokációt mi tudjuk kezelni, valamint van lehetőség változók pontos memória területét meghatározni, így olyan adatátvitelt biztosítani, ami a lehető legoptimálisabb lesz, például olyan </w:t>
+      </w:r>
+      <w:proofErr w:type="spellStart"/>
+      <w:r>
+        <w:t>struct</w:t>
+      </w:r>
+      <w:proofErr w:type="spellEnd"/>
+      <w:r>
+        <w:t xml:space="preserve"> használata, ami pontosan 32 byte, így pontosan 2, vagy 1 elem fér egy cache határba.</w:t>
+      </w:r>
+    </w:p>
+    <w:p>
+      <w:r>
+        <w:t>A fő indok, ami miatt C++-t választottam C helyett, az objektum orientáltság volt. Hiszen a hardver közeli programozást a C is támogatja, azonban C-ben nincsenek az OOP elvek implementálva.</w:t>
+      </w:r>
+      <w:r>
+        <w:t xml:space="preserve"> A programot az egyetemen tanultak alapján az OOP elveket követve hoztam létre a projektet. Osztályokba szerveztem a kódot, valamint a felelősségeket felosztottam, hogy például Isten osztály ne jelenjen meg a kódomban.</w:t>
+      </w:r>
+    </w:p>
+    <w:p>
+      <w:pPr>
+        <w:pStyle w:val="Heading3"/>
+      </w:pPr>
+      <w:r>
+        <w:t>Grafikus megjelenítés</w:t>
+      </w:r>
+    </w:p>
+    <w:p>
+      <w:r>
+        <w:t xml:space="preserve">Az eredmény megjelenítéséhez a </w:t>
+      </w:r>
+      <w:proofErr w:type="spellStart"/>
+      <w:r>
+        <w:t>Khronos</w:t>
+      </w:r>
+      <w:proofErr w:type="spellEnd"/>
+      <w:r>
+        <w:t xml:space="preserve"> csoport által definiált </w:t>
+      </w:r>
+      <w:proofErr w:type="spellStart"/>
+      <w:r>
+        <w:t>OpenGL</w:t>
+      </w:r>
+      <w:proofErr w:type="spellEnd"/>
+      <w:r>
+        <w:t xml:space="preserve"> API-t választottam, mivel egyetemi tanulmányaim során a Számítógépes Grafika c. tárgyból már volt használva, valamint extenzív forrás található az API-hoz az interneten. Az </w:t>
+      </w:r>
+      <w:proofErr w:type="spellStart"/>
+      <w:r>
+        <w:t>OpenGL</w:t>
+      </w:r>
+      <w:proofErr w:type="spellEnd"/>
+      <w:r>
+        <w:t xml:space="preserve"> előnye egy előre definiált grafikus könyvtárhoz képest, például SDL2, az, hogy sokkal nagyobb hozzáférést nyújt a hardverhez, így jobban irányítható, hogy mi történjen, így jobban optimalizálható a kód.</w:t>
+      </w:r>
+      <w:r>
+        <w:t xml:space="preserve"> Az </w:t>
+      </w:r>
+      <w:proofErr w:type="spellStart"/>
+      <w:r>
+        <w:t>OpenGL</w:t>
+      </w:r>
+      <w:proofErr w:type="spellEnd"/>
+      <w:r>
+        <w:t xml:space="preserve"> API operációs rendszer független, működik Windows, Linux, valamint Intel chipet használó Apple számítógépeken is.</w:t>
+      </w:r>
+    </w:p>
+    <w:p>
+      <w:pPr>
+        <w:pStyle w:val="Heading4"/>
+      </w:pPr>
+      <w:r>
+        <w:t>GLFW</w:t>
+      </w:r>
+    </w:p>
+    <w:p>
+      <w:r>
+        <w:t xml:space="preserve">A GLFW egy olyan </w:t>
+      </w:r>
+      <w:proofErr w:type="spellStart"/>
+      <w:r>
+        <w:t>OpenGL</w:t>
+      </w:r>
+      <w:proofErr w:type="spellEnd"/>
+      <w:r>
+        <w:t xml:space="preserve"> könyvtár, ami olyan API-t nyújt a felhasználónak, ami jelentősen megkönnyíti az ablakok, kontextusok</w:t>
+      </w:r>
+      <w:r>
+        <w:t>,</w:t>
+      </w:r>
+      <w:r>
+        <w:t xml:space="preserve"> létrehozását, menedzselését</w:t>
+      </w:r>
+      <w:r>
+        <w:t>,</w:t>
+      </w:r>
+      <w:r>
+        <w:t xml:space="preserve"> </w:t>
+      </w:r>
+      <w:r>
+        <w:t>f</w:t>
+      </w:r>
+      <w:r>
+        <w:t>elhasználói egér/billentyűzet bemenetek, valamint események</w:t>
+      </w:r>
+      <w:r>
+        <w:t xml:space="preserve">, </w:t>
+      </w:r>
+      <w:r>
+        <w:t>kezelését.</w:t>
+      </w:r>
+      <w:r>
+        <w:t xml:space="preserve"> </w:t>
+      </w:r>
+    </w:p>
+    <w:p>
+      <w:pPr>
+        <w:pStyle w:val="Heading4"/>
+      </w:pPr>
+      <w:r>
+        <w:lastRenderedPageBreak/>
+        <w:t>GLEW</w:t>
+      </w:r>
+    </w:p>
+    <w:p>
+      <w:r>
+        <w:t xml:space="preserve">Fontosnak tartom megemlíteni, hogy </w:t>
+      </w:r>
+      <w:r>
+        <w:t xml:space="preserve">direkt </w:t>
+      </w:r>
+      <w:proofErr w:type="spellStart"/>
+      <w:r>
+        <w:t>OpenGL</w:t>
+      </w:r>
+      <w:proofErr w:type="spellEnd"/>
+      <w:r>
+        <w:t xml:space="preserve"> függvényhívások helyett érdemesebb egy segítő könyvtár használata, ami feloldja helyettünk az </w:t>
+      </w:r>
+      <w:proofErr w:type="spellStart"/>
+      <w:r>
+        <w:t>OpenGL-hez</w:t>
+      </w:r>
+      <w:proofErr w:type="spellEnd"/>
+      <w:r>
+        <w:t xml:space="preserve"> intézett függvényhívásokat. Én a GLEW könyvtárat használtam a projektben. A választásom azért esett erre a könyvtárra, más könyvtárak, </w:t>
+      </w:r>
+      <w:r>
+        <w:t xml:space="preserve">mint például </w:t>
+      </w:r>
+      <w:r>
+        <w:t xml:space="preserve">a </w:t>
+      </w:r>
+      <w:proofErr w:type="spellStart"/>
+      <w:r>
+        <w:t>GLee</w:t>
+      </w:r>
+      <w:proofErr w:type="spellEnd"/>
+      <w:r>
+        <w:t>, helyett, mert a Számítógépes Grafika című tárgyból is ezt a könyvtárat használtuk, így a familiaritás elvén maradtam a könyvtárnál.</w:t>
+      </w:r>
+    </w:p>
+    <w:p>
+      <w:r>
+        <w:t xml:space="preserve">Azért hasznos a GLEW, mert vannak olyan függvények definiálva az </w:t>
+      </w:r>
+      <w:proofErr w:type="spellStart"/>
+      <w:r>
+        <w:t>OpenGL</w:t>
+      </w:r>
+      <w:proofErr w:type="spellEnd"/>
+      <w:r>
+        <w:t xml:space="preserve"> API-ban, amit nem biztos, hogy minden videokártya cég támogat, így a program linkelésénél nem direktben az </w:t>
+      </w:r>
+      <w:proofErr w:type="spellStart"/>
+      <w:r>
+        <w:t>OpenGL</w:t>
+      </w:r>
+      <w:proofErr w:type="spellEnd"/>
+      <w:r>
+        <w:t xml:space="preserve"> függvényekkel linkel a programunk, hanem egy köztes fájllal, ami futásidőben ellenőrzi, hogy milyen funkcionalitások érhetőek el a számítógépen, így elkerülve a linkelési problémákat.</w:t>
+      </w:r>
+    </w:p>
+    <w:p>
+      <w:pPr>
+        <w:pStyle w:val="Heading4"/>
+      </w:pPr>
+      <w:proofErr w:type="spellStart"/>
+      <w:r>
+        <w:t>OpenGL</w:t>
+      </w:r>
+      <w:proofErr w:type="spellEnd"/>
+    </w:p>
+    <w:p>
+      <w:r>
+        <w:t xml:space="preserve">Az </w:t>
+      </w:r>
+      <w:proofErr w:type="spellStart"/>
+      <w:r>
+        <w:t>OpenGL</w:t>
+      </w:r>
+      <w:proofErr w:type="spellEnd"/>
+      <w:r>
+        <w:t xml:space="preserve"> API valójában egy nagy állapotgépként fogható fel. A futtatása egy </w:t>
+      </w:r>
+      <w:proofErr w:type="spellStart"/>
+      <w:r>
+        <w:t>pipelineként</w:t>
+      </w:r>
+      <w:proofErr w:type="spellEnd"/>
+      <w:r>
+        <w:t xml:space="preserve"> működik, melynek egyes állásaiba rakhatjuk saját kódunkat, ezzel irányítva a GPU-t.</w:t>
+      </w:r>
+    </w:p>
+    <w:p>
+      <w:r>
+        <w:t xml:space="preserve">Az </w:t>
+      </w:r>
+      <w:proofErr w:type="spellStart"/>
+      <w:r>
+        <w:t>OpenGL</w:t>
+      </w:r>
+      <w:proofErr w:type="spellEnd"/>
+      <w:r>
+        <w:t xml:space="preserve"> API nem csak grafikus megjelenítésre használható, hanem az </w:t>
+      </w:r>
+      <w:proofErr w:type="spellStart"/>
+      <w:r>
+        <w:t>OpenGL</w:t>
+      </w:r>
+      <w:proofErr w:type="spellEnd"/>
+      <w:r>
+        <w:t xml:space="preserve"> 4+ óta lehetőség van általános számításokat is végezni a GPU-n az </w:t>
+      </w:r>
+      <w:proofErr w:type="spellStart"/>
+      <w:r>
+        <w:t>OpenGL</w:t>
+      </w:r>
+      <w:proofErr w:type="spellEnd"/>
+      <w:r>
+        <w:t xml:space="preserve"> </w:t>
+      </w:r>
+      <w:proofErr w:type="spellStart"/>
+      <w:r>
+        <w:t>compute</w:t>
+      </w:r>
+      <w:proofErr w:type="spellEnd"/>
+      <w:r>
+        <w:t xml:space="preserve"> </w:t>
+      </w:r>
+      <w:proofErr w:type="spellStart"/>
+      <w:r>
+        <w:t>shaderei</w:t>
+      </w:r>
+      <w:proofErr w:type="spellEnd"/>
+      <w:r>
+        <w:t xml:space="preserve"> segítségével. Ez előtt is lehetőség volt </w:t>
+      </w:r>
+      <w:proofErr w:type="spellStart"/>
+      <w:r>
+        <w:t>fragment</w:t>
+      </w:r>
+      <w:proofErr w:type="spellEnd"/>
+      <w:r>
+        <w:t xml:space="preserve"> </w:t>
+      </w:r>
+      <w:proofErr w:type="spellStart"/>
+      <w:r>
+        <w:t>shaderek</w:t>
+      </w:r>
+      <w:proofErr w:type="spellEnd"/>
+      <w:r>
+        <w:t xml:space="preserve"> segítségével általános számításokat végezni, de a </w:t>
+      </w:r>
+      <w:proofErr w:type="spellStart"/>
+      <w:r>
+        <w:t>compute</w:t>
+      </w:r>
+      <w:proofErr w:type="spellEnd"/>
+      <w:r>
+        <w:t xml:space="preserve"> </w:t>
+      </w:r>
+      <w:proofErr w:type="spellStart"/>
+      <w:r>
+        <w:t>shaderek</w:t>
+      </w:r>
+      <w:proofErr w:type="spellEnd"/>
+      <w:r>
+        <w:t xml:space="preserve"> nagy könnyítést hoztak be.</w:t>
+      </w:r>
+    </w:p>
+    <w:p>
+      <w:pPr>
+        <w:pStyle w:val="Heading3"/>
+      </w:pPr>
+      <w:r>
+        <w:t>Fejlesztőkörnyezet</w:t>
+      </w:r>
     </w:p>
     <w:p>
       <w:pPr>
@@ -3933,6 +4270,7 @@
       <w:bookmarkStart w:id="8" w:name="_Toc332797399"/>
       <w:bookmarkStart w:id="9" w:name="_Toc59896134"/>
       <w:r>
+        <w:lastRenderedPageBreak/>
         <w:t>Címsorok</w:t>
       </w:r>
       <w:bookmarkEnd w:id="8"/>
@@ -4276,7 +4614,6 @@
         <w:pStyle w:val="Kd"/>
       </w:pPr>
       <w:r>
-        <w:lastRenderedPageBreak/>
         <w:tab/>
       </w:r>
       <w:r>
@@ -4565,15 +4902,86 @@
       </w:sdt>
       <w:bookmarkEnd w:id="20"/>
     </w:p>
+    <w:bookmarkStart w:id="21" w:name="_Ref183355930"/>
     <w:p>
       <w:pPr>
         <w:pStyle w:val="Irodalomjegyzksor"/>
       </w:pPr>
-      <w:bookmarkStart w:id="21" w:name="_Ref183355930"/>
-      <w:r>
+      <w:r>
+        <w:fldChar w:fldCharType="begin"/>
+      </w:r>
+      <w:r>
+        <w:instrText>HYPERLINK "</w:instrText>
+      </w:r>
+      <w:r>
+        <w:instrText>https://www.investopedia.com/terms/m/montecarlosimulation.asp</w:instrText>
+      </w:r>
+      <w:r>
+        <w:instrText>"</w:instrText>
+      </w:r>
+      <w:r>
+        <w:fldChar w:fldCharType="separate"/>
+      </w:r>
+      <w:r>
+        <w:rPr>
+          <w:rStyle w:val="Hyperlink"/>
+        </w:rPr>
         <w:t>https://www.investopedia.com/terms/m/montecarlosimulation.asp</w:t>
       </w:r>
       <w:bookmarkEnd w:id="21"/>
+      <w:r>
+        <w:fldChar w:fldCharType="end"/>
+      </w:r>
+    </w:p>
+    <w:p>
+      <w:pPr>
+        <w:pStyle w:val="Irodalomjegyzksor"/>
+      </w:pPr>
+      <w:hyperlink r:id="rId15" w:history="1">
+        <w:r>
+          <w:rPr>
+            <w:rStyle w:val="Hyperlink"/>
+          </w:rPr>
+          <w:t>https://www.khronos.org/opengl/</w:t>
+        </w:r>
+      </w:hyperlink>
+      <w:r>
+        <w:t xml:space="preserve"> </w:t>
+      </w:r>
+    </w:p>
+    <w:p>
+      <w:pPr>
+        <w:pStyle w:val="Irodalomjegyzksor"/>
+      </w:pPr>
+      <w:hyperlink r:id="rId16" w:history="1">
+        <w:r>
+          <w:rPr>
+            <w:rStyle w:val="Hyperlink"/>
+          </w:rPr>
+          <w:t>https://www.glfw.org/</w:t>
+        </w:r>
+      </w:hyperlink>
+      <w:r>
+        <w:t xml:space="preserve"> </w:t>
+      </w:r>
+    </w:p>
+    <w:p>
+      <w:pPr>
+        <w:pStyle w:val="Irodalomjegyzksor"/>
+      </w:pPr>
+      <w:hyperlink r:id="rId17" w:history="1">
+        <w:r>
+          <w:rPr>
+            <w:rStyle w:val="Hyperlink"/>
+          </w:rPr>
+          <w:t>https://www.khronos.org/opengl/wiki/Compute_Shader</w:t>
+        </w:r>
+      </w:hyperlink>
+    </w:p>
+    <w:p>
+      <w:pPr>
+        <w:pStyle w:val="Irodalomjegyzksor"/>
+      </w:pPr>
     </w:p>
     <w:p>
       <w:pPr>
@@ -4588,8 +4996,8 @@
     </w:p>
     <w:p/>
     <w:sectPr>
-      <w:headerReference w:type="even" r:id="rId15"/>
-      <w:footerReference w:type="default" r:id="rId16"/>
+      <w:headerReference w:type="even" r:id="rId18"/>
+      <w:footerReference w:type="default" r:id="rId19"/>
       <w:type w:val="continuous"/>
       <w:pgSz w:w="11907" w:h="16840" w:code="9"/>
       <w:pgMar w:top="1418" w:right="1418" w:bottom="1418" w:left="1418" w:header="709" w:footer="709" w:gutter="567"/>
@@ -7943,6 +8351,18 @@
       <w:lang w:eastAsia="en-US"/>
     </w:rPr>
   </w:style>
+  <w:style w:type="character" w:styleId="UnresolvedMention">
+    <w:name w:val="Unresolved Mention"/>
+    <w:basedOn w:val="DefaultParagraphFont"/>
+    <w:uiPriority w:val="99"/>
+    <w:semiHidden/>
+    <w:unhideWhenUsed/>
+    <w:rsid w:val="00144C5D"/>
+    <w:rPr>
+      <w:color w:val="605E5C"/>
+      <w:shd w:val="clear" w:color="auto" w:fill="E1DFDD"/>
+    </w:rPr>
+  </w:style>
 </w:styles>
 </file>
 

</xml_diff>

<commit_message>
section 3.3, 3.4 done
</commit_message>
<xml_diff>
--- a/DiplomatervSablon_v3.2_hu.docx
+++ b/DiplomatervSablon_v3.2_hu.docx
@@ -1198,15 +1198,7 @@
         <w:pStyle w:val="Nyilatkozatszveg"/>
       </w:pPr>
       <w:r>
-        <w:t>Hozzájárulok, hogy a jelen munkám alapadatait (szerző(k), cím, angol és magyar nyelvű tartalmi kivonat, készítés éve, konzulens(</w:t>
-      </w:r>
-      <w:proofErr w:type="spellStart"/>
-      <w:r>
-        <w:t>ek</w:t>
-      </w:r>
-      <w:proofErr w:type="spellEnd"/>
-      <w:r>
-        <w:t xml:space="preserve">) neve) a BME VIK nyilvánosan hozzáférhető elektronikus formában, a munka teljes szövegét pedig az egyetem belső hálózatán keresztül (vagy </w:t>
+        <w:t xml:space="preserve">Hozzájárulok, hogy a jelen munkám alapadatait (szerző(k), cím, angol és magyar nyelvű tartalmi kivonat, készítés éve, konzulens(ek) neve) a BME VIK nyilvánosan hozzáférhető elektronikus formában, a munka teljes szövegét pedig az egyetem belső hálózatán keresztül (vagy </w:t>
       </w:r>
       <w:r>
         <w:t>hitelesített</w:t>
@@ -1394,15 +1386,7 @@
         <w:t xml:space="preserve"> sem</w:t>
       </w:r>
       <w:r>
-        <w:t xml:space="preserve">. A Monte Carlo módszer előnye más megoldásokkal szemben, </w:t>
-      </w:r>
-      <w:proofErr w:type="spellStart"/>
-      <w:r>
-        <w:t>e.g</w:t>
-      </w:r>
-      <w:proofErr w:type="spellEnd"/>
-      <w:r>
-        <w:t xml:space="preserve">. a FEM </w:t>
+        <w:t xml:space="preserve">. A Monte Carlo módszer előnye más megoldásokkal szemben, e.g. a FEM </w:t>
       </w:r>
       <w:r>
         <w:t>módszerekkel</w:t>
@@ -1433,7 +1417,6 @@
       <w:r>
         <w:t>A FEM (</w:t>
       </w:r>
-      <w:proofErr w:type="spellStart"/>
       <w:r>
         <w:rPr>
           <w:b/>
@@ -1442,13 +1425,8 @@
         <w:t>F</w:t>
       </w:r>
       <w:r>
-        <w:t>inite</w:t>
-      </w:r>
-      <w:proofErr w:type="spellEnd"/>
-      <w:r>
-        <w:t xml:space="preserve"> </w:t>
-      </w:r>
-      <w:proofErr w:type="spellStart"/>
+        <w:t xml:space="preserve">inite </w:t>
+      </w:r>
       <w:r>
         <w:rPr>
           <w:b/>
@@ -1457,13 +1435,8 @@
         <w:t>E</w:t>
       </w:r>
       <w:r>
-        <w:t>lement</w:t>
-      </w:r>
-      <w:proofErr w:type="spellEnd"/>
-      <w:r>
-        <w:t xml:space="preserve"> </w:t>
-      </w:r>
-      <w:proofErr w:type="spellStart"/>
+        <w:t xml:space="preserve">lement </w:t>
+      </w:r>
       <w:r>
         <w:rPr>
           <w:b/>
@@ -1472,11 +1445,7 @@
         <w:t>M</w:t>
       </w:r>
       <w:r>
-        <w:t>ethod</w:t>
-      </w:r>
-      <w:proofErr w:type="spellEnd"/>
-      <w:r>
-        <w:t>) metódusok</w:t>
+        <w:t>ethod) metódusok</w:t>
       </w:r>
       <w:r>
         <w:t>, magyarul Véges Elem Metódus,</w:t>
@@ -1516,29 +1485,13 @@
         <w:t xml:space="preserve">hez, </w:t>
       </w:r>
       <w:r>
-        <w:t>a sugárkövetéshez (</w:t>
-      </w:r>
-      <w:proofErr w:type="spellStart"/>
-      <w:r>
-        <w:t>raytracing</w:t>
-      </w:r>
-      <w:proofErr w:type="spellEnd"/>
-      <w:r>
-        <w:t>)</w:t>
+        <w:t>a sugárkövetéshez (raytracing)</w:t>
       </w:r>
       <w:r>
         <w:t>,</w:t>
       </w:r>
       <w:r>
-        <w:t xml:space="preserve"> hasonlóan nagyon jól párhuzamosítható, így könnyedén implementálható a GPU-</w:t>
-      </w:r>
-      <w:proofErr w:type="spellStart"/>
-      <w:r>
-        <w:t>n.</w:t>
-      </w:r>
-      <w:proofErr w:type="spellEnd"/>
-      <w:r>
-        <w:t xml:space="preserve"> </w:t>
+        <w:t xml:space="preserve"> hasonlóan nagyon jól párhuzamosítható, így könnyedén implementálható a GPU-n. </w:t>
       </w:r>
     </w:p>
     <w:p>
@@ -1546,13 +1499,11 @@
         <w:pStyle w:val="Fejezetcimszmozsnlkl"/>
       </w:pPr>
       <w:bookmarkStart w:id="1" w:name="_Toc59896131"/>
-      <w:proofErr w:type="spellStart"/>
       <w:r>
         <w:lastRenderedPageBreak/>
         <w:t>Abstract</w:t>
       </w:r>
       <w:bookmarkEnd w:id="1"/>
-      <w:proofErr w:type="spellEnd"/>
     </w:p>
     <w:p>
       <w:r>
@@ -1620,23 +1571,7 @@
         <w:t>Geometriai modellek feldolgozására szolgáló algoritmusok komplexek</w:t>
       </w:r>
       <w:r>
-        <w:t xml:space="preserve"> és általában véges elemekre bontják a céltartományt és ezeken a véges elemeken oldanak meg algebrai egyenleteket. Az ilyen globális rendszerek nehezen párhuzamosíthatók, valamint a </w:t>
-      </w:r>
-      <w:proofErr w:type="spellStart"/>
-      <w:r>
-        <w:t>diszkretizálás</w:t>
-      </w:r>
-      <w:proofErr w:type="spellEnd"/>
-      <w:r>
-        <w:t xml:space="preserve"> </w:t>
-      </w:r>
-      <w:proofErr w:type="spellStart"/>
-      <w:r>
-        <w:t>diszkretizálási</w:t>
-      </w:r>
-      <w:proofErr w:type="spellEnd"/>
-      <w:r>
-        <w:t xml:space="preserve"> hibalehetőséget hozhat be az eredménybe. A mai hardver tendenciák szerint sokkal nagyobb hangsúlyt fektetnek a szálak növelésére, mint az óraszám növelésére. </w:t>
+        <w:t xml:space="preserve"> és általában véges elemekre bontják a céltartományt és ezeken a véges elemeken oldanak meg algebrai egyenleteket. Az ilyen globális rendszerek nehezen párhuzamosíthatók, valamint a diszkretizálás diszkretizálási hibalehetőséget hozhat be az eredménybe. A mai hardver tendenciák szerint sokkal nagyobb hangsúlyt fektetnek a szálak növelésére, mint az óraszám növelésére. </w:t>
       </w:r>
     </w:p>
     <w:p>
@@ -1647,31 +1582,7 @@
         <w:t>választott</w:t>
       </w:r>
       <w:r>
-        <w:t xml:space="preserve"> </w:t>
-      </w:r>
-      <w:proofErr w:type="spellStart"/>
-      <w:r>
-        <w:t>Walk</w:t>
-      </w:r>
-      <w:proofErr w:type="spellEnd"/>
-      <w:r>
-        <w:t xml:space="preserve"> </w:t>
-      </w:r>
-      <w:proofErr w:type="spellStart"/>
-      <w:r>
-        <w:t>On</w:t>
-      </w:r>
-      <w:proofErr w:type="spellEnd"/>
-      <w:r>
-        <w:t xml:space="preserve"> </w:t>
-      </w:r>
-      <w:proofErr w:type="spellStart"/>
-      <w:r>
-        <w:t>Spheres</w:t>
-      </w:r>
-      <w:proofErr w:type="spellEnd"/>
-      <w:r>
-        <w:t xml:space="preserve"> algoritmus [1] triviálisan párhuzamosítható</w:t>
+        <w:t xml:space="preserve"> Walk On Spheres algoritmus [1] triviálisan párhuzamosítható</w:t>
       </w:r>
       <w:r>
         <w:t xml:space="preserve"> így ezt a GPU-n implementáltam.</w:t>
@@ -1739,15 +1650,7 @@
         <w:t>Ω</w:t>
       </w:r>
       <w:r>
-        <w:t>-</w:t>
-      </w:r>
-      <w:proofErr w:type="spellStart"/>
-      <w:r>
-        <w:t>val</w:t>
-      </w:r>
-      <w:proofErr w:type="spellEnd"/>
-      <w:r>
-        <w:t xml:space="preserve"> fogom jelölni, B(x)-el azt a kört, amely </w:t>
+        <w:t xml:space="preserve">-val fogom jelölni, B(x)-el azt a kört, amely </w:t>
       </w:r>
       <w:r>
         <w:t>Ω</w:t>
@@ -2566,15 +2469,7 @@
     </w:p>
     <w:p>
       <w:r>
-        <w:t xml:space="preserve">A Laplace egyenleteket gyakran használják arra, hogy adott peremértékeket interpoláljunk egy adott tartomány </w:t>
-      </w:r>
-      <w:proofErr w:type="spellStart"/>
-      <w:r>
-        <w:t>belsejében</w:t>
-      </w:r>
-      <w:proofErr w:type="spellEnd"/>
-      <w:r>
-        <w:t>. Az u megoldás kielégíti a PDE-t [1], ha</w:t>
+        <w:t>A Laplace egyenleteket gyakran használják arra, hogy adott peremértékeket interpoláljunk egy adott tartomány belsejében. Az u megoldás kielégíti a PDE-t [1], ha</w:t>
       </w:r>
     </w:p>
     <w:tbl>
@@ -2702,15 +2597,7 @@
     </w:tbl>
     <w:p>
       <w:r>
-        <w:t xml:space="preserve">Az u-t eredményül adó függvények, úgy nevezett harmonikus függvények, két fontos </w:t>
-      </w:r>
-      <w:proofErr w:type="spellStart"/>
-      <w:r>
-        <w:t>karakterizációval</w:t>
-      </w:r>
-      <w:proofErr w:type="spellEnd"/>
-      <w:r>
-        <w:t xml:space="preserve"> jellemezhetőek:</w:t>
+        <w:t>Az u-t eredményül adó függvények, úgy nevezett harmonikus függvények, két fontos karakterizációval jellemezhetőek:</w:t>
       </w:r>
     </w:p>
     <w:p>
@@ -2721,21 +2608,12 @@
           <w:numId w:val="23"/>
         </w:numPr>
       </w:pPr>
-      <w:proofErr w:type="spellStart"/>
       <w:r>
         <w:rPr>
           <w:b/>
           <w:bCs/>
         </w:rPr>
-        <w:t>Kakutani</w:t>
-      </w:r>
-      <w:proofErr w:type="spellEnd"/>
-      <w:r>
-        <w:rPr>
-          <w:b/>
-          <w:bCs/>
-        </w:rPr>
-        <w:t xml:space="preserve"> </w:t>
+        <w:t xml:space="preserve">Kakutani </w:t>
       </w:r>
       <w:r>
         <w:rPr>
@@ -3101,29 +2979,8 @@
         <w:pStyle w:val="Heading3"/>
       </w:pPr>
       <w:bookmarkStart w:id="5" w:name="_Ref183624068"/>
-      <w:proofErr w:type="spellStart"/>
-      <w:r>
-        <w:t>Walk</w:t>
-      </w:r>
-      <w:proofErr w:type="spellEnd"/>
-      <w:r>
-        <w:t xml:space="preserve"> </w:t>
-      </w:r>
-      <w:proofErr w:type="spellStart"/>
-      <w:r>
-        <w:t>on</w:t>
-      </w:r>
-      <w:proofErr w:type="spellEnd"/>
-      <w:r>
-        <w:t xml:space="preserve"> </w:t>
-      </w:r>
-      <w:proofErr w:type="spellStart"/>
-      <w:r>
-        <w:t>Spheres</w:t>
-      </w:r>
-      <w:proofErr w:type="spellEnd"/>
-      <w:r>
-        <w:t xml:space="preserve"> algoritmus</w:t>
+      <w:r>
+        <w:t>Walk on Spheres algoritmus</w:t>
       </w:r>
       <w:bookmarkEnd w:id="5"/>
     </w:p>
@@ -3134,31 +2991,7 @@
     </w:p>
     <w:p>
       <w:r>
-        <w:t xml:space="preserve">Ezzel szemben egy diszkretizáció mentes megoldást ad a </w:t>
-      </w:r>
-      <w:proofErr w:type="spellStart"/>
-      <w:r>
-        <w:t>Walk</w:t>
-      </w:r>
-      <w:proofErr w:type="spellEnd"/>
-      <w:r>
-        <w:t xml:space="preserve"> </w:t>
-      </w:r>
-      <w:proofErr w:type="spellStart"/>
-      <w:r>
-        <w:t>on</w:t>
-      </w:r>
-      <w:proofErr w:type="spellEnd"/>
-      <w:r>
-        <w:t xml:space="preserve"> </w:t>
-      </w:r>
-      <w:proofErr w:type="spellStart"/>
-      <w:r>
-        <w:t>Spheres</w:t>
-      </w:r>
-      <w:proofErr w:type="spellEnd"/>
-      <w:r>
-        <w:t xml:space="preserve"> algoritmus. Szimmetrikus okok miatt egy </w:t>
+        <w:t xml:space="preserve">Ezzel szemben egy diszkretizáció mentes megoldást ad a Walk on Spheres algoritmus. Szimmetrikus okok miatt egy </w:t>
       </w:r>
       <m:oMath>
         <m:sSub>
@@ -3441,31 +3274,7 @@
         <w:t>Ω</w:t>
       </w:r>
       <w:r>
-        <w:t xml:space="preserve"> tartományon az x pontból indítva (felső), valamint a </w:t>
-      </w:r>
-      <w:proofErr w:type="spellStart"/>
-      <w:r>
-        <w:t>Walk</w:t>
-      </w:r>
-      <w:proofErr w:type="spellEnd"/>
-      <w:r>
-        <w:t xml:space="preserve"> </w:t>
-      </w:r>
-      <w:proofErr w:type="spellStart"/>
-      <w:r>
-        <w:t>on</w:t>
-      </w:r>
-      <w:proofErr w:type="spellEnd"/>
-      <w:r>
-        <w:t xml:space="preserve"> </w:t>
-      </w:r>
-      <w:proofErr w:type="spellStart"/>
-      <w:r>
-        <w:t>Spheres</w:t>
-      </w:r>
-      <w:proofErr w:type="spellEnd"/>
-      <w:r>
-        <w:t xml:space="preserve"> algoritmus (alsó) egy választott </w:t>
+        <w:t xml:space="preserve"> tartományon az x pontból indítva (felső), valamint a Walk on Spheres algoritmus (alsó) egy választott </w:t>
       </w:r>
       <m:oMath>
         <m:r>
@@ -3718,15 +3527,7 @@
     </w:p>
     <w:p>
       <w:r>
-        <w:t xml:space="preserve">A várható értéke a </w:t>
-      </w:r>
-      <w:proofErr w:type="spellStart"/>
-      <w:r>
-        <w:t>WoS</w:t>
-      </w:r>
-      <w:proofErr w:type="spellEnd"/>
-      <w:r>
-        <w:t xml:space="preserve"> becslőnek megegyezik az </w:t>
+        <w:t xml:space="preserve">A várható értéke a WoS becslőnek megegyezik az </w:t>
       </w:r>
       <m:oMath>
         <m:r>
@@ -3843,15 +3644,7 @@
     </w:p>
     <w:p>
       <w:r>
-        <w:t>A C++, hasonlóan a C-</w:t>
-      </w:r>
-      <w:proofErr w:type="spellStart"/>
-      <w:r>
-        <w:t>hez</w:t>
-      </w:r>
-      <w:proofErr w:type="spellEnd"/>
-      <w:r>
-        <w:t>,</w:t>
+        <w:t>A C++, hasonlóan a C-hez,</w:t>
       </w:r>
       <w:r>
         <w:t xml:space="preserve"> a magas szintű programozási nyelvek között</w:t>
@@ -3860,15 +3653,7 @@
         <w:t xml:space="preserve"> alacsony színtű hozzáférést biztosít a számítógéphez.</w:t>
       </w:r>
       <w:r>
-        <w:t xml:space="preserve"> A memória allokációt mi tudjuk kezelni, valamint van lehetőség változók pontos memória területét meghatározni, így olyan adatátvitelt biztosítani, ami a lehető legoptimálisabb lesz, például olyan </w:t>
-      </w:r>
-      <w:proofErr w:type="spellStart"/>
-      <w:r>
-        <w:t>struct</w:t>
-      </w:r>
-      <w:proofErr w:type="spellEnd"/>
-      <w:r>
-        <w:t xml:space="preserve"> használata, ami pontosan 32 byte, így pontosan 2, vagy 1 elem fér egy cache határba.</w:t>
+        <w:t xml:space="preserve"> A memória allokációt mi tudjuk kezelni, valamint van lehetőség változók pontos memória területét meghatározni, így olyan adatátvitelt biztosítani, ami a lehető legoptimálisabb lesz, például olyan struct használata, ami pontosan 32 byte, így pontosan 2, vagy 1 elem fér egy cache határba.</w:t>
       </w:r>
     </w:p>
     <w:p>
@@ -3889,42 +3674,10 @@
     </w:p>
     <w:p>
       <w:r>
-        <w:t xml:space="preserve">Az eredmény megjelenítéséhez a </w:t>
-      </w:r>
-      <w:proofErr w:type="spellStart"/>
-      <w:r>
-        <w:t>Khronos</w:t>
-      </w:r>
-      <w:proofErr w:type="spellEnd"/>
-      <w:r>
-        <w:t xml:space="preserve"> csoport által definiált </w:t>
-      </w:r>
-      <w:proofErr w:type="spellStart"/>
-      <w:r>
-        <w:t>OpenGL</w:t>
-      </w:r>
-      <w:proofErr w:type="spellEnd"/>
-      <w:r>
-        <w:t xml:space="preserve"> API-t választottam, mivel egyetemi tanulmányaim során a Számítógépes Grafika c. tárgyból már volt használva, valamint extenzív forrás található az API-hoz az interneten. Az </w:t>
-      </w:r>
-      <w:proofErr w:type="spellStart"/>
-      <w:r>
-        <w:t>OpenGL</w:t>
-      </w:r>
-      <w:proofErr w:type="spellEnd"/>
-      <w:r>
-        <w:t xml:space="preserve"> előnye egy előre definiált grafikus könyvtárhoz képest, például SDL2, az, hogy sokkal nagyobb hozzáférést nyújt a hardverhez, így jobban irányítható, hogy mi történjen, így jobban optimalizálható a kód.</w:t>
-      </w:r>
-      <w:r>
-        <w:t xml:space="preserve"> Az </w:t>
-      </w:r>
-      <w:proofErr w:type="spellStart"/>
-      <w:r>
-        <w:t>OpenGL</w:t>
-      </w:r>
-      <w:proofErr w:type="spellEnd"/>
-      <w:r>
-        <w:t xml:space="preserve"> API operációs rendszer független, működik Windows, Linux, valamint Intel chipet használó Apple számítógépeken is.</w:t>
+        <w:t>Az eredmény megjelenítéséhez a Khronos csoport által definiált OpenGL API-t választottam, mivel egyetemi tanulmányaim során a Számítógépes Grafika c. tárgyból már volt használva, valamint extenzív forrás található az API-hoz az interneten. Az OpenGL előnye egy előre definiált grafikus könyvtárhoz képest, például SDL2, az, hogy sokkal nagyobb hozzáférést nyújt a hardverhez, így jobban irányítható, hogy mi történjen, így jobban optimalizálható a kód.</w:t>
+      </w:r>
+      <w:r>
+        <w:t xml:space="preserve"> Az OpenGL API operációs rendszer független, működik Windows, Linux, valamint Intel chipet használó Apple számítógépeken is.</w:t>
       </w:r>
     </w:p>
     <w:p>
@@ -3937,15 +3690,7 @@
     </w:p>
     <w:p>
       <w:r>
-        <w:t xml:space="preserve">A GLFW egy olyan </w:t>
-      </w:r>
-      <w:proofErr w:type="spellStart"/>
-      <w:r>
-        <w:t>OpenGL</w:t>
-      </w:r>
-      <w:proofErr w:type="spellEnd"/>
-      <w:r>
-        <w:t xml:space="preserve"> könyvtár, ami olyan API-t nyújt a felhasználónak, ami jelentősen megkönnyíti az ablakok, kontextusok</w:t>
+        <w:t>A GLFW egy olyan OpenGL könyvtár, ami olyan API-t nyújt a felhasználónak, ami jelentősen megkönnyíti az ablakok, kontextusok</w:t>
       </w:r>
       <w:r>
         <w:t>,</w:t>
@@ -3989,342 +3734,55 @@
         <w:t xml:space="preserve">Fontosnak tartom megemlíteni, hogy </w:t>
       </w:r>
       <w:r>
-        <w:t xml:space="preserve">direkt </w:t>
-      </w:r>
-      <w:proofErr w:type="spellStart"/>
+        <w:t>direkt OpenGL függvényhívások helyett érdemesebb egy segítő könyvtár használata, ami feloldja helyettünk az OpenGL-hez intézett függvényhívásokat. Én a GLEW könyvtárat használtam a projektben. A választásom azért esett erre a könyvtárra, más könyvtárak, mint például a GLee, helyett, mert a Számítógépes Grafika című tárgyból is ezt a könyvtárat használtuk, így a familiaritás elvén maradtam a könyvtárnál.</w:t>
+      </w:r>
+    </w:p>
+    <w:p>
+      <w:r>
+        <w:t>Azért hasznos a GLEW, mert vannak olyan függvények definiálva az OpenGL API-ban, amit nem biztos, hogy minden videokártya cég támogat, így a program linkelésénél nem direktben az OpenGL függvényekkel linkel a programunk, hanem egy köztes fájllal, ami futásidőben ellenőrzi, hogy milyen funkcionalitások érhetőek el a számítógépen, így elkerülve a linkelési problémákat.</w:t>
+      </w:r>
+    </w:p>
+    <w:p>
+      <w:pPr>
+        <w:pStyle w:val="Heading4"/>
+      </w:pPr>
       <w:r>
         <w:t>OpenGL</w:t>
       </w:r>
-      <w:proofErr w:type="spellEnd"/>
-      <w:r>
-        <w:t xml:space="preserve"> függvényhívások helyett érdemesebb egy segítő könyvtár használata, ami feloldja helyettünk az </w:t>
-      </w:r>
-      <w:proofErr w:type="spellStart"/>
-      <w:r>
-        <w:t>OpenGL-hez</w:t>
-      </w:r>
-      <w:proofErr w:type="spellEnd"/>
-      <w:r>
-        <w:t xml:space="preserve"> intézett függvényhívásokat. Én a GLEW könyvtárat használtam a projektben. A választásom azért esett erre a könyvtárra, más könyvtárak, mint például a </w:t>
-      </w:r>
-      <w:proofErr w:type="spellStart"/>
-      <w:r>
-        <w:t>GLee</w:t>
-      </w:r>
-      <w:proofErr w:type="spellEnd"/>
-      <w:r>
-        <w:t>, helyett, mert a Számítógépes Grafika című tárgyból is ezt a könyvtárat használtuk, így a familiaritás elvén maradtam a könyvtárnál.</w:t>
-      </w:r>
-    </w:p>
-    <w:p>
-      <w:r>
-        <w:t xml:space="preserve">Azért hasznos a GLEW, mert vannak olyan függvények definiálva az </w:t>
-      </w:r>
-      <w:proofErr w:type="spellStart"/>
-      <w:r>
-        <w:t>OpenGL</w:t>
-      </w:r>
-      <w:proofErr w:type="spellEnd"/>
-      <w:r>
-        <w:t xml:space="preserve"> API-ban, amit nem biztos, hogy minden videokártya cég támogat, így a program linkelésénél nem direktben az </w:t>
-      </w:r>
-      <w:proofErr w:type="spellStart"/>
-      <w:r>
-        <w:t>OpenGL</w:t>
-      </w:r>
-      <w:proofErr w:type="spellEnd"/>
-      <w:r>
-        <w:t xml:space="preserve"> függvényekkel linkel a programunk, hanem egy köztes fájllal, ami futásidőben ellenőrzi, hogy milyen funkcionalitások érhetőek el a számítógépen, így elkerülve a linkelési problémákat.</w:t>
-      </w:r>
-    </w:p>
-    <w:p>
-      <w:pPr>
-        <w:pStyle w:val="Heading4"/>
-      </w:pPr>
-      <w:proofErr w:type="spellStart"/>
-      <w:r>
-        <w:t>OpenGL</w:t>
-      </w:r>
-      <w:proofErr w:type="spellEnd"/>
-    </w:p>
-    <w:p>
-      <w:r>
-        <w:t xml:space="preserve">Az </w:t>
-      </w:r>
-      <w:proofErr w:type="spellStart"/>
-      <w:r>
-        <w:t>OpenGL</w:t>
-      </w:r>
-      <w:proofErr w:type="spellEnd"/>
-      <w:r>
-        <w:t xml:space="preserve"> API valójában egy nagy állapotgépként fogható fel. A futtatása egy </w:t>
-      </w:r>
-      <w:proofErr w:type="spellStart"/>
-      <w:r>
-        <w:t>pipelineként</w:t>
-      </w:r>
-      <w:proofErr w:type="spellEnd"/>
-      <w:r>
-        <w:t xml:space="preserve"> működik, melynek egyes állásaiba rakhatjuk saját kódunkat, ezzel irányítva a GPU-t.</w:t>
-      </w:r>
-    </w:p>
-    <w:p>
-      <w:r>
-        <w:t xml:space="preserve">Az </w:t>
-      </w:r>
-      <w:proofErr w:type="spellStart"/>
-      <w:r>
-        <w:t>OpenGL</w:t>
-      </w:r>
-      <w:proofErr w:type="spellEnd"/>
-      <w:r>
-        <w:t xml:space="preserve"> API nem csak grafikus megjelenítésre használható, hanem az </w:t>
-      </w:r>
-      <w:proofErr w:type="spellStart"/>
-      <w:r>
-        <w:t>OpenGL</w:t>
-      </w:r>
-      <w:proofErr w:type="spellEnd"/>
-      <w:r>
-        <w:t xml:space="preserve"> 4</w:t>
+    </w:p>
+    <w:p>
+      <w:r>
+        <w:t>Az OpenGL API valójában egy nagy állapotgépként fogható fel. A futtatása egy pipelineként működik, melynek egyes állásaiba rakhatjuk saját kódunkat, ezzel irányítva a GPU-t.</w:t>
+      </w:r>
+    </w:p>
+    <w:p>
+      <w:r>
+        <w:t>Az OpenGL API nem csak grafikus megjelenítésre használható, hanem az OpenGL 4</w:t>
       </w:r>
       <w:r>
         <w:t>.3</w:t>
       </w:r>
       <w:r>
-        <w:t xml:space="preserve">+ óta lehetőség van általános számításokat is végezni a GPU-n az </w:t>
-      </w:r>
-      <w:proofErr w:type="spellStart"/>
-      <w:r>
-        <w:t>OpenGL</w:t>
-      </w:r>
-      <w:proofErr w:type="spellEnd"/>
+        <w:t xml:space="preserve">+ óta lehetőség van általános számításokat is végezni a GPU-n az OpenGL compute shaderei segítségével. Ezelőtt is lehetőség volt </w:t>
+      </w:r>
+      <w:r>
+        <w:t xml:space="preserve">a </w:t>
+      </w:r>
+      <w:r>
+        <w:t>fragment shaderek segítségével általános számításokat végezni, de a compute shaderek nagy könnyítést hoztak be.</w:t>
+      </w:r>
       <w:r>
         <w:t xml:space="preserve"> </w:t>
       </w:r>
-      <w:proofErr w:type="spellStart"/>
-      <w:r>
-        <w:t>compute</w:t>
-      </w:r>
-      <w:proofErr w:type="spellEnd"/>
-      <w:r>
-        <w:t xml:space="preserve"> </w:t>
-      </w:r>
-      <w:proofErr w:type="spellStart"/>
-      <w:r>
-        <w:t>shaderei</w:t>
-      </w:r>
-      <w:proofErr w:type="spellEnd"/>
-      <w:r>
-        <w:t xml:space="preserve"> segítségével. Ezelőtt is lehetőség volt </w:t>
-      </w:r>
-      <w:r>
-        <w:t xml:space="preserve">a </w:t>
-      </w:r>
-      <w:proofErr w:type="spellStart"/>
-      <w:r>
-        <w:t>fragment</w:t>
-      </w:r>
-      <w:proofErr w:type="spellEnd"/>
-      <w:r>
-        <w:t xml:space="preserve"> </w:t>
-      </w:r>
-      <w:proofErr w:type="spellStart"/>
-      <w:r>
-        <w:t>shaderek</w:t>
-      </w:r>
-      <w:proofErr w:type="spellEnd"/>
-      <w:r>
-        <w:t xml:space="preserve"> segítségével általános számításokat végezni, de a </w:t>
-      </w:r>
-      <w:proofErr w:type="spellStart"/>
-      <w:r>
-        <w:t>compute</w:t>
-      </w:r>
-      <w:proofErr w:type="spellEnd"/>
-      <w:r>
-        <w:t xml:space="preserve"> </w:t>
-      </w:r>
-      <w:proofErr w:type="spellStart"/>
-      <w:r>
-        <w:t>shaderek</w:t>
-      </w:r>
-      <w:proofErr w:type="spellEnd"/>
-      <w:r>
-        <w:t xml:space="preserve"> nagy könnyítést hoztak be.</w:t>
-      </w:r>
-      <w:r>
-        <w:t xml:space="preserve"> </w:t>
-      </w:r>
-    </w:p>
-    <w:p>
-      <w:r>
-        <w:t xml:space="preserve">Míg a </w:t>
-      </w:r>
-      <w:proofErr w:type="spellStart"/>
-      <w:r>
-        <w:t>fragment</w:t>
-      </w:r>
-      <w:proofErr w:type="spellEnd"/>
-      <w:r>
-        <w:t xml:space="preserve"> </w:t>
-      </w:r>
-      <w:proofErr w:type="spellStart"/>
-      <w:r>
-        <w:t>shaderek</w:t>
-      </w:r>
-      <w:proofErr w:type="spellEnd"/>
-      <w:r>
-        <w:t xml:space="preserve"> csak azokra a </w:t>
-      </w:r>
-      <w:proofErr w:type="spellStart"/>
-      <w:r>
-        <w:t>fragmentekre</w:t>
-      </w:r>
-      <w:proofErr w:type="spellEnd"/>
-      <w:r>
-        <w:t xml:space="preserve"> futottak le, amiket lefedett egy </w:t>
-      </w:r>
-      <w:proofErr w:type="spellStart"/>
-      <w:r>
-        <w:t>polygon</w:t>
-      </w:r>
-      <w:proofErr w:type="spellEnd"/>
-      <w:r>
-        <w:t xml:space="preserve">, amit a </w:t>
-      </w:r>
-      <w:proofErr w:type="spellStart"/>
-      <w:r>
-        <w:t>vertex</w:t>
-      </w:r>
-      <w:proofErr w:type="spellEnd"/>
-      <w:r>
-        <w:t xml:space="preserve"> </w:t>
-      </w:r>
-      <w:proofErr w:type="spellStart"/>
-      <w:r>
-        <w:t>shaderben</w:t>
-      </w:r>
-      <w:proofErr w:type="spellEnd"/>
-      <w:r>
-        <w:t xml:space="preserve"> adtunk meg a </w:t>
-      </w:r>
-      <w:proofErr w:type="spellStart"/>
-      <w:r>
-        <w:t>shader</w:t>
-      </w:r>
-      <w:proofErr w:type="spellEnd"/>
-      <w:r>
-        <w:t xml:space="preserve"> programunknak. Azt sem lehet szabályozni a </w:t>
-      </w:r>
-      <w:proofErr w:type="spellStart"/>
-      <w:r>
-        <w:t>fragment</w:t>
-      </w:r>
-      <w:proofErr w:type="spellEnd"/>
-      <w:r>
-        <w:t xml:space="preserve"> </w:t>
-      </w:r>
-      <w:proofErr w:type="spellStart"/>
-      <w:r>
-        <w:t>shadernél</w:t>
-      </w:r>
-      <w:proofErr w:type="spellEnd"/>
-      <w:r>
-        <w:t>, hogy hány szál fusson egyszerre, milyen ütemezéssel.</w:t>
-      </w:r>
-    </w:p>
-    <w:p>
-      <w:r>
-        <w:t xml:space="preserve">Az </w:t>
-      </w:r>
-      <w:proofErr w:type="spellStart"/>
-      <w:r>
-        <w:t>OpenGL</w:t>
-      </w:r>
-      <w:proofErr w:type="spellEnd"/>
-      <w:r>
-        <w:t xml:space="preserve">-ben egyszerre egy aktív </w:t>
-      </w:r>
-      <w:proofErr w:type="spellStart"/>
-      <w:r>
-        <w:t>shader</w:t>
-      </w:r>
-      <w:proofErr w:type="spellEnd"/>
-      <w:r>
-        <w:t xml:space="preserve"> program lehet és egy </w:t>
-      </w:r>
-      <w:proofErr w:type="spellStart"/>
-      <w:r>
-        <w:t>shader</w:t>
-      </w:r>
-      <w:proofErr w:type="spellEnd"/>
-      <w:r>
-        <w:t xml:space="preserve"> programban, vagy a </w:t>
-      </w:r>
-      <w:proofErr w:type="spellStart"/>
-      <w:r>
-        <w:t>graphics</w:t>
-      </w:r>
-      <w:proofErr w:type="spellEnd"/>
-      <w:r>
-        <w:t xml:space="preserve"> </w:t>
-      </w:r>
-      <w:proofErr w:type="spellStart"/>
-      <w:r>
-        <w:t>pipeline</w:t>
-      </w:r>
-      <w:proofErr w:type="spellEnd"/>
-      <w:r>
-        <w:t xml:space="preserve">, vagy a </w:t>
-      </w:r>
-      <w:proofErr w:type="spellStart"/>
-      <w:r>
-        <w:t>compute</w:t>
-      </w:r>
-      <w:proofErr w:type="spellEnd"/>
-      <w:r>
-        <w:t xml:space="preserve"> </w:t>
-      </w:r>
-      <w:proofErr w:type="spellStart"/>
-      <w:r>
-        <w:t>pipeline</w:t>
-      </w:r>
-      <w:proofErr w:type="spellEnd"/>
-      <w:r>
-        <w:t xml:space="preserve"> az aktív, nem lehet egyszerre mindkettő. Így az </w:t>
-      </w:r>
-      <w:proofErr w:type="spellStart"/>
-      <w:r>
-        <w:t>OpenGL</w:t>
-      </w:r>
-      <w:proofErr w:type="spellEnd"/>
-      <w:r>
-        <w:t xml:space="preserve"> </w:t>
-      </w:r>
-      <w:proofErr w:type="spellStart"/>
-      <w:r>
-        <w:t>pipelineban</w:t>
-      </w:r>
-      <w:proofErr w:type="spellEnd"/>
-      <w:r>
-        <w:t xml:space="preserve"> elkülönült helyen található a </w:t>
-      </w:r>
-      <w:proofErr w:type="spellStart"/>
-      <w:r>
-        <w:t>compute</w:t>
-      </w:r>
-      <w:proofErr w:type="spellEnd"/>
-      <w:r>
-        <w:t xml:space="preserve"> </w:t>
-      </w:r>
-      <w:proofErr w:type="spellStart"/>
-      <w:r>
-        <w:t>shader</w:t>
-      </w:r>
-      <w:proofErr w:type="spellEnd"/>
-      <w:r>
-        <w:t xml:space="preserve">. </w:t>
+    </w:p>
+    <w:p>
+      <w:r>
+        <w:t>Míg a fragment shaderek csak azokra a fragmentekre futottak le, amiket lefedett egy polygon, amit a vertex shaderben adtunk meg a shader programunknak. Azt sem lehet szabályozni a fragment shadernél, hogy hány szál fusson egyszerre, milyen ütemezéssel.</w:t>
+      </w:r>
+    </w:p>
+    <w:p>
+      <w:r>
+        <w:t xml:space="preserve">Az OpenGL-ben egyszerre egy aktív shader program lehet és egy shader programban, vagy a graphics pipeline, vagy a compute pipeline az aktív, nem lehet egyszerre mindkettő. Így az OpenGL pipelineban elkülönült helyen található a compute shader. </w:t>
       </w:r>
       <w:r>
         <w:fldChar w:fldCharType="begin"/>
@@ -4350,71 +3808,7 @@
     </w:p>
     <w:p>
       <w:r>
-        <w:t xml:space="preserve">A </w:t>
-      </w:r>
-      <w:proofErr w:type="spellStart"/>
-      <w:r>
-        <w:t>graphics</w:t>
-      </w:r>
-      <w:proofErr w:type="spellEnd"/>
-      <w:r>
-        <w:t xml:space="preserve"> </w:t>
-      </w:r>
-      <w:proofErr w:type="spellStart"/>
-      <w:r>
-        <w:t>pipelinenal</w:t>
-      </w:r>
-      <w:proofErr w:type="spellEnd"/>
-      <w:r>
-        <w:t xml:space="preserve"> ellentétben a </w:t>
-      </w:r>
-      <w:proofErr w:type="spellStart"/>
-      <w:r>
-        <w:t>compute</w:t>
-      </w:r>
-      <w:proofErr w:type="spellEnd"/>
-      <w:r>
-        <w:t xml:space="preserve"> </w:t>
-      </w:r>
-      <w:proofErr w:type="spellStart"/>
-      <w:r>
-        <w:t>shaderrel</w:t>
-      </w:r>
-      <w:proofErr w:type="spellEnd"/>
-      <w:r>
-        <w:t xml:space="preserve"> nem lehet </w:t>
-      </w:r>
-      <w:proofErr w:type="spellStart"/>
-      <w:r>
-        <w:t>Vertex</w:t>
-      </w:r>
-      <w:proofErr w:type="spellEnd"/>
-      <w:r>
-        <w:t xml:space="preserve"> </w:t>
-      </w:r>
-      <w:proofErr w:type="spellStart"/>
-      <w:r>
-        <w:t>Buffer</w:t>
-      </w:r>
-      <w:proofErr w:type="spellEnd"/>
-      <w:r>
-        <w:t xml:space="preserve"> </w:t>
-      </w:r>
-      <w:proofErr w:type="spellStart"/>
-      <w:r>
-        <w:t>Objectekkel</w:t>
-      </w:r>
-      <w:proofErr w:type="spellEnd"/>
-      <w:r>
-        <w:t xml:space="preserve"> (</w:t>
-      </w:r>
-      <w:proofErr w:type="spellStart"/>
-      <w:r>
-        <w:t>vbo</w:t>
-      </w:r>
-      <w:proofErr w:type="spellEnd"/>
-      <w:r>
-        <w:t xml:space="preserve">), vagy </w:t>
+        <w:t xml:space="preserve">A graphics pipelinenal ellentétben a compute shaderrel nem lehet Vertex Buffer Objectekkel (vbo), vagy </w:t>
       </w:r>
       <w:r>
         <w:t>u</w:t>
@@ -4423,72 +3817,19 @@
         <w:t>niformokkal</w:t>
       </w:r>
       <w:r>
-        <w:t xml:space="preserve"> kommunikálni, hanem például </w:t>
-      </w:r>
-      <w:proofErr w:type="spellStart"/>
-      <w:r>
-        <w:t>Shader</w:t>
-      </w:r>
-      <w:proofErr w:type="spellEnd"/>
-      <w:r>
-        <w:t xml:space="preserve"> Storage </w:t>
-      </w:r>
-      <w:proofErr w:type="spellStart"/>
-      <w:r>
-        <w:t>Buffer</w:t>
-      </w:r>
-      <w:proofErr w:type="spellEnd"/>
-      <w:r>
-        <w:t xml:space="preserve"> </w:t>
-      </w:r>
-      <w:proofErr w:type="spellStart"/>
-      <w:r>
-        <w:t>Objectekkel</w:t>
-      </w:r>
-      <w:proofErr w:type="spellEnd"/>
+        <w:t xml:space="preserve"> kommunikálni, hanem például Shader Storage Buffer Objectekkel</w:t>
+      </w:r>
       <w:r>
         <w:t xml:space="preserve"> (SSBO)</w:t>
       </w:r>
       <w:r>
-        <w:t xml:space="preserve">, Uniform </w:t>
-      </w:r>
-      <w:proofErr w:type="spellStart"/>
-      <w:r>
-        <w:t>Buffer</w:t>
-      </w:r>
-      <w:proofErr w:type="spellEnd"/>
-      <w:r>
-        <w:t xml:space="preserve"> </w:t>
-      </w:r>
-      <w:proofErr w:type="spellStart"/>
-      <w:r>
-        <w:t>Objectekkel</w:t>
-      </w:r>
-      <w:proofErr w:type="spellEnd"/>
-      <w:r>
-        <w:t xml:space="preserve"> (UBO)</w:t>
+        <w:t>, Uniform Buffer Objectekkel (UBO)</w:t>
       </w:r>
       <w:r>
         <w:t>, vagy texturával</w:t>
       </w:r>
       <w:r>
-        <w:t xml:space="preserve"> lehetséges az adatátvitel a </w:t>
-      </w:r>
-      <w:proofErr w:type="spellStart"/>
-      <w:r>
-        <w:t>compute</w:t>
-      </w:r>
-      <w:proofErr w:type="spellEnd"/>
-      <w:r>
-        <w:t xml:space="preserve"> </w:t>
-      </w:r>
-      <w:proofErr w:type="spellStart"/>
-      <w:r>
-        <w:t>shaderbe</w:t>
-      </w:r>
-      <w:proofErr w:type="spellEnd"/>
-      <w:r>
-        <w:t>, valamint onnan vissza a CPU-ra.</w:t>
+        <w:t xml:space="preserve"> lehetséges az adatátvitel a compute shaderbe, valamint onnan vissza a CPU-ra.</w:t>
       </w:r>
     </w:p>
     <w:p>
@@ -4572,98 +3913,18 @@
       </w:r>
       <w:bookmarkEnd w:id="7"/>
       <w:r>
-        <w:t xml:space="preserve">: Az </w:t>
-      </w:r>
-      <w:proofErr w:type="spellStart"/>
-      <w:r>
-        <w:t>OpenGL</w:t>
-      </w:r>
-      <w:proofErr w:type="spellEnd"/>
-      <w:r>
-        <w:t xml:space="preserve"> </w:t>
-      </w:r>
-      <w:proofErr w:type="spellStart"/>
-      <w:r>
-        <w:t>pipeline</w:t>
-      </w:r>
-      <w:proofErr w:type="spellEnd"/>
-      <w:r>
-        <w:t xml:space="preserve"> egyes állomásai láthatóak. A</w:t>
-      </w:r>
-      <w:r>
-        <w:t xml:space="preserve">z ábra nem a teljes </w:t>
-      </w:r>
-      <w:proofErr w:type="spellStart"/>
-      <w:r>
-        <w:t>pipeline</w:t>
-      </w:r>
-      <w:proofErr w:type="spellEnd"/>
-      <w:r>
-        <w:t>-t mutatja, csak a fontosabb részeit.</w:t>
-      </w:r>
-      <w:r>
-        <w:t xml:space="preserve"> A </w:t>
-      </w:r>
-      <w:proofErr w:type="spellStart"/>
-      <w:r>
-        <w:t>compute</w:t>
-      </w:r>
-      <w:proofErr w:type="spellEnd"/>
-      <w:r>
-        <w:t xml:space="preserve"> </w:t>
-      </w:r>
-      <w:proofErr w:type="spellStart"/>
-      <w:r>
-        <w:t>pipeline</w:t>
-      </w:r>
-      <w:proofErr w:type="spellEnd"/>
-      <w:r>
-        <w:t xml:space="preserve"> egy különálló rész a </w:t>
-      </w:r>
-      <w:proofErr w:type="spellStart"/>
-      <w:r>
-        <w:t>graphics</w:t>
-      </w:r>
-      <w:proofErr w:type="spellEnd"/>
-      <w:r>
-        <w:t xml:space="preserve"> </w:t>
-      </w:r>
-      <w:proofErr w:type="spellStart"/>
-      <w:r>
-        <w:t>pipeline-tól</w:t>
-      </w:r>
-      <w:proofErr w:type="spellEnd"/>
-      <w:r>
-        <w:t xml:space="preserve">, azonban számos azonos adatátviteli metódus van, amivel adatot tudunk átadni a </w:t>
-      </w:r>
-      <w:proofErr w:type="spellStart"/>
-      <w:r>
-        <w:t>shadereknek</w:t>
-      </w:r>
-      <w:proofErr w:type="spellEnd"/>
-      <w:r>
-        <w:t>.</w:t>
-      </w:r>
-    </w:p>
-    <w:p>
-      <w:r>
-        <w:t>Az SSBO-</w:t>
-      </w:r>
-      <w:proofErr w:type="spellStart"/>
-      <w:r>
-        <w:t>knak</w:t>
-      </w:r>
-      <w:proofErr w:type="spellEnd"/>
-      <w:r>
-        <w:t>, valamint az UBO-</w:t>
-      </w:r>
-      <w:proofErr w:type="spellStart"/>
-      <w:r>
-        <w:t>knak</w:t>
-      </w:r>
-      <w:proofErr w:type="spellEnd"/>
-      <w:r>
-        <w:t xml:space="preserve"> fontos tulajdonságuk, hogy definiálásuknál meg kell adni egy memória elrendezést. Két elrendezés van std140, valamint std430. A különbségek a kettő között többek között azok, hogy míg az std140 elrendezésnél a nem vec4 memória nagyságú elemek memória területe fel van kerekítve vec4 méretre, addig std430-nál nincs ilyen kerekítés alkalmazva. Így az </w:t>
+        <w:t>: Az OpenGL pipeline egyes állomásai láthatóak. A</w:t>
+      </w:r>
+      <w:r>
+        <w:t>z ábra nem a teljes pipeline-t mutatja, csak a fontosabb részeit.</w:t>
+      </w:r>
+      <w:r>
+        <w:t xml:space="preserve"> A compute pipeline egy különálló rész a graphics pipeline-tól, azonban számos azonos adatátviteli metódus van, amivel adatot tudunk átadni a shadereknek.</w:t>
+      </w:r>
+    </w:p>
+    <w:p>
+      <w:r>
+        <w:t xml:space="preserve">Az SSBO-knak, valamint az UBO-knak fontos tulajdonságuk, hogy definiálásuknál meg kell adni egy memória elrendezést. Két elrendezés van std140, valamint std430. A különbségek a kettő között többek között azok, hogy míg az std140 elrendezésnél a nem vec4 memória nagyságú elemek memória területe fel van kerekítve vec4 méretre, addig std430-nál nincs ilyen kerekítés alkalmazva. Így az </w:t>
       </w:r>
       <w:r>
         <w:t>std430-cal</w:t>
@@ -4675,229 +3936,40 @@
         <w:t>azonban,</w:t>
       </w:r>
       <w:r>
-        <w:t xml:space="preserve"> ha a méretekre nem figyelünk, könnyen </w:t>
-      </w:r>
-      <w:proofErr w:type="spellStart"/>
-      <w:r>
-        <w:t>elcsúszhatun</w:t>
-      </w:r>
-      <w:r>
-        <w:t>k</w:t>
-      </w:r>
-      <w:proofErr w:type="spellEnd"/>
-      <w:r>
-        <w:t xml:space="preserve"> az adatátvitelkor és rosszul lesznek értelmezve az adataink. Az std430 elrendezést csak SSBO-</w:t>
-      </w:r>
-      <w:proofErr w:type="spellStart"/>
-      <w:r>
-        <w:t>nál</w:t>
-      </w:r>
-      <w:proofErr w:type="spellEnd"/>
-      <w:r>
-        <w:t xml:space="preserve"> lehet alkalmazni. Azonban mindkét elrendezésnél elvárt, hogy a teljes memória méret nagysága a vec4 többszöröse legyen.</w:t>
-      </w:r>
-    </w:p>
-    <w:p>
-      <w:r>
-        <w:t xml:space="preserve">A </w:t>
-      </w:r>
-      <w:proofErr w:type="spellStart"/>
-      <w:r>
-        <w:t>compute</w:t>
-      </w:r>
-      <w:proofErr w:type="spellEnd"/>
-      <w:r>
-        <w:t xml:space="preserve"> </w:t>
-      </w:r>
-      <w:proofErr w:type="spellStart"/>
-      <w:r>
-        <w:t>shader</w:t>
-      </w:r>
-      <w:proofErr w:type="spellEnd"/>
-      <w:r>
-        <w:t xml:space="preserve"> legfontosabb eleme a </w:t>
-      </w:r>
-      <w:proofErr w:type="spellStart"/>
-      <w:r>
-        <w:t>graphics</w:t>
-      </w:r>
-      <w:proofErr w:type="spellEnd"/>
-      <w:r>
-        <w:t xml:space="preserve"> </w:t>
-      </w:r>
-      <w:proofErr w:type="spellStart"/>
-      <w:r>
-        <w:t>pipelinenal</w:t>
-      </w:r>
-      <w:proofErr w:type="spellEnd"/>
-      <w:r>
-        <w:t xml:space="preserve"> szemben a futtatási modularitása. Egy </w:t>
-      </w:r>
-      <w:proofErr w:type="spellStart"/>
-      <w:r>
-        <w:t>compute</w:t>
-      </w:r>
-      <w:proofErr w:type="spellEnd"/>
-      <w:r>
-        <w:t xml:space="preserve"> programnak két tere van</w:t>
+        <w:t xml:space="preserve"> ha a méretekre nem figyelünk, könnyen elcsúszhatun</w:t>
+      </w:r>
+      <w:r>
+        <w:t>k az adatátvitelkor és rosszul lesznek értelmezve az adataink. Az std430 elrendezést csak SSBO-nál lehet alkalmazni. Azonban mindkét elrendezésnél elvárt, hogy a teljes memória méret nagysága a vec4 többszöröse legyen.</w:t>
+      </w:r>
+    </w:p>
+    <w:p>
+      <w:r>
+        <w:t>A compute shader legfontosabb eleme a graphics pipelinenal szemben a futtatási modularitása. Egy compute programnak két tere van</w:t>
       </w:r>
       <w:r>
         <w:t>,</w:t>
       </w:r>
       <w:r>
-        <w:t xml:space="preserve"> amiben definiálni tudjuk, hogy hány alkalommal </w:t>
-      </w:r>
-      <w:proofErr w:type="spellStart"/>
-      <w:r>
-        <w:t>hívódjon</w:t>
-      </w:r>
-      <w:proofErr w:type="spellEnd"/>
-      <w:r>
-        <w:t xml:space="preserve"> meg a program, valamint egy hívásban hányszor fusson le a program. Ezeket </w:t>
-      </w:r>
-      <w:proofErr w:type="spellStart"/>
-      <w:r>
-        <w:t>work</w:t>
-      </w:r>
-      <w:proofErr w:type="spellEnd"/>
-      <w:r>
-        <w:t xml:space="preserve"> </w:t>
-      </w:r>
-      <w:proofErr w:type="spellStart"/>
-      <w:r>
-        <w:t>groupoknak</w:t>
-      </w:r>
-      <w:proofErr w:type="spellEnd"/>
-      <w:r>
-        <w:t xml:space="preserve">, valamint local </w:t>
-      </w:r>
-      <w:proofErr w:type="spellStart"/>
-      <w:r>
-        <w:t>invocationsnek</w:t>
-      </w:r>
-      <w:proofErr w:type="spellEnd"/>
-      <w:r>
-        <w:t xml:space="preserve"> nevezik.</w:t>
-      </w:r>
-    </w:p>
-    <w:p>
-      <w:r>
-        <w:t xml:space="preserve">A </w:t>
-      </w:r>
-      <w:proofErr w:type="spellStart"/>
-      <w:r>
-        <w:t>work</w:t>
-      </w:r>
-      <w:proofErr w:type="spellEnd"/>
-      <w:r>
-        <w:t xml:space="preserve"> </w:t>
-      </w:r>
-      <w:proofErr w:type="spellStart"/>
-      <w:r>
-        <w:t>group</w:t>
-      </w:r>
-      <w:proofErr w:type="spellEnd"/>
-      <w:r>
-        <w:t xml:space="preserve"> a legkisebb egység, amit a programozó hívni tud a gazda (CPU) oldalról. Ez egy 3 dimenziós tér, bármely dimenzió állítható 1-re, hogy 1, vagy 2 dimenzióban fusson a </w:t>
-      </w:r>
-      <w:proofErr w:type="spellStart"/>
-      <w:r>
-        <w:t>compute</w:t>
-      </w:r>
-      <w:proofErr w:type="spellEnd"/>
-      <w:r>
-        <w:t xml:space="preserve"> program.</w:t>
+        <w:t xml:space="preserve"> amiben definiálni tudjuk, hogy hány alkalommal hívódjon meg a program, valamint egy hívásban hányszor fusson le a program. Ezeket </w:t>
+      </w:r>
+      <w:r>
+        <w:t>work groupoknak, valamint local invocationsnek nevezik.</w:t>
+      </w:r>
+    </w:p>
+    <w:p>
+      <w:r>
+        <w:t>A work group a legkisebb egység, amit a programozó hívni tud a gazda (CPU) oldalról. Ez egy 3 dimenziós tér, bármely dimenzió állítható 1-re, hogy 1, vagy 2 dimenzióban fusson a compute program.</w:t>
       </w:r>
     </w:p>
     <w:p>
       <w:r>
         <w:lastRenderedPageBreak/>
-        <w:t xml:space="preserve">A </w:t>
-      </w:r>
-      <w:proofErr w:type="spellStart"/>
-      <w:r>
-        <w:t>work</w:t>
-      </w:r>
-      <w:proofErr w:type="spellEnd"/>
-      <w:r>
-        <w:t xml:space="preserve"> </w:t>
-      </w:r>
-      <w:proofErr w:type="spellStart"/>
-      <w:r>
-        <w:t>groupok</w:t>
-      </w:r>
-      <w:proofErr w:type="spellEnd"/>
-      <w:r>
-        <w:t xml:space="preserve"> futtatási sorrendje sztochasztikus, csak az biztosított, hogy le fognak futni.</w:t>
-      </w:r>
-    </w:p>
-    <w:p>
-      <w:r>
-        <w:t xml:space="preserve">A </w:t>
-      </w:r>
-      <w:proofErr w:type="spellStart"/>
-      <w:r>
-        <w:t>work</w:t>
-      </w:r>
-      <w:proofErr w:type="spellEnd"/>
-      <w:r>
-        <w:t xml:space="preserve"> </w:t>
-      </w:r>
-      <w:proofErr w:type="spellStart"/>
-      <w:r>
-        <w:t>groupok</w:t>
-      </w:r>
-      <w:proofErr w:type="spellEnd"/>
-      <w:r>
-        <w:t xml:space="preserve"> is felbonthatóak 3 dimenzióban. Ezt a belső, lokális koordinátarendszert nevezik local </w:t>
-      </w:r>
-      <w:proofErr w:type="spellStart"/>
-      <w:r>
-        <w:t>invocationsnek</w:t>
-      </w:r>
-      <w:proofErr w:type="spellEnd"/>
-      <w:r>
-        <w:t xml:space="preserve">, amivel azt határozhatjuk meg, hogy egy </w:t>
-      </w:r>
-      <w:proofErr w:type="spellStart"/>
-      <w:r>
-        <w:t>work</w:t>
-      </w:r>
-      <w:proofErr w:type="spellEnd"/>
-      <w:r>
-        <w:t xml:space="preserve"> </w:t>
-      </w:r>
-      <w:proofErr w:type="spellStart"/>
-      <w:r>
-        <w:t>dispatchben</w:t>
-      </w:r>
-      <w:proofErr w:type="spellEnd"/>
-      <w:r>
-        <w:t xml:space="preserve"> hányszor fusson le a program. A local </w:t>
-      </w:r>
-      <w:proofErr w:type="spellStart"/>
-      <w:r>
-        <w:t>invocationsnek</w:t>
-      </w:r>
-      <w:proofErr w:type="spellEnd"/>
-      <w:r>
-        <w:t xml:space="preserve"> is be lehet állítani bármelyik tengelyértékét 1-re, ha 1, vagy 2 dimenzióban szeretnénk csak dolgozni. Ezt az értéket a </w:t>
-      </w:r>
-      <w:proofErr w:type="spellStart"/>
-      <w:r>
-        <w:t>compute</w:t>
-      </w:r>
-      <w:proofErr w:type="spellEnd"/>
-      <w:r>
-        <w:t xml:space="preserve"> </w:t>
-      </w:r>
-      <w:proofErr w:type="spellStart"/>
-      <w:r>
-        <w:t>shaderben</w:t>
-      </w:r>
-      <w:proofErr w:type="spellEnd"/>
-      <w:r>
-        <w:t xml:space="preserve"> lehet beállítani.</w:t>
+        <w:t>A work groupok futtatási sorrendje sztochasztikus, csak az biztosított, hogy le fognak futni.</w:t>
+      </w:r>
+    </w:p>
+    <w:p>
+      <w:r>
+        <w:t>A work groupok is felbonthatóak 3 dimenzióban. Ezt a belső, lokális koordinátarendszert nevezik local invocationsnek, amivel azt határozhatjuk meg, hogy egy work dispatchben hányszor fusson le a program. A local invocationsnek is be lehet állítani bármelyik tengelyértékét 1-re, ha 1, vagy 2 dimenzióban szeretnénk csak dolgozni. Ezt az értéket a compute shaderben lehet beállítani.</w:t>
       </w:r>
       <w:r>
         <w:t xml:space="preserve"> </w:t>
@@ -4926,124 +3998,12 @@
     </w:p>
     <w:p>
       <w:r>
-        <w:t xml:space="preserve">Egy nagy különbség a két hívástípus között az, hogy míg local </w:t>
-      </w:r>
-      <w:proofErr w:type="spellStart"/>
-      <w:r>
-        <w:t>invocation-ök</w:t>
-      </w:r>
-      <w:proofErr w:type="spellEnd"/>
-      <w:r>
-        <w:t xml:space="preserve"> között a kommunikáció lehetséges azonos </w:t>
-      </w:r>
-      <w:proofErr w:type="spellStart"/>
-      <w:r>
-        <w:t>work</w:t>
-      </w:r>
-      <w:proofErr w:type="spellEnd"/>
-      <w:r>
-        <w:t xml:space="preserve"> </w:t>
-      </w:r>
-      <w:proofErr w:type="spellStart"/>
-      <w:r>
-        <w:t>groupokban</w:t>
-      </w:r>
-      <w:proofErr w:type="spellEnd"/>
-      <w:r>
-        <w:t xml:space="preserve">, addig különböző </w:t>
-      </w:r>
-      <w:proofErr w:type="spellStart"/>
-      <w:r>
-        <w:t>work</w:t>
-      </w:r>
-      <w:proofErr w:type="spellEnd"/>
-      <w:r>
-        <w:t xml:space="preserve"> </w:t>
-      </w:r>
-      <w:proofErr w:type="spellStart"/>
-      <w:r>
-        <w:t>groupok</w:t>
-      </w:r>
-      <w:proofErr w:type="spellEnd"/>
-      <w:r>
-        <w:t xml:space="preserve"> nem tudnak egymással kommunikálni.</w:t>
-      </w:r>
-    </w:p>
-    <w:p>
-      <w:r>
-        <w:t xml:space="preserve">A </w:t>
-      </w:r>
-      <w:proofErr w:type="spellStart"/>
-      <w:r>
-        <w:t>compute</w:t>
-      </w:r>
-      <w:proofErr w:type="spellEnd"/>
-      <w:r>
-        <w:t xml:space="preserve"> </w:t>
-      </w:r>
-      <w:proofErr w:type="spellStart"/>
-      <w:r>
-        <w:t>shader</w:t>
-      </w:r>
-      <w:proofErr w:type="spellEnd"/>
-      <w:r>
-        <w:t xml:space="preserve"> hívásmérete nem lehet bármely nagyságú. Ezeket az értékeket az </w:t>
-      </w:r>
-      <w:proofErr w:type="spellStart"/>
-      <w:r>
-        <w:t>OpenGL-től</w:t>
-      </w:r>
-      <w:proofErr w:type="spellEnd"/>
-      <w:r>
-        <w:t xml:space="preserve"> különböző </w:t>
-      </w:r>
-      <w:proofErr w:type="spellStart"/>
-      <w:r>
-        <w:t>macrok</w:t>
-      </w:r>
-      <w:proofErr w:type="spellEnd"/>
-      <w:r>
-        <w:t xml:space="preserve"> </w:t>
-      </w:r>
-      <w:proofErr w:type="spellStart"/>
-      <w:r>
-        <w:t>lekérezésével</w:t>
-      </w:r>
-      <w:proofErr w:type="spellEnd"/>
-      <w:r>
-        <w:t xml:space="preserve"> lehet megtudni. A </w:t>
-      </w:r>
-      <w:proofErr w:type="spellStart"/>
-      <w:r>
-        <w:t>work</w:t>
-      </w:r>
-      <w:proofErr w:type="spellEnd"/>
-      <w:r>
-        <w:t xml:space="preserve"> </w:t>
-      </w:r>
-      <w:proofErr w:type="spellStart"/>
-      <w:r>
-        <w:t>group</w:t>
-      </w:r>
-      <w:proofErr w:type="spellEnd"/>
-      <w:r>
-        <w:t xml:space="preserve"> méret maximális nagyságát a GL_MAX_COMPUTE_WORK_GROUP_COUNT-</w:t>
-      </w:r>
-      <w:proofErr w:type="spellStart"/>
-      <w:r>
-        <w:t>al</w:t>
-      </w:r>
-      <w:proofErr w:type="spellEnd"/>
-      <w:r>
-        <w:t xml:space="preserve"> lehet lekérdezni, míg a local </w:t>
-      </w:r>
-      <w:proofErr w:type="spellStart"/>
-      <w:r>
-        <w:t>size</w:t>
-      </w:r>
-      <w:proofErr w:type="spellEnd"/>
-      <w:r>
-        <w:t>-ot a GL_MAX_COMPUTE_WORK_GROUP_INVOCATIONS-el.</w:t>
+        <w:t>Egy nagy különbség a két hívástípus között az, hogy míg local invocation-ök között a kommunikáció lehetséges azonos work groupokban, addig különböző work groupok nem tudnak egymással kommunikálni.</w:t>
+      </w:r>
+    </w:p>
+    <w:p>
+      <w:r>
+        <w:t>A compute shader hívásmérete nem lehet bármely nagyságú. Ezeket az értékeket az OpenGL-től különböző macrok lekérezésével lehet megtudni. A work group méret maximális nagyságát a GL_MAX_COMPUTE_WORK_GROUP_COUNT-al lehet lekérdezni, míg a local size-ot a GL_MAX_COMPUTE_WORK_GROUP_INVOCATIONS-el.</w:t>
       </w:r>
     </w:p>
     <w:p>
@@ -5056,53 +4016,13 @@
     </w:p>
     <w:p>
       <w:r>
-        <w:t xml:space="preserve">Vektoralgebrai számításokra az </w:t>
-      </w:r>
-      <w:proofErr w:type="spellStart"/>
-      <w:r>
-        <w:t>OpenGL</w:t>
-      </w:r>
-      <w:proofErr w:type="spellEnd"/>
-      <w:r>
-        <w:t xml:space="preserve"> </w:t>
-      </w:r>
-      <w:proofErr w:type="spellStart"/>
-      <w:r>
-        <w:t>Mathematics</w:t>
-      </w:r>
-      <w:proofErr w:type="spellEnd"/>
-      <w:r>
-        <w:t xml:space="preserve"> (GLM) C++ könyvtárat alkalmaztam. Ennek a könyvtárnak a segítségével végeztem vektor műveleteket, mint például vektor </w:t>
+        <w:t xml:space="preserve">Vektoralgebrai számításokra az OpenGL Mathematics (GLM) C++ könyvtárat alkalmaztam. Ennek a könyvtárnak a segítségével végeztem vektor műveleteket, mint például vektor </w:t>
       </w:r>
       <w:r>
         <w:t>aritmetika</w:t>
       </w:r>
       <w:r>
-        <w:t xml:space="preserve"> vagy vektor hossz számítás. A könyvtárnak van </w:t>
-      </w:r>
-      <w:proofErr w:type="spellStart"/>
-      <w:r>
-        <w:t>OpenGL</w:t>
-      </w:r>
-      <w:proofErr w:type="spellEnd"/>
-      <w:r>
-        <w:t xml:space="preserve"> támogatottsága, így könnyen lehetett az </w:t>
-      </w:r>
-      <w:proofErr w:type="spellStart"/>
-      <w:r>
-        <w:t>OpenGL</w:t>
-      </w:r>
-      <w:proofErr w:type="spellEnd"/>
-      <w:r>
-        <w:t xml:space="preserve">-ben definiált vec4 memória méretű </w:t>
-      </w:r>
-      <w:proofErr w:type="spellStart"/>
-      <w:r>
-        <w:t>glm</w:t>
-      </w:r>
-      <w:proofErr w:type="spellEnd"/>
-      <w:r>
-        <w:t>::vec4 változót létrehozni, így megkönnyítve az adatátvitelt a két egység között.</w:t>
+        <w:t xml:space="preserve"> vagy vektor hossz számítás. A könyvtárnak van OpenGL támogatottsága, így könnyen lehetett az OpenGL-ben definiált vec4 memória méretű glm::vec4 változót létrehozni, így megkönnyítve az adatátvitelt a két egység között.</w:t>
       </w:r>
     </w:p>
     <w:p>
@@ -5115,31 +4035,7 @@
     </w:p>
     <w:p>
       <w:r>
-        <w:t xml:space="preserve">A fejlesztés során kritikus volt gyorsan váltani futtatási módok között, akár egy-egy paraméter változtatásával. Erre nagy segítséget nyújtott az </w:t>
-      </w:r>
-      <w:proofErr w:type="spellStart"/>
-      <w:r>
-        <w:t>ImGui</w:t>
-      </w:r>
-      <w:proofErr w:type="spellEnd"/>
-      <w:r>
-        <w:t xml:space="preserve"> C++ könyvtár, aminek a segítségével könnyen tudtam futásidőben állítani a szimuláció paramétereit. Ennek a könyvtárnak is van </w:t>
-      </w:r>
-      <w:proofErr w:type="spellStart"/>
-      <w:r>
-        <w:t>OpenGL</w:t>
-      </w:r>
-      <w:proofErr w:type="spellEnd"/>
-      <w:r>
-        <w:t xml:space="preserve"> </w:t>
-      </w:r>
-      <w:proofErr w:type="spellStart"/>
-      <w:r>
-        <w:t>implenetációja</w:t>
-      </w:r>
-      <w:proofErr w:type="spellEnd"/>
-      <w:r>
-        <w:t>, úgyhogy kisebb nehézségek nélkül is integrálni tudtam a projektembe.</w:t>
+        <w:t>A fejlesztés során kritikus volt gyorsan váltani futtatási módok között, akár egy-egy paraméter változtatásával. Erre nagy segítséget nyújtott az ImGui C++ könyvtár, aminek a segítségével könnyen tudtam futásidőben állítani a szimuláció paramétereit. Ennek a könyvtárnak is van OpenGL implenetációja, úgyhogy kisebb nehézségek nélkül is integrálni tudtam a projektembe.</w:t>
       </w:r>
     </w:p>
     <w:p/>
@@ -5271,74 +4167,10 @@
       </w:r>
       <w:bookmarkEnd w:id="8"/>
       <w:r>
-        <w:t xml:space="preserve">: A </w:t>
-      </w:r>
-      <w:proofErr w:type="spellStart"/>
-      <w:r>
-        <w:t>work</w:t>
-      </w:r>
-      <w:proofErr w:type="spellEnd"/>
-      <w:r>
-        <w:t xml:space="preserve"> </w:t>
-      </w:r>
-      <w:proofErr w:type="spellStart"/>
-      <w:r>
-        <w:t>group</w:t>
-      </w:r>
-      <w:proofErr w:type="spellEnd"/>
-      <w:r>
-        <w:t xml:space="preserve"> térbeli elrendezése látható a felső ábrán, míg az alsó ábrán a local </w:t>
-      </w:r>
-      <w:proofErr w:type="spellStart"/>
-      <w:r>
-        <w:t>invocations</w:t>
-      </w:r>
-      <w:proofErr w:type="spellEnd"/>
-      <w:r>
-        <w:t xml:space="preserve">, ami szintén a térbe teríthető, valamint </w:t>
-      </w:r>
-      <w:r>
-        <w:t xml:space="preserve">látható, hogy a local </w:t>
-      </w:r>
-      <w:proofErr w:type="spellStart"/>
-      <w:r>
-        <w:t>invocations-zel</w:t>
-      </w:r>
-      <w:proofErr w:type="spellEnd"/>
-      <w:r>
-        <w:t xml:space="preserve"> azt mondjuk meg, hogy egy </w:t>
-      </w:r>
-      <w:proofErr w:type="spellStart"/>
-      <w:r>
-        <w:t>work</w:t>
-      </w:r>
-      <w:proofErr w:type="spellEnd"/>
-      <w:r>
-        <w:t xml:space="preserve"> </w:t>
-      </w:r>
-      <w:proofErr w:type="spellStart"/>
-      <w:r>
-        <w:t>groupbeli</w:t>
-      </w:r>
-      <w:proofErr w:type="spellEnd"/>
-      <w:r>
-        <w:t xml:space="preserve"> elemben hányszor fusson a </w:t>
-      </w:r>
-      <w:proofErr w:type="spellStart"/>
-      <w:r>
-        <w:t>compute</w:t>
-      </w:r>
-      <w:proofErr w:type="spellEnd"/>
-      <w:r>
-        <w:t xml:space="preserve"> </w:t>
-      </w:r>
-      <w:proofErr w:type="spellStart"/>
-      <w:r>
-        <w:t>shader</w:t>
-      </w:r>
-      <w:proofErr w:type="spellEnd"/>
-      <w:r>
-        <w:t>.</w:t>
+        <w:t xml:space="preserve">: A work group térbeli elrendezése látható a felső ábrán, míg az alsó ábrán a local invocations, ami szintén a térbe teríthető, valamint </w:t>
+      </w:r>
+      <w:r>
+        <w:t>látható, hogy a local invocations-zel azt mondjuk meg, hogy egy work groupbeli elemben hányszor fusson a compute shader.</w:t>
       </w:r>
     </w:p>
     <w:p>
@@ -5351,67 +4183,11 @@
     </w:p>
     <w:p>
       <w:r>
-        <w:t xml:space="preserve">A fő fejlesztőkörnyezetként a Microsoft által kiadott Microsoft Visual </w:t>
-      </w:r>
-      <w:proofErr w:type="spellStart"/>
-      <w:r>
-        <w:t>Studio</w:t>
-      </w:r>
-      <w:proofErr w:type="spellEnd"/>
-      <w:r>
-        <w:t xml:space="preserve"> 2022-es változatát használtam, mivel ebben nagyobb C++ projektet fordítása, linkelése viszonylag egyszerű feladat a projekt beállítások miatt, valamint hasznos tesztelő </w:t>
+        <w:t xml:space="preserve">A fő fejlesztőkörnyezetként a Microsoft által kiadott Microsoft Visual Studio 2022-es változatát használtam, mivel ebben nagyobb C++ projektet fordítása, linkelése viszonylag egyszerű feladat a projekt beállítások miatt, valamint hasznos tesztelő </w:t>
       </w:r>
       <w:r>
         <w:lastRenderedPageBreak/>
-        <w:t xml:space="preserve">eszközök is rendelkezésre állnak a Visual </w:t>
-      </w:r>
-      <w:proofErr w:type="spellStart"/>
-      <w:r>
-        <w:t>Studioban</w:t>
-      </w:r>
-      <w:proofErr w:type="spellEnd"/>
-      <w:r>
-        <w:t xml:space="preserve">, mint például CPU </w:t>
-      </w:r>
-      <w:proofErr w:type="spellStart"/>
-      <w:r>
-        <w:t>usage</w:t>
-      </w:r>
-      <w:proofErr w:type="spellEnd"/>
-      <w:r>
-        <w:t xml:space="preserve"> mérő, ami a program CPU kihasználtságát mutatja, valamint a </w:t>
-      </w:r>
-      <w:proofErr w:type="spellStart"/>
-      <w:r>
-        <w:t>Process</w:t>
-      </w:r>
-      <w:proofErr w:type="spellEnd"/>
-      <w:r>
-        <w:t xml:space="preserve"> </w:t>
-      </w:r>
-      <w:proofErr w:type="spellStart"/>
-      <w:r>
-        <w:t>Memory</w:t>
-      </w:r>
-      <w:proofErr w:type="spellEnd"/>
-      <w:r>
-        <w:t xml:space="preserve">, ami azt mutatja, hogy mennyi memóriát használ a programunk. A </w:t>
-      </w:r>
-      <w:proofErr w:type="spellStart"/>
-      <w:r>
-        <w:t>Process</w:t>
-      </w:r>
-      <w:proofErr w:type="spellEnd"/>
-      <w:r>
-        <w:t xml:space="preserve"> </w:t>
-      </w:r>
-      <w:proofErr w:type="spellStart"/>
-      <w:r>
-        <w:t>Memory</w:t>
-      </w:r>
-      <w:proofErr w:type="spellEnd"/>
-      <w:r>
-        <w:t xml:space="preserve"> kifejezetten hasznos memória szivárgás észleléséhez.</w:t>
+        <w:t>eszközök is rendelkezésre állnak a Visual Studioban, mint például CPU usage mérő, ami a program CPU kihasználtságát mutatja, valamint a Process Memory, ami azt mutatja, hogy mennyi memóriát használ a programunk. A Process Memory kifejezetten hasznos memória szivárgás észleléséhez.</w:t>
       </w:r>
     </w:p>
     <w:p>
@@ -5448,101 +4224,52 @@
         <w:pStyle w:val="Kd"/>
       </w:pPr>
       <w:r>
-        <w:t>├───</w:t>
-      </w:r>
-      <w:proofErr w:type="spellStart"/>
-      <w:r>
-        <w:t>graphics</w:t>
-      </w:r>
-      <w:proofErr w:type="spellEnd"/>
+        <w:t>├───graphics</w:t>
+      </w:r>
     </w:p>
     <w:p>
       <w:pPr>
         <w:pStyle w:val="Kd"/>
       </w:pPr>
       <w:r>
-        <w:t>├───</w:t>
-      </w:r>
-      <w:proofErr w:type="spellStart"/>
-      <w:r>
-        <w:t>helperFunctions</w:t>
-      </w:r>
-      <w:proofErr w:type="spellEnd"/>
+        <w:t>├───helperFunctions</w:t>
+      </w:r>
     </w:p>
     <w:p>
       <w:pPr>
         <w:pStyle w:val="Kd"/>
       </w:pPr>
       <w:r>
-        <w:t>└───</w:t>
-      </w:r>
-      <w:proofErr w:type="spellStart"/>
-      <w:r>
-        <w:t>monteCarlo</w:t>
-      </w:r>
-      <w:proofErr w:type="spellEnd"/>
+        <w:t>└───monteCarlo</w:t>
+      </w:r>
     </w:p>
     <w:p>
       <w:pPr>
         <w:pStyle w:val="Kd"/>
       </w:pPr>
       <w:r>
-        <w:t xml:space="preserve">    ├───</w:t>
-      </w:r>
-      <w:proofErr w:type="spellStart"/>
-      <w:r>
-        <w:t>BoundingVH</w:t>
-      </w:r>
-      <w:proofErr w:type="spellEnd"/>
+        <w:t xml:space="preserve">    ├───BoundingVH</w:t>
+      </w:r>
     </w:p>
     <w:p>
       <w:pPr>
         <w:pStyle w:val="Kd"/>
       </w:pPr>
       <w:r>
-        <w:t xml:space="preserve">    └───</w:t>
-      </w:r>
-      <w:proofErr w:type="spellStart"/>
-      <w:r>
-        <w:t>shaders</w:t>
-      </w:r>
-      <w:proofErr w:type="spellEnd"/>
+        <w:t xml:space="preserve">    └───shaders</w:t>
+      </w:r>
     </w:p>
     <w:p>
       <w:pPr>
         <w:pStyle w:val="Heading4"/>
       </w:pPr>
       <w:r>
-        <w:t xml:space="preserve">A </w:t>
-      </w:r>
-      <w:proofErr w:type="spellStart"/>
-      <w:r>
-        <w:t>src</w:t>
-      </w:r>
-      <w:proofErr w:type="spellEnd"/>
-      <w:r>
-        <w:t>/</w:t>
-      </w:r>
-      <w:proofErr w:type="spellStart"/>
-      <w:r>
-        <w:t>graphics</w:t>
-      </w:r>
-      <w:proofErr w:type="spellEnd"/>
-      <w:r>
-        <w:t xml:space="preserve"> mappa</w:t>
-      </w:r>
-    </w:p>
-    <w:p>
-      <w:r>
-        <w:t xml:space="preserve">Ebben a mappában található az </w:t>
-      </w:r>
-      <w:proofErr w:type="spellStart"/>
-      <w:r>
-        <w:t>Application</w:t>
-      </w:r>
-      <w:proofErr w:type="spellEnd"/>
-      <w:r>
-        <w:t xml:space="preserve"> osztály, amelyen keresztül használható a program. Ez tekinthető a program interfészének. Itt van implementálva az ablakkezelés, valamint ez a kapcsolat a külvilág és a Monte Carlo algoritmust implementáló osztályok között. Ennek az osztálynak a létrehozásával tudjuk meghatározni az ablak paramétereit, mekkora legyen, mi legyen a neve, itt tudunk </w:t>
+        <w:t>A src/graphics mappa</w:t>
+      </w:r>
+    </w:p>
+    <w:p>
+      <w:r>
+        <w:t xml:space="preserve">Ebben a mappában található az Application osztály, amelyen keresztül használható a program. Ez tekinthető a program interfészének. Itt van implementálva az ablakkezelés, valamint ez a kapcsolat a külvilág és a Monte Carlo algoritmust implementáló osztályok között. Ennek az osztálynak a létrehozásával tudjuk meghatározni az ablak paramétereit, mekkora legyen, mi legyen a neve, itt tudunk </w:t>
       </w:r>
       <w:r>
         <w:t>generáltatni bemeneti fájlokat a Monte Carlo programnak, valamint itt tudjuk megmondani, hogy milyen fájlt olvasson be a program.</w:t>
@@ -5554,45 +4281,13 @@
       </w:pPr>
       <w:bookmarkStart w:id="9" w:name="_Ref183622401"/>
       <w:r>
-        <w:t xml:space="preserve">A </w:t>
-      </w:r>
-      <w:proofErr w:type="spellStart"/>
-      <w:r>
-        <w:t>src</w:t>
-      </w:r>
-      <w:proofErr w:type="spellEnd"/>
-      <w:r>
-        <w:t>/</w:t>
-      </w:r>
-      <w:proofErr w:type="spellStart"/>
-      <w:r>
-        <w:t>helperFunctions</w:t>
-      </w:r>
-      <w:proofErr w:type="spellEnd"/>
-      <w:r>
-        <w:t xml:space="preserve"> mappa</w:t>
+        <w:t>A src/helperFunctions mappa</w:t>
       </w:r>
       <w:bookmarkEnd w:id="9"/>
     </w:p>
     <w:p>
       <w:r>
-        <w:t xml:space="preserve">Ebben a mappában egy segédfüggvényeket tartalmazó osztály található </w:t>
-      </w:r>
-      <w:proofErr w:type="spellStart"/>
-      <w:r>
-        <w:t>helperFunctions</w:t>
-      </w:r>
-      <w:proofErr w:type="spellEnd"/>
-      <w:r>
-        <w:t xml:space="preserve"> néven, ami statikus függvényeket tartalmaz. Itt található két pont közötti egyenest generáló, </w:t>
-      </w:r>
-      <w:proofErr w:type="spellStart"/>
-      <w:r>
-        <w:t>bézier</w:t>
-      </w:r>
-      <w:proofErr w:type="spellEnd"/>
-      <w:r>
-        <w:t xml:space="preserve"> görbét </w:t>
+        <w:t xml:space="preserve">Ebben a mappában egy segédfüggvényeket tartalmazó osztály található helperFunctions néven, ami statikus függvényeket tartalmaz. Itt található két pont közötti egyenest generáló, bézier görbét </w:t>
       </w:r>
       <w:r>
         <w:rPr>
@@ -5601,36 +4296,12 @@
         <w:t>hivatkozás</w:t>
       </w:r>
       <w:r>
-        <w:t xml:space="preserve"> generáló függvény, valamint egy </w:t>
-      </w:r>
-      <w:proofErr w:type="spellStart"/>
-      <w:r>
-        <w:t>string</w:t>
-      </w:r>
-      <w:proofErr w:type="spellEnd"/>
-      <w:r>
-        <w:t xml:space="preserve"> </w:t>
-      </w:r>
-      <w:proofErr w:type="spellStart"/>
-      <w:r>
-        <w:t>split</w:t>
-      </w:r>
-      <w:proofErr w:type="spellEnd"/>
-      <w:r>
-        <w:t xml:space="preserve"> függvény.</w:t>
-      </w:r>
-    </w:p>
-    <w:p>
-      <w:r>
-        <w:t xml:space="preserve">Azért, hogy a projekten belül osztály </w:t>
-      </w:r>
-      <w:proofErr w:type="spellStart"/>
-      <w:r>
-        <w:t>példányosítás</w:t>
-      </w:r>
-      <w:proofErr w:type="spellEnd"/>
-      <w:r>
-        <w:t xml:space="preserve"> nélkül tudjam használni ezeket a segéd függvényeket, ezért statikusan definiáltam őket.</w:t>
+        <w:t xml:space="preserve"> generáló függvény, valamint egy string split függvény.</w:t>
+      </w:r>
+    </w:p>
+    <w:p>
+      <w:r>
+        <w:t>Azért, hogy a projekten belül osztály példányosítás nélkül tudjam használni ezeket a segéd függvényeket, ezért statikusan definiáltam őket.</w:t>
       </w:r>
     </w:p>
     <w:p>
@@ -5639,31 +4310,13 @@
       </w:pPr>
       <w:r>
         <w:lastRenderedPageBreak/>
-        <w:t xml:space="preserve">A </w:t>
-      </w:r>
-      <w:proofErr w:type="spellStart"/>
-      <w:r>
-        <w:t>src</w:t>
-      </w:r>
-      <w:proofErr w:type="spellEnd"/>
-      <w:r>
-        <w:t>/</w:t>
-      </w:r>
-      <w:proofErr w:type="spellStart"/>
-      <w:r>
-        <w:t>monteCarlo</w:t>
-      </w:r>
-      <w:proofErr w:type="spellEnd"/>
-      <w:r>
-        <w:t>/</w:t>
-      </w:r>
-      <w:proofErr w:type="spellStart"/>
-      <w:r>
-        <w:t>BoundingVH</w:t>
-      </w:r>
-      <w:proofErr w:type="spellEnd"/>
-      <w:r>
-        <w:t xml:space="preserve"> mappa</w:t>
+        <w:t>A src/</w:t>
+      </w:r>
+      <w:r>
+        <w:t>monteCarlo/</w:t>
+      </w:r>
+      <w:r>
+        <w:t>BoundingVH mappa</w:t>
       </w:r>
     </w:p>
     <w:p>
@@ -5673,31 +4326,7 @@
         </w:rPr>
       </w:pPr>
       <w:r>
-        <w:t xml:space="preserve">Ez a mappa tartalmazza a </w:t>
-      </w:r>
-      <w:proofErr w:type="spellStart"/>
-      <w:r>
-        <w:t>Bounding</w:t>
-      </w:r>
-      <w:proofErr w:type="spellEnd"/>
-      <w:r>
-        <w:t xml:space="preserve"> </w:t>
-      </w:r>
-      <w:proofErr w:type="spellStart"/>
-      <w:r>
-        <w:t>Volume</w:t>
-      </w:r>
-      <w:proofErr w:type="spellEnd"/>
-      <w:r>
-        <w:t xml:space="preserve"> </w:t>
-      </w:r>
-      <w:proofErr w:type="spellStart"/>
-      <w:r>
-        <w:t>Hierarchy</w:t>
-      </w:r>
-      <w:proofErr w:type="spellEnd"/>
-      <w:r>
-        <w:t xml:space="preserve">-t (BVH), ami egy segítőstruktúra a szimuláció gyorsabb futtatásához. </w:t>
+        <w:t xml:space="preserve">Ez a mappa tartalmazza a Bounding Volume Hierarchy-t (BVH), ami egy segítőstruktúra a szimuláció gyorsabb futtatásához. </w:t>
       </w:r>
       <w:r>
         <w:rPr>
@@ -5711,39 +4340,7 @@
         <w:t>A</w:t>
       </w:r>
       <w:r>
-        <w:t xml:space="preserve"> </w:t>
-      </w:r>
-      <w:proofErr w:type="spellStart"/>
-      <w:r>
-        <w:t>BoundingVH</w:t>
-      </w:r>
-      <w:proofErr w:type="spellEnd"/>
-      <w:r>
-        <w:t xml:space="preserve"> osztály tartalmazza az implementációját a BVH-</w:t>
-      </w:r>
-      <w:proofErr w:type="spellStart"/>
-      <w:r>
-        <w:t>nak</w:t>
-      </w:r>
-      <w:proofErr w:type="spellEnd"/>
-      <w:r>
-        <w:t xml:space="preserve">, míg a </w:t>
-      </w:r>
-      <w:proofErr w:type="spellStart"/>
-      <w:r>
-        <w:t>BVHHelper</w:t>
-      </w:r>
-      <w:proofErr w:type="spellEnd"/>
-      <w:r>
-        <w:t xml:space="preserve"> fájl azokat a segéd struktúrákat tartalmazza, amiknek a segítségével könnyedén át lehet küldeni az adatokat a GPU-</w:t>
-      </w:r>
-      <w:proofErr w:type="spellStart"/>
-      <w:r>
-        <w:t>ra</w:t>
-      </w:r>
-      <w:proofErr w:type="spellEnd"/>
-      <w:r>
-        <w:t>.</w:t>
+        <w:t xml:space="preserve"> BoundingVH osztály tartalmazza az implementációját a BVH-nak, míg a BVHHelper fájl azokat a segéd struktúrákat tartalmazza, amiknek a segítségével könnyedén át lehet küldeni az adatokat a GPU-ra.</w:t>
       </w:r>
     </w:p>
     <w:p>
@@ -5751,76 +4348,12 @@
         <w:pStyle w:val="Heading4"/>
       </w:pPr>
       <w:r>
-        <w:t xml:space="preserve">A </w:t>
-      </w:r>
-      <w:proofErr w:type="spellStart"/>
-      <w:r>
-        <w:t>src</w:t>
-      </w:r>
-      <w:proofErr w:type="spellEnd"/>
-      <w:r>
-        <w:t>/</w:t>
-      </w:r>
-      <w:proofErr w:type="spellStart"/>
-      <w:r>
-        <w:t>monteCarlo</w:t>
-      </w:r>
-      <w:proofErr w:type="spellEnd"/>
-      <w:r>
-        <w:t>/</w:t>
-      </w:r>
-      <w:proofErr w:type="spellStart"/>
-      <w:r>
-        <w:t>shaders</w:t>
-      </w:r>
-      <w:proofErr w:type="spellEnd"/>
-      <w:r>
-        <w:t xml:space="preserve"> mappa</w:t>
-      </w:r>
-    </w:p>
-    <w:p>
-      <w:r>
-        <w:t xml:space="preserve">Itt találhatóak a GLSL kódok, amik a GPU-n futnak. Itt vannak a </w:t>
-      </w:r>
-      <w:proofErr w:type="spellStart"/>
-      <w:r>
-        <w:t>fragment</w:t>
-      </w:r>
-      <w:proofErr w:type="spellEnd"/>
-      <w:r>
-        <w:t xml:space="preserve">, </w:t>
-      </w:r>
-      <w:proofErr w:type="spellStart"/>
-      <w:r>
-        <w:t>vertex</w:t>
-      </w:r>
-      <w:proofErr w:type="spellEnd"/>
-      <w:r>
-        <w:t xml:space="preserve"> </w:t>
-      </w:r>
-      <w:proofErr w:type="spellStart"/>
-      <w:r>
-        <w:t>shaderek</w:t>
-      </w:r>
-      <w:proofErr w:type="spellEnd"/>
-      <w:r>
-        <w:t xml:space="preserve">, valamint a </w:t>
-      </w:r>
-      <w:proofErr w:type="spellStart"/>
-      <w:r>
-        <w:t>compute</w:t>
-      </w:r>
-      <w:proofErr w:type="spellEnd"/>
-      <w:r>
-        <w:t xml:space="preserve"> </w:t>
-      </w:r>
-      <w:proofErr w:type="spellStart"/>
-      <w:r>
-        <w:t>shader</w:t>
-      </w:r>
-      <w:proofErr w:type="spellEnd"/>
-      <w:r>
-        <w:t xml:space="preserve"> is itt található.</w:t>
+        <w:t>A src/monteCarlo/shaders mappa</w:t>
+      </w:r>
+    </w:p>
+    <w:p>
+      <w:r>
+        <w:t>Itt találhatóak a GLSL kódok, amik a GPU-n futnak. Itt vannak a fragment, vertex shaderek, valamint a compute shader is itt található.</w:t>
       </w:r>
     </w:p>
     <w:p>
@@ -5828,23 +4361,7 @@
         <w:pStyle w:val="Heading4"/>
       </w:pPr>
       <w:r>
-        <w:t xml:space="preserve">A </w:t>
-      </w:r>
-      <w:proofErr w:type="spellStart"/>
-      <w:r>
-        <w:t>src</w:t>
-      </w:r>
-      <w:proofErr w:type="spellEnd"/>
-      <w:r>
-        <w:t>/</w:t>
-      </w:r>
-      <w:proofErr w:type="spellStart"/>
-      <w:r>
-        <w:t>monteCarlo</w:t>
-      </w:r>
-      <w:proofErr w:type="spellEnd"/>
-      <w:r>
-        <w:t xml:space="preserve"> mappa</w:t>
+        <w:t>A src/monteCarlo mappa</w:t>
       </w:r>
     </w:p>
     <w:p>
@@ -5854,28 +4371,12 @@
     </w:p>
     <w:p>
       <w:r>
-        <w:t xml:space="preserve">Itt található a </w:t>
-      </w:r>
-      <w:proofErr w:type="spellStart"/>
-      <w:r>
-        <w:t>VertexAttrib</w:t>
-      </w:r>
-      <w:proofErr w:type="spellEnd"/>
-      <w:r>
-        <w:t xml:space="preserve"> struktúra, amivel egy peremértéket reprezentálok. Ez tartalmaz egy koordinátát, valamint egy peremérték változót.</w:t>
-      </w:r>
-    </w:p>
-    <w:p>
-      <w:r>
-        <w:t xml:space="preserve">A </w:t>
-      </w:r>
-      <w:proofErr w:type="spellStart"/>
-      <w:r>
-        <w:t>MonteCarloParams</w:t>
-      </w:r>
-      <w:proofErr w:type="spellEnd"/>
-      <w:r>
-        <w:t xml:space="preserve"> fájl tartalmazza a szimuláció paramétereit, hány sétát indítson a szimuláció egy pontból, mekkora legyen az </w:t>
+        <w:t>Itt található a VertexAttrib struktúra, amivel egy peremértéket reprezentálok. Ez tartalmaz egy koordinátát, valamint egy peremérték változót.</w:t>
+      </w:r>
+    </w:p>
+    <w:p>
+      <w:r>
+        <w:t xml:space="preserve">A MonteCarloParams fájl tartalmazza a szimuláció paramétereit, hány sétát indítson a szimuláció egy pontból, mekkora legyen az </w:t>
       </w:r>
       <m:oMath>
         <m:r>
@@ -5886,23 +4387,7 @@
         </m:r>
       </m:oMath>
       <w:r>
-        <w:t xml:space="preserve">, hány iteráció után álljon le egy séta, valamint, hogy pontosan hány perempont található a szimulációban. Ez a fájl tartalmazza az </w:t>
-      </w:r>
-      <w:proofErr w:type="spellStart"/>
-      <w:r>
-        <w:t>AlgorithmOpts</w:t>
-      </w:r>
-      <w:proofErr w:type="spellEnd"/>
-      <w:r>
-        <w:t xml:space="preserve"> struktúrát is, amiben azt tudjuk megadni, hogy BVH-</w:t>
-      </w:r>
-      <w:proofErr w:type="spellStart"/>
-      <w:r>
-        <w:t>val</w:t>
-      </w:r>
-      <w:proofErr w:type="spellEnd"/>
-      <w:r>
-        <w:t xml:space="preserve"> </w:t>
+        <w:t xml:space="preserve">, hány iteráció után álljon le egy séta, valamint, hogy pontosan hány perempont található a szimulációban. Ez a fájl tartalmazza az AlgorithmOpts struktúrát is, amiben azt tudjuk megadni, hogy BVH-val </w:t>
       </w:r>
       <w:r>
         <w:rPr>
@@ -5922,23 +4407,17 @@
         <w:t>felelős</w:t>
       </w:r>
       <w:r>
-        <w:t xml:space="preserve"> a Monte Carlo módszer CPU oldali menedzseléséért. Innen hívódnak meg a </w:t>
-      </w:r>
-      <w:proofErr w:type="spellStart"/>
-      <w:r>
-        <w:t>compute</w:t>
-      </w:r>
-      <w:proofErr w:type="spellEnd"/>
-      <w:r>
-        <w:t xml:space="preserve"> </w:t>
-      </w:r>
-      <w:proofErr w:type="spellStart"/>
-      <w:r>
-        <w:t>dispatchek</w:t>
-      </w:r>
-      <w:proofErr w:type="spellEnd"/>
-      <w:r>
-        <w:t>, itt generálódik a BVH, itt állítódnak be a paraméterek a sikeres szimuláció futtatáshoz.</w:t>
+        <w:t xml:space="preserve"> a Monte Carlo módszer CPU oldali menedzseléséért. Innen hívódnak meg a compute dispatchek, itt generálódik a BVH, itt állítódnak be a paraméterek a sikeres szimuláció futtatáshoz.</w:t>
+      </w:r>
+    </w:p>
+    <w:p>
+      <w:pPr>
+        <w:spacing w:after="0" w:line="240" w:lineRule="auto"/>
+        <w:ind w:firstLine="0"/>
+        <w:jc w:val="left"/>
+      </w:pPr>
+      <w:r>
+        <w:br w:type="page"/>
       </w:r>
     </w:p>
     <w:p>
@@ -5946,20 +4425,13 @@
         <w:pStyle w:val="Heading4"/>
       </w:pPr>
       <w:r>
+        <w:lastRenderedPageBreak/>
         <w:t>Adatbevitel</w:t>
       </w:r>
     </w:p>
     <w:p>
       <w:r>
-        <w:t xml:space="preserve">Mivel a program azonos elvre épülő adatokat </w:t>
-      </w:r>
-      <w:proofErr w:type="spellStart"/>
-      <w:r>
-        <w:t>dolgoz</w:t>
-      </w:r>
-      <w:proofErr w:type="spellEnd"/>
-      <w:r>
-        <w:t xml:space="preserve"> fel, ezért egy egységes fájlformátumot definiáltam, aminek a követésével lehet peremhelyeket és azok értékét átadni a programnak.  A programnak egy fájl nevet és elérési útját kell megadni, ami a következő módon van strukturálva: </w:t>
+        <w:t xml:space="preserve">Mivel a program azonos elvre épülő adatokat dolgoz fel, ezért egy egységes fájlformátumot definiáltam, aminek a követésével lehet peremhelyeket és azok értékét átadni a programnak.  A programnak egy fájl nevet és elérési útját kell megadni, ami a következő módon van strukturálva: </w:t>
       </w:r>
     </w:p>
     <w:p>
@@ -5971,15 +4443,7 @@
         </w:numPr>
       </w:pPr>
       <w:r>
-        <w:t>&lt;hány dimenzióban van megadva a pozíció [2-4]&gt;&lt;</w:t>
-      </w:r>
-      <w:proofErr w:type="spellStart"/>
-      <w:r>
-        <w:t>space</w:t>
-      </w:r>
-      <w:proofErr w:type="spellEnd"/>
-      <w:r>
-        <w:t>&gt;&lt;a peremérték hány dimenzióban van megadva [1-4]&gt;</w:t>
+        <w:t>&lt;hány dimenzióban van megadva a pozíció [2-4]&gt;&lt;space&gt;&lt;a peremérték hány dimenzióban van megadva [1-4]&gt;</w:t>
       </w:r>
     </w:p>
     <w:p>
@@ -5991,16 +4455,7 @@
         </w:numPr>
       </w:pPr>
       <w:r>
-        <w:lastRenderedPageBreak/>
-        <w:t>[&lt;karakter elválasztó, ami az értékeket elválasztja&gt;&lt;</w:t>
-      </w:r>
-      <w:proofErr w:type="spellStart"/>
-      <w:r>
-        <w:t>space</w:t>
-      </w:r>
-      <w:proofErr w:type="spellEnd"/>
-      <w:r>
-        <w:t>&gt;&lt;karakter, ami elválasztja a pozícióleíró értékeket, a peremérték leíró értékektől&gt;]</w:t>
+        <w:t>[&lt;karakter elválasztó, ami az értékeket elválasztja&gt;&lt;space&gt;&lt;karakter, ami elválasztja a pozícióleíró értékeket, a peremérték leíró értékektől&gt;]</w:t>
       </w:r>
     </w:p>
     <w:p>
@@ -6034,21 +4489,7 @@
     </w:p>
     <w:p>
       <w:r>
-        <w:t xml:space="preserve">A fájl beolvasásához egy általános </w:t>
-      </w:r>
-      <w:proofErr w:type="spellStart"/>
-      <w:r>
-        <w:t>string</w:t>
-      </w:r>
-      <w:proofErr w:type="spellEnd"/>
-      <w:r>
-        <w:t xml:space="preserve"> </w:t>
-      </w:r>
-      <w:r>
-        <w:t>feldolgozó</w:t>
-      </w:r>
-      <w:r>
-        <w:t xml:space="preserve"> függvényt hoztam létre, ami más nyelvekben alapból beépített függvény, azonban a C++-ban a programozónak kell létrehoznia. (</w:t>
+        <w:t>A fájl beolvasásához egy általános string feldolgozó függvényt hoztam létre, ami más nyelvekben alapból beépített függvény, azonban a C++-ban a programozónak kell létrehoznia. (</w:t>
       </w:r>
       <w:r>
         <w:fldChar w:fldCharType="begin"/>
@@ -6060,51 +4501,13 @@
         <w:fldChar w:fldCharType="separate"/>
       </w:r>
       <w:r>
-        <w:t>3.2.</w:t>
-      </w:r>
-      <w:r>
-        <w:t>1</w:t>
-      </w:r>
-      <w:r>
-        <w:t>.2</w:t>
+        <w:t>3.2.1.2</w:t>
       </w:r>
       <w:r>
         <w:fldChar w:fldCharType="end"/>
       </w:r>
       <w:r>
-        <w:t xml:space="preserve">) Ez a </w:t>
-      </w:r>
-      <w:proofErr w:type="spellStart"/>
-      <w:r>
-        <w:t>split</w:t>
-      </w:r>
-      <w:proofErr w:type="spellEnd"/>
-      <w:r>
-        <w:t xml:space="preserve"> függvény, ami egy adott </w:t>
-      </w:r>
-      <w:proofErr w:type="spellStart"/>
-      <w:r>
-        <w:t>string</w:t>
-      </w:r>
-      <w:proofErr w:type="spellEnd"/>
-      <w:r>
-        <w:t xml:space="preserve"> </w:t>
-      </w:r>
-      <w:proofErr w:type="spellStart"/>
-      <w:r>
-        <w:t>bemenetetet</w:t>
-      </w:r>
-      <w:proofErr w:type="spellEnd"/>
-      <w:r>
-        <w:t xml:space="preserve"> egy adott választó karakter mentén </w:t>
-      </w:r>
-      <w:proofErr w:type="spellStart"/>
-      <w:r>
-        <w:t>részstringekre</w:t>
-      </w:r>
-      <w:proofErr w:type="spellEnd"/>
-      <w:r>
-        <w:t xml:space="preserve"> bont.</w:t>
+        <w:t>) Ez a split függvény, ami egy adott string bemenetetet egy adott választó karakter mentén részstringekre bont.</w:t>
       </w:r>
     </w:p>
     <w:p>
@@ -6122,122 +4525,10 @@
     </w:p>
     <w:p>
       <w:r>
-        <w:t xml:space="preserve">A MonteCarlo osztály az OOP elvekhez hűen elrejti az adattagjait, ezeket csak </w:t>
-      </w:r>
-      <w:proofErr w:type="spellStart"/>
-      <w:r>
-        <w:t>setterek</w:t>
-      </w:r>
-      <w:proofErr w:type="spellEnd"/>
-      <w:r>
-        <w:t>/</w:t>
-      </w:r>
-      <w:proofErr w:type="spellStart"/>
-      <w:r>
-        <w:t>getterek</w:t>
-      </w:r>
-      <w:proofErr w:type="spellEnd"/>
-      <w:r>
-        <w:t xml:space="preserve">, valamint egyéb osztálymetódusok mentén lehet kívülről módosítani. Ez az osztály felelős az </w:t>
-      </w:r>
-      <w:proofErr w:type="spellStart"/>
-      <w:r>
-        <w:t>OpenGL</w:t>
-      </w:r>
-      <w:proofErr w:type="spellEnd"/>
-      <w:r>
-        <w:t xml:space="preserve"> környezet helyes beállításáért is. Ahhoz, hogy tudjunk kirajzolni objektumokat az </w:t>
-      </w:r>
-      <w:proofErr w:type="spellStart"/>
-      <w:r>
-        <w:t>OpenGL</w:t>
-      </w:r>
-      <w:proofErr w:type="spellEnd"/>
-      <w:r>
-        <w:t xml:space="preserve"> segítségével különböző állapotokat be kell állítani az </w:t>
-      </w:r>
-      <w:proofErr w:type="spellStart"/>
-      <w:r>
-        <w:t>OpenGL</w:t>
-      </w:r>
-      <w:proofErr w:type="spellEnd"/>
-      <w:r>
-        <w:t xml:space="preserve">-ben. Ilyen például egy aktív </w:t>
-      </w:r>
-      <w:proofErr w:type="spellStart"/>
-      <w:r>
-        <w:t>Vertex</w:t>
-      </w:r>
-      <w:proofErr w:type="spellEnd"/>
-      <w:r>
-        <w:t xml:space="preserve"> </w:t>
-      </w:r>
-      <w:proofErr w:type="spellStart"/>
-      <w:r>
-        <w:t>Array</w:t>
-      </w:r>
-      <w:proofErr w:type="spellEnd"/>
-      <w:r>
-        <w:t xml:space="preserve"> </w:t>
-      </w:r>
-      <w:proofErr w:type="spellStart"/>
-      <w:r>
-        <w:t>Object</w:t>
-      </w:r>
-      <w:proofErr w:type="spellEnd"/>
-      <w:r>
-        <w:t xml:space="preserve"> (</w:t>
-      </w:r>
-      <w:proofErr w:type="spellStart"/>
-      <w:r>
-        <w:t>vao</w:t>
-      </w:r>
-      <w:proofErr w:type="spellEnd"/>
-      <w:r>
-        <w:t>) beállítása</w:t>
-      </w:r>
-      <w:r>
-        <w:t xml:space="preserve">, valamint a kérdéses adatok átvitele a gazdaoldalról az eszközoldalra (GPU) SSBO-k, UBO-k, uniformok, valamint </w:t>
-      </w:r>
-      <w:proofErr w:type="spellStart"/>
-      <w:r>
-        <w:t>Vertex</w:t>
-      </w:r>
-      <w:proofErr w:type="spellEnd"/>
-      <w:r>
-        <w:t xml:space="preserve"> </w:t>
-      </w:r>
-      <w:proofErr w:type="spellStart"/>
-      <w:r>
-        <w:t>Buffer</w:t>
-      </w:r>
-      <w:proofErr w:type="spellEnd"/>
-      <w:r>
-        <w:t xml:space="preserve"> </w:t>
-      </w:r>
-      <w:proofErr w:type="spellStart"/>
-      <w:r>
-        <w:t>Objectek</w:t>
-      </w:r>
-      <w:proofErr w:type="spellEnd"/>
-      <w:r>
-        <w:t xml:space="preserve"> (</w:t>
-      </w:r>
-      <w:proofErr w:type="spellStart"/>
-      <w:r>
-        <w:t>vbo</w:t>
-      </w:r>
-      <w:proofErr w:type="spellEnd"/>
-      <w:r>
-        <w:t>) segítségével. Itt kerülnek beolvasásra fájlból a peremértékek és helyzetük, valamint itt lehet beállítani, hogy megálljon-e a szimuláció, BVH-</w:t>
-      </w:r>
-      <w:proofErr w:type="spellStart"/>
-      <w:r>
-        <w:t>val</w:t>
-      </w:r>
-      <w:proofErr w:type="spellEnd"/>
-      <w:r>
-        <w:t xml:space="preserve"> fusson-e, megjelenjen-e a BVH vizuálisan, vagy akár a szimuláció ne is fusson, hanem csak a BVH jelenjen meg valamint a peremértékek.</w:t>
+        <w:t>A MonteCarlo osztály az OOP elvekhez hűen elrejti az adattagjait, ezeket csak setterek/getterek, valamint egyéb osztálymetódusok mentén lehet kívülről módosítani. Ez az osztály felelős az OpenGL környezet helyes beállításáért is. Ahhoz, hogy tudjunk kirajzolni objektumokat az OpenGL segítségével különböző állapotokat be kell állítani az OpenGL-ben. Ilyen például egy aktív Vertex Array Object (vao) beállítása</w:t>
+      </w:r>
+      <w:r>
+        <w:t>, valamint a kérdéses adatok átvitele a gazdaoldalról az eszközoldalra (GPU) SSBO-k, UBO-k, uniformok, valamint Vertex Buffer Objectek (vbo) segítségével. Itt kerülnek beolvasásra fájlból a peremértékek és helyzetük, valamint itt lehet beállítani, hogy megálljon-e a szimuláció, BVH-val fusson-e, megjelenjen-e a BVH vizuálisan, vagy akár a szimuláció ne is fusson, hanem csak a BVH jelenjen meg valamint a peremértékek.</w:t>
       </w:r>
       <w:r>
         <w:t xml:space="preserve"> </w:t>
@@ -6264,15 +4555,7 @@
     </w:p>
     <w:p>
       <w:r>
-        <w:t xml:space="preserve">Maga az algoritmus a </w:t>
-      </w:r>
-      <w:proofErr w:type="spellStart"/>
-      <w:r>
-        <w:t>WoS</w:t>
-      </w:r>
-      <w:proofErr w:type="spellEnd"/>
-      <w:r>
-        <w:t xml:space="preserve"> algoritmus. (</w:t>
+        <w:t>Maga az algoritmus a WoS algoritmus. (</w:t>
       </w:r>
       <w:r>
         <w:fldChar w:fldCharType="begin"/>
@@ -6284,16 +4567,7 @@
         <w:fldChar w:fldCharType="separate"/>
       </w:r>
       <w:r>
-        <w:t>2</w:t>
-      </w:r>
-      <w:r>
-        <w:t>.</w:t>
-      </w:r>
-      <w:r>
-        <w:t>3</w:t>
-      </w:r>
-      <w:r>
-        <w:t>.1</w:t>
+        <w:t>2.3.1</w:t>
       </w:r>
       <w:r>
         <w:fldChar w:fldCharType="end"/>
@@ -6302,88 +4576,46 @@
         <w:t>)</w:t>
       </w:r>
       <w:r>
-        <w:t xml:space="preserve"> Ezt az algoritmust a GPU-n egy </w:t>
-      </w:r>
-      <w:proofErr w:type="spellStart"/>
-      <w:r>
-        <w:t>compute</w:t>
-      </w:r>
-      <w:proofErr w:type="spellEnd"/>
+        <w:t xml:space="preserve"> Ezt az algoritmust a GPU-n egy compute shaderben implementáltam. Az algoritmus pszeudókódja a következő:</w:t>
+      </w:r>
+    </w:p>
+    <w:p>
+      <w:pPr>
+        <w:pStyle w:val="Kd"/>
+      </w:pPr>
+      <w:r>
+        <w:t>x_0 &lt;- kezdőpont</w:t>
+      </w:r>
+    </w:p>
+    <w:p>
+      <w:pPr>
+        <w:pStyle w:val="Kd"/>
+      </w:pPr>
+      <w:r>
+        <w:t>sugár &lt;- legközelebbiPeremPont(x_0)</w:t>
+      </w:r>
+    </w:p>
+    <w:p>
+      <w:pPr>
+        <w:pStyle w:val="Kd"/>
+      </w:pPr>
+      <w:r>
+        <w:t>iteráció &lt;- 0</w:t>
+      </w:r>
+    </w:p>
+    <w:p>
+      <w:pPr>
+        <w:pStyle w:val="Kd"/>
+      </w:pPr>
+      <w:r>
+        <w:t>Ciklus amíg iteráció &lt;</w:t>
+      </w:r>
       <w:r>
         <w:t xml:space="preserve"> </w:t>
       </w:r>
-      <w:proofErr w:type="spellStart"/>
-      <w:r>
-        <w:t>shaderben</w:t>
-      </w:r>
-      <w:proofErr w:type="spellEnd"/>
-      <w:r>
-        <w:t xml:space="preserve"> implementáltam. Az algoritmus </w:t>
-      </w:r>
-      <w:proofErr w:type="spellStart"/>
-      <w:r>
-        <w:t>pszeudókódja</w:t>
-      </w:r>
-      <w:proofErr w:type="spellEnd"/>
-      <w:r>
-        <w:t xml:space="preserve"> a következő:</w:t>
-      </w:r>
-    </w:p>
-    <w:p>
-      <w:pPr>
-        <w:pStyle w:val="Kd"/>
-      </w:pPr>
-      <w:r>
-        <w:t>x_0 &lt;- kezdőpont</w:t>
-      </w:r>
-    </w:p>
-    <w:p>
-      <w:pPr>
-        <w:pStyle w:val="Kd"/>
-      </w:pPr>
-      <w:r>
-        <w:t xml:space="preserve">sugár &lt;- </w:t>
-      </w:r>
-      <w:proofErr w:type="spellStart"/>
-      <w:r>
-        <w:t>legközelebbiPeremPont</w:t>
-      </w:r>
-      <w:proofErr w:type="spellEnd"/>
-      <w:r>
-        <w:t>(x_0)</w:t>
-      </w:r>
-    </w:p>
-    <w:p>
-      <w:pPr>
-        <w:pStyle w:val="Kd"/>
-      </w:pPr>
-      <w:r>
-        <w:t>iteráció &lt;- 0</w:t>
-      </w:r>
-    </w:p>
-    <w:p>
-      <w:pPr>
-        <w:pStyle w:val="Kd"/>
-      </w:pPr>
-      <w:r>
-        <w:t>Ciklus amíg iteráció &lt;</w:t>
-      </w:r>
-      <w:r>
-        <w:t xml:space="preserve"> </w:t>
-      </w:r>
-      <w:proofErr w:type="spellStart"/>
-      <w:r>
-        <w:t>maxIteráció</w:t>
-      </w:r>
-      <w:proofErr w:type="spellEnd"/>
-      <w:r>
-        <w:t xml:space="preserve"> és sugár &lt; </w:t>
-      </w:r>
-      <w:proofErr w:type="spellStart"/>
-      <w:r>
-        <w:t>Epsilon</w:t>
-      </w:r>
-      <w:proofErr w:type="spellEnd"/>
+      <w:r>
+        <w:t>maxIteráció és sugár &lt; Epsilon</w:t>
+      </w:r>
     </w:p>
     <w:p>
       <w:pPr>
@@ -6400,13 +4632,8 @@
       </w:pPr>
       <w:r>
         <w:tab/>
-        <w:t xml:space="preserve">x_0 &lt;- véletlenszerű pont, ami pontosan sugár távolságra van </w:t>
-      </w:r>
-      <w:proofErr w:type="spellStart"/>
-      <w:r>
-        <w:t>x_o-tól</w:t>
-      </w:r>
-      <w:proofErr w:type="spellEnd"/>
+        <w:t>x_0 &lt;- véletlenszerű pont, ami pontosan sugár távolságra van x_o-tól</w:t>
+      </w:r>
     </w:p>
     <w:p>
       <w:pPr>
@@ -6414,28 +4641,15 @@
       </w:pPr>
       <w:r>
         <w:tab/>
-        <w:t xml:space="preserve">sugár &lt;- </w:t>
-      </w:r>
-      <w:proofErr w:type="spellStart"/>
-      <w:r>
-        <w:t>legközelebbiPeremPont</w:t>
-      </w:r>
-      <w:proofErr w:type="spellEnd"/>
-      <w:r>
-        <w:t>(x_0)</w:t>
+        <w:t>sugár &lt;- legközelebbiPeremPont(x_0)</w:t>
       </w:r>
     </w:p>
     <w:p>
       <w:pPr>
         <w:pStyle w:val="Kd"/>
       </w:pPr>
-      <w:proofErr w:type="spellStart"/>
-      <w:r>
-        <w:t>C.v</w:t>
-      </w:r>
-      <w:proofErr w:type="spellEnd"/>
-      <w:r>
-        <w:t>.</w:t>
+      <w:r>
+        <w:t>C.v.</w:t>
       </w:r>
     </w:p>
     <w:p>
@@ -6443,15 +4657,7 @@
         <w:pStyle w:val="Kd"/>
       </w:pPr>
       <w:r>
-        <w:t xml:space="preserve">Ha iteráció = </w:t>
-      </w:r>
-      <w:proofErr w:type="spellStart"/>
-      <w:r>
-        <w:t>maxIteráció</w:t>
-      </w:r>
-      <w:proofErr w:type="spellEnd"/>
-      <w:r>
-        <w:t xml:space="preserve"> akkor</w:t>
+        <w:t>Ha iteráció = maxIteráció akkor</w:t>
       </w:r>
     </w:p>
     <w:p>
@@ -6467,13 +4673,8 @@
       <w:pPr>
         <w:pStyle w:val="Kd"/>
       </w:pPr>
-      <w:proofErr w:type="spellStart"/>
-      <w:r>
-        <w:t>E.v</w:t>
-      </w:r>
-      <w:proofErr w:type="spellEnd"/>
-      <w:r>
-        <w:t>.</w:t>
+      <w:r>
+        <w:t>E.v.</w:t>
       </w:r>
     </w:p>
     <w:p>
@@ -6481,15 +4682,7 @@
         <w:pStyle w:val="Kd"/>
       </w:pPr>
       <w:r>
-        <w:t xml:space="preserve">eredmény &lt;- </w:t>
-      </w:r>
-      <w:proofErr w:type="spellStart"/>
-      <w:r>
-        <w:t>legközelebbiPeremÉrték</w:t>
-      </w:r>
-      <w:proofErr w:type="spellEnd"/>
-      <w:r>
-        <w:t>(x_0)</w:t>
+        <w:t>eredmény &lt;- legközelebbiPeremÉrték(x_0)</w:t>
       </w:r>
     </w:p>
     <w:p>
@@ -6546,82 +4739,582 @@
     </w:p>
     <w:p>
       <w:r>
-        <w:t xml:space="preserve">Az </w:t>
-      </w:r>
-      <w:proofErr w:type="spellStart"/>
-      <w:r>
-        <w:t>OpenGL</w:t>
-      </w:r>
-      <w:proofErr w:type="spellEnd"/>
-      <w:r>
-        <w:t xml:space="preserve">-ben sok hasznos beépített struktúra, függvény van. Ilyenek például a </w:t>
-      </w:r>
-      <w:proofErr w:type="spellStart"/>
-      <w:r>
-        <w:t>vector</w:t>
-      </w:r>
-      <w:proofErr w:type="spellEnd"/>
-      <w:r>
-        <w:t xml:space="preserve"> struktúrák </w:t>
-      </w:r>
-      <w:proofErr w:type="spellStart"/>
-      <w:r>
-        <w:t>vec</w:t>
-      </w:r>
-      <w:proofErr w:type="spellEnd"/>
-      <w:r>
-        <w:t xml:space="preserve">(1-4), vagy a rajtuk végezhető </w:t>
-      </w:r>
-      <w:proofErr w:type="spellStart"/>
-      <w:r>
-        <w:t>swizzling</w:t>
-      </w:r>
-      <w:proofErr w:type="spellEnd"/>
-      <w:r>
-        <w:t xml:space="preserve">, ami lehetővé teszi, hogy egyszerre több eleméhez férjünk hozzá egy </w:t>
-      </w:r>
-      <w:proofErr w:type="spellStart"/>
-      <w:r>
-        <w:t>vectornak</w:t>
-      </w:r>
-      <w:proofErr w:type="spellEnd"/>
-      <w:r>
-        <w:t xml:space="preserve">. Például, ha csak az x és z értékére vagyunk kíváncsiak akkor írhatjuk, hogy </w:t>
-      </w:r>
-      <w:proofErr w:type="spellStart"/>
-      <w:r>
-        <w:t>position.xz</w:t>
-      </w:r>
-      <w:proofErr w:type="spellEnd"/>
-      <w:r>
-        <w:t>, ami egy kételemű vektort ad vissza, aminek első eleme az x második pedig a z lesz.</w:t>
+        <w:t>Az OpenGL-ben sok hasznos beépített struktúra, függvény van. Ilyenek például a vector struktúrák vec(1-4), vagy a rajtuk végezhető swizzling, ami lehetővé teszi, hogy egyszerre több eleméhez férjünk hozzá egy vectornak. Például, ha csak az x és z értékére vagyunk kíváncsiak akkor írhatjuk, hogy position.xz, ami egy kételemű vektort ad vissza, aminek első eleme az x második pedig a z lesz.</w:t>
       </w:r>
     </w:p>
     <w:p>
       <w:r>
         <w:lastRenderedPageBreak/>
-        <w:t xml:space="preserve">Hasznos beépített függvények is vannak mint például a </w:t>
-      </w:r>
-      <w:proofErr w:type="spellStart"/>
-      <w:r>
-        <w:t>length</w:t>
-      </w:r>
-      <w:proofErr w:type="spellEnd"/>
-      <w:r>
-        <w:t xml:space="preserve">(), ami a paraméterként kapott vektorról visszaadja, hogy milyen hosszú. Azonban a GLSL nem tartalmaz véletlenszerű szám generálására alkalmas függvényt, így azt nekünk kell megírni. </w:t>
-      </w:r>
-    </w:p>
-    <w:p/>
+        <w:t xml:space="preserve">Hasznos beépített függvények is vannak mint például a length(), ami a paraméterként kapott vektorról visszaadja, hogy milyen hosszú. Azonban a GLSL nem tartalmaz véletlenszerű szám generálására alkalmas függvényt, így azt nekünk kell megírni. </w:t>
+      </w:r>
+      <w:r>
+        <w:t>Én a Visual Studio rand() függvényének egy régi implementációját alkalmaztam.</w:t>
+      </w:r>
+    </w:p>
+    <w:p>
+      <w:r>
+        <w:t>A WoS algoritmus fontos eleme, hogy az x körüli körről választott pont véletlenszerűen legyen választva, hiszen, ha valamelyik irányból feltűnően nagyobb eséllyel választ pontot az algoritmus, akkor torz eredményt fogunk kapni és hibás lesz a program kimenete.</w:t>
+      </w:r>
+    </w:p>
+    <w:p>
+      <w:r>
+        <w:t xml:space="preserve">Mivel minden compute dispatchkor lefut a compute shader, ezért az srand() seedelő függvénye a véletlenszerű számgenerátornak is lefut. Annak érdekében, hogy minden egyes ciklusban, amikor </w:t>
+      </w:r>
+      <w:r>
+        <w:t>újra számítódik</w:t>
+      </w:r>
+      <w:r>
+        <w:t xml:space="preserve"> a</w:t>
+      </w:r>
+      <w:r>
+        <w:t xml:space="preserve"> Monte Carlo más számokat kapjon az algoritmus, ezért a gazdaoldalról átadom minden ciklusban a ciklusszámot, így biztosítva, hogy ne mindig ugyanazok a séták fussanak le a pontokban.</w:t>
+      </w:r>
+    </w:p>
+    <w:p>
+      <w:r>
+        <w:t xml:space="preserve">Az egyes kiszámított </w:t>
+      </w:r>
+      <w:r>
+        <w:t>pontokat, ahonnan a sétákat indítom, egy texturába mentem olyan módon, hogy azon a helyen lévő textúra értéket megnézem és ehhez az értékhez hozzáadom az újonnan kiszámított értéket. Ezt az összeget írom vissza a textúrába. Mivel textúra olvasható fragment shaderből és compute shaderből is, így extra adminisztráció nélkül kiolvasható az eredmény a fragment shaderben, amit a compute shaderben kiszámolt a program.</w:t>
+      </w:r>
+    </w:p>
+    <w:p>
+      <w:pPr>
+        <w:pStyle w:val="Heading3"/>
+      </w:pPr>
+      <w:r>
+        <w:t>Legközelebbi pont keresés</w:t>
+      </w:r>
+    </w:p>
+    <w:p>
+      <w:r>
+        <w:t xml:space="preserve">Legfontosabb eleme az algoritmusnak a pont körüli kör meghatározása. Ezt annak érdekében, hogy a séta a lehető leggyorsabban véget érjen, célszerű akkorára választani, hogy megegyezzen a legközelebbi perempont és a kiindulási pont közötti távolsággal. Ez azt jelenti, hogy egy séta minden állomásában egy legközelebbi pont keresést kell végrehajtani. Erre a legegyszerűbb megoldás a kimerítő iteráció, ahol minden egyes pontot megnézünk és visszaadjuk a legközelebbit. Ennek a megoldásnak a helyessége triviális, hiszen minden lehetőséget megvizsgálunk. </w:t>
+      </w:r>
+      <w:r>
+        <w:t>Ha van L x M pontunk és N határtpontunk, akkor minden iterációban L * M * N db legközelebbi pont keresést hajtunk végre. Ez a megoldás nagyon gyorsan lassú futásidőt eredményez. Erre egy megoldást a BVH megépítése és alkalmazása adott, amivel már nem lineáris, hanem logaritmikus volt a futásidő a bemenetre nézve.</w:t>
+      </w:r>
+    </w:p>
+    <w:p>
+      <w:pPr>
+        <w:pStyle w:val="Heading2"/>
+      </w:pPr>
+      <w:r>
+        <w:lastRenderedPageBreak/>
+        <w:t>Bounding Volume Hierarchy</w:t>
+      </w:r>
+    </w:p>
+    <w:p>
+      <w:r>
+        <w:t xml:space="preserve">Annak érdekében, hogy legközelebbi pont keresést hajtsunk végre több lehetőségünk is van. Egy lehetőség a kimerítő iteráció, a legtriviálisabb megoldás. Annak érdekében, hogy ne kelljen a teljes N db elemet megnézni, hanem csak ennek egy valódi részhalmazát, két fő lehetőségünk van. </w:t>
+      </w:r>
+    </w:p>
+    <w:p>
+      <w:r>
+        <w:t>Az egyik lehetőség a tér felosztása, ezeket a struktúrákat térfelosztó struktúráknak nevezik. Ide tartoznak a</w:t>
+      </w:r>
+      <w:r>
+        <w:t xml:space="preserve"> quadtreek, k-d treek, vagy octreek is</w:t>
+      </w:r>
+      <w:r>
+        <w:t>.</w:t>
+      </w:r>
+      <w:r>
+        <w:t xml:space="preserve"> Arra az elvre alapszanak, hogy a teret addig osztják, ameddig az alapfeltétel nem teljesül, például a (</w:t>
+      </w:r>
+      <w:r>
+        <w:fldChar w:fldCharType="begin"/>
+      </w:r>
+      <w:r>
+        <w:instrText xml:space="preserve"> REF _Ref183646814 \h </w:instrText>
+      </w:r>
+      <w:r>
+        <w:fldChar w:fldCharType="separate"/>
+      </w:r>
+      <w:r>
+        <w:rPr>
+          <w:noProof/>
+        </w:rPr>
+        <w:t>4</w:t>
+      </w:r>
+      <w:r>
+        <w:t>. ábra</w:t>
+      </w:r>
+      <w:r>
+        <w:fldChar w:fldCharType="end"/>
+      </w:r>
+      <w:r>
+        <w:t>) látható, hogy a teret addig particionálta, ameddig minden cellában maximum egy elem volt.</w:t>
+      </w:r>
+    </w:p>
+    <w:p>
+      <w:pPr>
+        <w:keepNext/>
+      </w:pPr>
+      <w:r>
+        <w:rPr>
+          <w:noProof/>
+        </w:rPr>
+        <w:drawing>
+          <wp:inline distT="0" distB="0" distL="0" distR="0" wp14:anchorId="2F36A0F7" wp14:editId="61B12251">
+            <wp:extent cx="4905970" cy="1973580"/>
+            <wp:effectExtent l="0" t="0" r="9525" b="7620"/>
+            <wp:docPr id="563001312" name="Picture 1" descr="A black background with red dots&#10;&#10;Description automatically generated"/>
+            <wp:cNvGraphicFramePr>
+              <a:graphicFrameLocks xmlns:a="http://schemas.openxmlformats.org/drawingml/2006/main" noChangeAspect="1"/>
+            </wp:cNvGraphicFramePr>
+            <a:graphic xmlns:a="http://schemas.openxmlformats.org/drawingml/2006/main">
+              <a:graphicData uri="http://schemas.openxmlformats.org/drawingml/2006/picture">
+                <pic:pic xmlns:pic="http://schemas.openxmlformats.org/drawingml/2006/picture">
+                  <pic:nvPicPr>
+                    <pic:cNvPr id="563001312" name="Picture 1" descr="A black background with red dots&#10;&#10;Description automatically generated"/>
+                    <pic:cNvPicPr/>
+                  </pic:nvPicPr>
+                  <pic:blipFill>
+                    <a:blip r:embed="rId17">
+                      <a:extLst>
+                        <a:ext uri="{28A0092B-C50C-407E-A947-70E740481C1C}">
+                          <a14:useLocalDpi xmlns:a14="http://schemas.microsoft.com/office/drawing/2010/main" val="0"/>
+                        </a:ext>
+                      </a:extLst>
+                    </a:blip>
+                    <a:stretch>
+                      <a:fillRect/>
+                    </a:stretch>
+                  </pic:blipFill>
+                  <pic:spPr>
+                    <a:xfrm>
+                      <a:off x="0" y="0"/>
+                      <a:ext cx="4912499" cy="1976206"/>
+                    </a:xfrm>
+                    <a:prstGeom prst="rect">
+                      <a:avLst/>
+                    </a:prstGeom>
+                  </pic:spPr>
+                </pic:pic>
+              </a:graphicData>
+            </a:graphic>
+          </wp:inline>
+        </w:drawing>
+      </w:r>
+    </w:p>
+    <w:bookmarkStart w:id="10" w:name="_Ref183646814"/>
+    <w:p>
+      <w:pPr>
+        <w:pStyle w:val="Caption"/>
+        <w:jc w:val="both"/>
+      </w:pPr>
+      <w:r>
+        <w:fldChar w:fldCharType="begin"/>
+      </w:r>
+      <w:r>
+        <w:instrText xml:space="preserve"> SEQ ábra \* ARABIC </w:instrText>
+      </w:r>
+      <w:r>
+        <w:fldChar w:fldCharType="separate"/>
+      </w:r>
+      <w:r>
+        <w:rPr>
+          <w:noProof/>
+        </w:rPr>
+        <w:t>4</w:t>
+      </w:r>
+      <w:r>
+        <w:fldChar w:fldCharType="end"/>
+      </w:r>
+      <w:r>
+        <w:t>. ábra</w:t>
+      </w:r>
+      <w:bookmarkEnd w:id="10"/>
+      <w:r>
+        <w:t>: Az ábrán egy tér felosztása látható, amin a quadtree lett alkalmazva. A teret addig bontotta 4-es cellákra, ameddig minden cellában maximum egy elem volt. A jobb oldalt pedig magát a fát láthatjuk, ezen keresztül is elérjük az elemeket.</w:t>
+      </w:r>
+    </w:p>
+    <w:p>
+      <w:r>
+        <w:t>A teret felosztó struktúrákkal ellentétben a másik felfogás a</w:t>
+      </w:r>
+      <w:r>
+        <w:t>z objektumokat felosztó struktúrák. Ezek a struktúrák nem a teret osztják fel, hanem az objektumokat.</w:t>
+      </w:r>
+    </w:p>
+    <w:p>
+      <w:pPr>
+        <w:pStyle w:val="Heading3"/>
+      </w:pPr>
+      <w:r>
+        <w:t>Axis Aligned Bounding Box</w:t>
+      </w:r>
+    </w:p>
+    <w:p>
+      <w:r>
+        <w:t xml:space="preserve">Egy fontos eleme az objektumokat felosztó struktúráknak, hogy </w:t>
+      </w:r>
+      <w:r>
+        <w:t>az objektumokat valami szerint csoportosítani kell.</w:t>
+      </w:r>
+      <w:r>
+        <w:t xml:space="preserve"> Erre egy megoldás az Axis Aligned Bounding Box-ok (AABB) használata. Ezek olyan területek, amelyek párhuzamosak a koordinátarendszer tengelyeivel, így nagyon olcsón lehet ellenőrizni, hogy egy adott pont eltalál-e egy AABB-t, hiszen nem kell forgatást végezni a dobozokon, sem komplex határvizsgálatot, hiszen a doboz szélei párhuzamosak a tengelyekkel. Egy másik tulajdonságuk az AABB-knek, az az, hogy az objektumot teljesen magukba foglalják.</w:t>
+      </w:r>
+    </w:p>
+    <w:p>
+      <w:pPr>
+        <w:ind w:firstLine="0"/>
+      </w:pPr>
+      <w:r>
+        <w:lastRenderedPageBreak/>
+        <w:tab/>
+        <w:t>Fontos tulajdonságuk az AABB-knek, hogy könnyen az uniójuk mentén csoportba szervezhetőek az objektumok.</w:t>
+      </w:r>
+    </w:p>
+    <w:p>
+      <w:r>
+        <w:t>Két felfogás létezik a BVH-k létrehozására: bottom up, valamint top-down szemlélet.</w:t>
+      </w:r>
+    </w:p>
+    <w:p>
+      <w:r>
+        <w:t xml:space="preserve">A Bottum up-nál minden objektumot egy AABB-be zárunk, majd ezeknek rekurzívan vesszük az unióját addig, ameddig minden objektumot be nem foglaltunk egy ős AABB-vel. </w:t>
+      </w:r>
+    </w:p>
+    <w:p>
+      <w:r>
+        <w:t xml:space="preserve">A top-down </w:t>
+      </w:r>
+      <w:r>
+        <w:t>módszernél</w:t>
+      </w:r>
+      <w:r>
+        <w:t xml:space="preserve"> egy fába rendezzük az AABB-ket a következő módon:</w:t>
+      </w:r>
+    </w:p>
+    <w:p>
+      <w:pPr>
+        <w:pStyle w:val="Kd"/>
+        <w:numPr>
+          <w:ilvl w:val="0"/>
+          <w:numId w:val="25"/>
+        </w:numPr>
+      </w:pPr>
+      <w:r>
+        <w:t>Létrehozunk egy root AABB-t, amit addig növesztünk, ameddig minden objektumot le nem fedünk.</w:t>
+      </w:r>
+    </w:p>
+    <w:p>
+      <w:pPr>
+        <w:pStyle w:val="Kd"/>
+        <w:numPr>
+          <w:ilvl w:val="0"/>
+          <w:numId w:val="25"/>
+        </w:numPr>
+      </w:pPr>
+      <w:r>
+        <w:t>Megnézzük van</w:t>
+      </w:r>
+      <w:r>
+        <w:t>-e részfa, amiben kettőnél több objektum van</w:t>
+      </w:r>
+    </w:p>
+    <w:p>
+      <w:pPr>
+        <w:pStyle w:val="Kd"/>
+        <w:numPr>
+          <w:ilvl w:val="0"/>
+          <w:numId w:val="25"/>
+        </w:numPr>
+      </w:pPr>
+      <w:r>
+        <w:t>Ha nincs akkor kész vagyunk</w:t>
+      </w:r>
+    </w:p>
+    <w:p>
+      <w:pPr>
+        <w:pStyle w:val="Kd"/>
+        <w:numPr>
+          <w:ilvl w:val="0"/>
+          <w:numId w:val="25"/>
+        </w:numPr>
+      </w:pPr>
+      <w:r>
+        <w:t>Létrehozunk két gyerek AABB-t</w:t>
+      </w:r>
+    </w:p>
+    <w:p>
+      <w:pPr>
+        <w:pStyle w:val="Kd"/>
+        <w:numPr>
+          <w:ilvl w:val="0"/>
+          <w:numId w:val="25"/>
+        </w:numPr>
+      </w:pPr>
+      <w:r>
+        <w:t>Addig növesztjük a gyerek AABB-ket, hogy minden, a szülőben lévő objektumot lefedjék, valamint az egymás komplementerét tartalmazzák az objektumokból.</w:t>
+      </w:r>
+    </w:p>
+    <w:p>
+      <w:pPr>
+        <w:pStyle w:val="Kd"/>
+        <w:numPr>
+          <w:ilvl w:val="0"/>
+          <w:numId w:val="25"/>
+        </w:numPr>
+      </w:pPr>
+      <w:r>
+        <w:t>Szülő mindkét gyerekből.</w:t>
+      </w:r>
+    </w:p>
+    <w:p>
+      <w:pPr>
+        <w:pStyle w:val="Kd"/>
+        <w:numPr>
+          <w:ilvl w:val="0"/>
+          <w:numId w:val="25"/>
+        </w:numPr>
+      </w:pPr>
+      <w:r>
+        <w:t>Vissza lépés 2.</w:t>
+      </w:r>
+    </w:p>
+    <w:p>
+      <w:r>
+        <w:t>Fontos megjegyezni, hogy a gyerekek egymásnak az objektum komplementerét tartalmazzák nem pedig a terület komplementerét.</w:t>
+      </w:r>
+      <w:r>
+        <w:t xml:space="preserve"> (</w:t>
+      </w:r>
+      <w:r>
+        <w:fldChar w:fldCharType="begin"/>
+      </w:r>
+      <w:r>
+        <w:instrText xml:space="preserve"> REF _Ref183651456 \h </w:instrText>
+      </w:r>
+      <w:r>
+        <w:fldChar w:fldCharType="separate"/>
+      </w:r>
+      <w:r>
+        <w:rPr>
+          <w:noProof/>
+        </w:rPr>
+        <w:t>6</w:t>
+      </w:r>
+      <w:r>
+        <w:t>.ábra</w:t>
+      </w:r>
+      <w:r>
+        <w:fldChar w:fldCharType="end"/>
+      </w:r>
+      <w:r>
+        <w:t>)</w:t>
+      </w:r>
+    </w:p>
+    <w:p>
+      <w:pPr>
+        <w:keepNext/>
+      </w:pPr>
+      <w:r>
+        <w:rPr>
+          <w:noProof/>
+        </w:rPr>
+        <w:drawing>
+          <wp:inline distT="0" distB="0" distL="0" distR="0" wp14:anchorId="674E496F" wp14:editId="416411F3">
+            <wp:extent cx="3381847" cy="3381847"/>
+            <wp:effectExtent l="0" t="0" r="9525" b="9525"/>
+            <wp:docPr id="1021426348" name="Picture 4" descr="A blue triangles with a red line&#10;&#10;Description automatically generated"/>
+            <wp:cNvGraphicFramePr>
+              <a:graphicFrameLocks xmlns:a="http://schemas.openxmlformats.org/drawingml/2006/main" noChangeAspect="1"/>
+            </wp:cNvGraphicFramePr>
+            <a:graphic xmlns:a="http://schemas.openxmlformats.org/drawingml/2006/main">
+              <a:graphicData uri="http://schemas.openxmlformats.org/drawingml/2006/picture">
+                <pic:pic xmlns:pic="http://schemas.openxmlformats.org/drawingml/2006/picture">
+                  <pic:nvPicPr>
+                    <pic:cNvPr id="1021426348" name="Picture 4" descr="A blue triangles with a red line&#10;&#10;Description automatically generated"/>
+                    <pic:cNvPicPr/>
+                  </pic:nvPicPr>
+                  <pic:blipFill>
+                    <a:blip r:embed="rId18">
+                      <a:extLst>
+                        <a:ext uri="{28A0092B-C50C-407E-A947-70E740481C1C}">
+                          <a14:useLocalDpi xmlns:a14="http://schemas.microsoft.com/office/drawing/2010/main" val="0"/>
+                        </a:ext>
+                      </a:extLst>
+                    </a:blip>
+                    <a:stretch>
+                      <a:fillRect/>
+                    </a:stretch>
+                  </pic:blipFill>
+                  <pic:spPr>
+                    <a:xfrm>
+                      <a:off x="0" y="0"/>
+                      <a:ext cx="3381847" cy="3381847"/>
+                    </a:xfrm>
+                    <a:prstGeom prst="rect">
+                      <a:avLst/>
+                    </a:prstGeom>
+                  </pic:spPr>
+                </pic:pic>
+              </a:graphicData>
+            </a:graphic>
+          </wp:inline>
+        </w:drawing>
+      </w:r>
+    </w:p>
+    <w:bookmarkStart w:id="11" w:name="_Ref183651437"/>
+    <w:p>
+      <w:pPr>
+        <w:pStyle w:val="Caption"/>
+        <w:jc w:val="both"/>
+      </w:pPr>
+      <w:r>
+        <w:fldChar w:fldCharType="begin"/>
+      </w:r>
+      <w:r>
+        <w:instrText xml:space="preserve"> SEQ ábra \* ARABIC </w:instrText>
+      </w:r>
+      <w:r>
+        <w:fldChar w:fldCharType="separate"/>
+      </w:r>
+      <w:r>
+        <w:rPr>
+          <w:noProof/>
+        </w:rPr>
+        <w:t>5</w:t>
+      </w:r>
+      <w:r>
+        <w:fldChar w:fldCharType="end"/>
+      </w:r>
+      <w:r>
+        <w:t>. ábra</w:t>
+      </w:r>
+      <w:bookmarkEnd w:id="11"/>
+      <w:r>
+        <w:t>: A képen az objektumokat lefedő ős AABB látható. Az AABB csak a háromszögek középpontját veszi figyelembe, így lehet olyan eset, hogy egy háromszög k</w:t>
+      </w:r>
+      <w:r>
+        <w:t>e</w:t>
+      </w:r>
+      <w:r>
+        <w:t>t</w:t>
+      </w:r>
+      <w:r>
+        <w:t>tő, vagy több</w:t>
+      </w:r>
+      <w:r>
+        <w:t xml:space="preserve"> </w:t>
+      </w:r>
+      <w:r>
+        <w:t>levél</w:t>
+      </w:r>
+      <w:r>
+        <w:t xml:space="preserve">be is belelóg, de a középpontja szigorúan egy levélben </w:t>
+      </w:r>
+      <w:r>
+        <w:t>lehet csak.</w:t>
+      </w:r>
+    </w:p>
+    <w:p>
+      <w:pPr>
+        <w:keepNext/>
+      </w:pPr>
+      <w:r>
+        <w:rPr>
+          <w:noProof/>
+        </w:rPr>
+        <w:lastRenderedPageBreak/>
+        <w:drawing>
+          <wp:inline distT="0" distB="0" distL="0" distR="0" wp14:anchorId="52FFCD2A" wp14:editId="1C4B71F5">
+            <wp:extent cx="3381847" cy="3381847"/>
+            <wp:effectExtent l="0" t="0" r="9525" b="9525"/>
+            <wp:docPr id="767308670" name="Picture 3" descr="A blue triangles with red lines on a black background&#10;&#10;Description automatically generated"/>
+            <wp:cNvGraphicFramePr>
+              <a:graphicFrameLocks xmlns:a="http://schemas.openxmlformats.org/drawingml/2006/main" noChangeAspect="1"/>
+            </wp:cNvGraphicFramePr>
+            <a:graphic xmlns:a="http://schemas.openxmlformats.org/drawingml/2006/main">
+              <a:graphicData uri="http://schemas.openxmlformats.org/drawingml/2006/picture">
+                <pic:pic xmlns:pic="http://schemas.openxmlformats.org/drawingml/2006/picture">
+                  <pic:nvPicPr>
+                    <pic:cNvPr id="767308670" name="Picture 3" descr="A blue triangles with red lines on a black background&#10;&#10;Description automatically generated"/>
+                    <pic:cNvPicPr/>
+                  </pic:nvPicPr>
+                  <pic:blipFill>
+                    <a:blip r:embed="rId19">
+                      <a:extLst>
+                        <a:ext uri="{28A0092B-C50C-407E-A947-70E740481C1C}">
+                          <a14:useLocalDpi xmlns:a14="http://schemas.microsoft.com/office/drawing/2010/main" val="0"/>
+                        </a:ext>
+                      </a:extLst>
+                    </a:blip>
+                    <a:stretch>
+                      <a:fillRect/>
+                    </a:stretch>
+                  </pic:blipFill>
+                  <pic:spPr>
+                    <a:xfrm>
+                      <a:off x="0" y="0"/>
+                      <a:ext cx="3381847" cy="3381847"/>
+                    </a:xfrm>
+                    <a:prstGeom prst="rect">
+                      <a:avLst/>
+                    </a:prstGeom>
+                  </pic:spPr>
+                </pic:pic>
+              </a:graphicData>
+            </a:graphic>
+          </wp:inline>
+        </w:drawing>
+      </w:r>
+    </w:p>
+    <w:bookmarkStart w:id="12" w:name="_Ref183651456"/>
+    <w:p>
+      <w:pPr>
+        <w:pStyle w:val="Caption"/>
+        <w:jc w:val="both"/>
+      </w:pPr>
+      <w:r>
+        <w:fldChar w:fldCharType="begin"/>
+      </w:r>
+      <w:r>
+        <w:instrText xml:space="preserve"> SEQ ábra \* ARABIC </w:instrText>
+      </w:r>
+      <w:r>
+        <w:fldChar w:fldCharType="separate"/>
+      </w:r>
+      <w:r>
+        <w:rPr>
+          <w:noProof/>
+        </w:rPr>
+        <w:t>6</w:t>
+      </w:r>
+      <w:r>
+        <w:fldChar w:fldCharType="end"/>
+      </w:r>
+      <w:r>
+        <w:t>.ábra</w:t>
+      </w:r>
+      <w:bookmarkEnd w:id="12"/>
+      <w:r>
+        <w:t xml:space="preserve">: A képen </w:t>
+      </w:r>
+      <w:r>
+        <w:t>a BVH látható a második lépés után. Itt is jól látható, hogy a szülő gyerekei nem a teret osztják fel egymás között, hanem az objektumokat.</w:t>
+      </w:r>
+    </w:p>
+    <w:p>
+      <w:pPr>
+        <w:pStyle w:val="Heading3"/>
+      </w:pPr>
+      <w:r>
+        <w:t>BVH implementáció CPU-n</w:t>
+      </w:r>
+    </w:p>
     <w:p>
       <w:pPr>
         <w:pStyle w:val="Fejezetcimszmozsnlkl"/>
       </w:pPr>
-      <w:bookmarkStart w:id="10" w:name="_Toc59896139"/>
+      <w:bookmarkStart w:id="13" w:name="_Toc59896139"/>
       <w:r>
         <w:lastRenderedPageBreak/>
         <w:t>Irodalomjegyzék</w:t>
       </w:r>
-      <w:bookmarkEnd w:id="10"/>
+      <w:bookmarkEnd w:id="13"/>
     </w:p>
     <w:p>
       <w:pPr>
@@ -6633,7 +5326,7 @@
           <w:citation/>
         </w:sdtPr>
         <w:sdtContent>
-          <w:bookmarkStart w:id="11" w:name="_Ref183355875"/>
+          <w:bookmarkStart w:id="14" w:name="_Ref183355875"/>
           <w:r>
             <w:fldChar w:fldCharType="begin"/>
           </w:r>
@@ -6651,7 +5344,7 @@
           </w:r>
         </w:sdtContent>
       </w:sdt>
-      <w:bookmarkEnd w:id="11"/>
+      <w:bookmarkEnd w:id="14"/>
     </w:p>
     <w:p>
       <w:pPr>
@@ -6663,7 +5356,7 @@
           <w:citation/>
         </w:sdtPr>
         <w:sdtContent>
-          <w:bookmarkStart w:id="12" w:name="_Ref183355924"/>
+          <w:bookmarkStart w:id="15" w:name="_Ref183355924"/>
           <w:r>
             <w:fldChar w:fldCharType="begin"/>
           </w:r>
@@ -6681,9 +5374,9 @@
           </w:r>
         </w:sdtContent>
       </w:sdt>
-      <w:bookmarkEnd w:id="12"/>
-    </w:p>
-    <w:bookmarkStart w:id="13" w:name="_Ref183355930"/>
+      <w:bookmarkEnd w:id="15"/>
+    </w:p>
+    <w:bookmarkStart w:id="16" w:name="_Ref183355930"/>
     <w:p>
       <w:pPr>
         <w:pStyle w:val="Irodalomjegyzksor"/>
@@ -6709,7 +5402,7 @@
         </w:rPr>
         <w:t>https://www.investopedia.com/terms/m/montecarlosimulation.asp</w:t>
       </w:r>
-      <w:bookmarkEnd w:id="13"/>
+      <w:bookmarkEnd w:id="16"/>
       <w:r>
         <w:fldChar w:fldCharType="end"/>
       </w:r>
@@ -6718,7 +5411,7 @@
       <w:pPr>
         <w:pStyle w:val="Irodalomjegyzksor"/>
       </w:pPr>
-      <w:hyperlink r:id="rId17" w:history="1">
+      <w:hyperlink r:id="rId20" w:history="1">
         <w:r>
           <w:rPr>
             <w:rStyle w:val="Hyperlink"/>
@@ -6734,7 +5427,7 @@
       <w:pPr>
         <w:pStyle w:val="Irodalomjegyzksor"/>
       </w:pPr>
-      <w:hyperlink r:id="rId18" w:history="1">
+      <w:hyperlink r:id="rId21" w:history="1">
         <w:r>
           <w:rPr>
             <w:rStyle w:val="Hyperlink"/>
@@ -6750,7 +5443,7 @@
       <w:pPr>
         <w:pStyle w:val="Irodalomjegyzksor"/>
       </w:pPr>
-      <w:hyperlink r:id="rId19" w:history="1">
+      <w:hyperlink r:id="rId22" w:history="1">
         <w:r>
           <w:rPr>
             <w:rStyle w:val="Hyperlink"/>
@@ -6763,7 +5456,7 @@
       <w:pPr>
         <w:pStyle w:val="Irodalomjegyzksor"/>
       </w:pPr>
-      <w:hyperlink r:id="rId20" w:history="1">
+      <w:hyperlink r:id="rId23" w:history="1">
         <w:r>
           <w:rPr>
             <w:rStyle w:val="Hyperlink"/>
@@ -6779,7 +5472,7 @@
       <w:pPr>
         <w:pStyle w:val="Irodalomjegyzksor"/>
       </w:pPr>
-      <w:hyperlink r:id="rId21" w:history="1">
+      <w:hyperlink r:id="rId24" w:history="1">
         <w:r>
           <w:rPr>
             <w:rStyle w:val="Hyperlink"/>
@@ -6792,7 +5485,7 @@
       <w:pPr>
         <w:pStyle w:val="Irodalomjegyzksor"/>
       </w:pPr>
-      <w:hyperlink r:id="rId22" w:history="1">
+      <w:hyperlink r:id="rId25" w:history="1">
         <w:r>
           <w:rPr>
             <w:rStyle w:val="Hyperlink"/>
@@ -6805,7 +5498,7 @@
       <w:pPr>
         <w:pStyle w:val="Irodalomjegyzksor"/>
       </w:pPr>
-      <w:hyperlink r:id="rId23" w:history="1">
+      <w:hyperlink r:id="rId26" w:history="1">
         <w:r>
           <w:rPr>
             <w:rStyle w:val="Hyperlink"/>
@@ -6818,7 +5511,7 @@
       <w:pPr>
         <w:pStyle w:val="Irodalomjegyzksor"/>
       </w:pPr>
-      <w:hyperlink r:id="rId24" w:history="1">
+      <w:hyperlink r:id="rId27" w:history="1">
         <w:r>
           <w:rPr>
             <w:rStyle w:val="Hyperlink"/>
@@ -6832,19 +5525,48 @@
     </w:p>
     <w:p>
       <w:pPr>
+        <w:pStyle w:val="Irodalomjegyzksor"/>
+      </w:pPr>
+      <w:hyperlink r:id="rId28" w:history="1">
+        <w:r>
+          <w:rPr>
+            <w:rStyle w:val="Hyperlink"/>
+          </w:rPr>
+          <w:t>https://jacco.ompf2.com/2022/04/13/how-to-build-a-bvh-part-1-basics/</w:t>
+        </w:r>
+      </w:hyperlink>
+    </w:p>
+    <w:p>
+      <w:pPr>
+        <w:pStyle w:val="Irodalomjegyzksor"/>
+      </w:pPr>
+      <w:hyperlink r:id="rId29" w:history="1">
+        <w:r>
+          <w:rPr>
+            <w:rStyle w:val="Hyperlink"/>
+          </w:rPr>
+          <w:t>https://en.wikipedia.org/wiki/Bounding_volume_hierarchy</w:t>
+        </w:r>
+      </w:hyperlink>
+      <w:r>
+        <w:t xml:space="preserve"> </w:t>
+      </w:r>
+    </w:p>
+    <w:p>
+      <w:pPr>
         <w:pStyle w:val="Fejezetcimszmozsnlkl"/>
       </w:pPr>
-      <w:bookmarkStart w:id="14" w:name="_Toc59896140"/>
+      <w:bookmarkStart w:id="17" w:name="_Toc59896140"/>
       <w:r>
         <w:lastRenderedPageBreak/>
         <w:t>Függelék</w:t>
       </w:r>
-      <w:bookmarkEnd w:id="14"/>
+      <w:bookmarkEnd w:id="17"/>
     </w:p>
     <w:p/>
     <w:sectPr>
-      <w:headerReference w:type="even" r:id="rId25"/>
-      <w:footerReference w:type="default" r:id="rId26"/>
+      <w:headerReference w:type="even" r:id="rId30"/>
+      <w:footerReference w:type="default" r:id="rId31"/>
       <w:type w:val="continuous"/>
       <w:pgSz w:w="11907" w:h="16840" w:code="9"/>
       <w:pgMar w:top="1418" w:right="1418" w:bottom="1418" w:left="1418" w:header="709" w:footer="709" w:gutter="567"/>
@@ -7265,12 +5987,101 @@
     </w:lvl>
   </w:abstractNum>
   <w:abstractNum w:abstractNumId="11" w15:restartNumberingAfterBreak="0">
+    <w:nsid w:val="048E70EB"/>
+    <w:multiLevelType w:val="hybridMultilevel"/>
+    <w:tmpl w:val="49ACAF60"/>
+    <w:lvl w:ilvl="0" w:tplc="34CCEE58">
+      <w:start w:val="1"/>
+      <w:numFmt w:val="decimal"/>
+      <w:lvlText w:val="%1."/>
+      <w:lvlJc w:val="left"/>
+      <w:pPr>
+        <w:ind w:left="644" w:hanging="360"/>
+      </w:pPr>
+      <w:rPr>
+        <w:rFonts w:hint="default"/>
+      </w:rPr>
+    </w:lvl>
+    <w:lvl w:ilvl="1" w:tplc="08090019" w:tentative="1">
+      <w:start w:val="1"/>
+      <w:numFmt w:val="lowerLetter"/>
+      <w:lvlText w:val="%2."/>
+      <w:lvlJc w:val="left"/>
+      <w:pPr>
+        <w:ind w:left="1364" w:hanging="360"/>
+      </w:pPr>
+    </w:lvl>
+    <w:lvl w:ilvl="2" w:tplc="0809001B" w:tentative="1">
+      <w:start w:val="1"/>
+      <w:numFmt w:val="lowerRoman"/>
+      <w:lvlText w:val="%3."/>
+      <w:lvlJc w:val="right"/>
+      <w:pPr>
+        <w:ind w:left="2084" w:hanging="180"/>
+      </w:pPr>
+    </w:lvl>
+    <w:lvl w:ilvl="3" w:tplc="0809000F" w:tentative="1">
+      <w:start w:val="1"/>
+      <w:numFmt w:val="decimal"/>
+      <w:lvlText w:val="%4."/>
+      <w:lvlJc w:val="left"/>
+      <w:pPr>
+        <w:ind w:left="2804" w:hanging="360"/>
+      </w:pPr>
+    </w:lvl>
+    <w:lvl w:ilvl="4" w:tplc="08090019" w:tentative="1">
+      <w:start w:val="1"/>
+      <w:numFmt w:val="lowerLetter"/>
+      <w:lvlText w:val="%5."/>
+      <w:lvlJc w:val="left"/>
+      <w:pPr>
+        <w:ind w:left="3524" w:hanging="360"/>
+      </w:pPr>
+    </w:lvl>
+    <w:lvl w:ilvl="5" w:tplc="0809001B" w:tentative="1">
+      <w:start w:val="1"/>
+      <w:numFmt w:val="lowerRoman"/>
+      <w:lvlText w:val="%6."/>
+      <w:lvlJc w:val="right"/>
+      <w:pPr>
+        <w:ind w:left="4244" w:hanging="180"/>
+      </w:pPr>
+    </w:lvl>
+    <w:lvl w:ilvl="6" w:tplc="0809000F" w:tentative="1">
+      <w:start w:val="1"/>
+      <w:numFmt w:val="decimal"/>
+      <w:lvlText w:val="%7."/>
+      <w:lvlJc w:val="left"/>
+      <w:pPr>
+        <w:ind w:left="4964" w:hanging="360"/>
+      </w:pPr>
+    </w:lvl>
+    <w:lvl w:ilvl="7" w:tplc="08090019" w:tentative="1">
+      <w:start w:val="1"/>
+      <w:numFmt w:val="lowerLetter"/>
+      <w:lvlText w:val="%8."/>
+      <w:lvlJc w:val="left"/>
+      <w:pPr>
+        <w:ind w:left="5684" w:hanging="360"/>
+      </w:pPr>
+    </w:lvl>
+    <w:lvl w:ilvl="8" w:tplc="0809001B" w:tentative="1">
+      <w:start w:val="1"/>
+      <w:numFmt w:val="lowerRoman"/>
+      <w:lvlText w:val="%9."/>
+      <w:lvlJc w:val="right"/>
+      <w:pPr>
+        <w:ind w:left="6404" w:hanging="180"/>
+      </w:pPr>
+    </w:lvl>
+  </w:abstractNum>
+  <w:abstractNum w:abstractNumId="12" w15:restartNumberingAfterBreak="0">
     <w:nsid w:val="15EE0508"/>
     <w:multiLevelType w:val="multilevel"/>
     <w:tmpl w:val="418E4214"/>
     <w:numStyleLink w:val="tmutatszmozottlista"/>
   </w:abstractNum>
-  <w:abstractNum w:abstractNumId="12" w15:restartNumberingAfterBreak="0">
+  <w:abstractNum w:abstractNumId="13" w15:restartNumberingAfterBreak="0">
     <w:nsid w:val="1B59494D"/>
     <w:multiLevelType w:val="multilevel"/>
     <w:tmpl w:val="907A15EC"/>
@@ -7414,7 +6225,7 @@
       </w:rPr>
     </w:lvl>
   </w:abstractNum>
-  <w:abstractNum w:abstractNumId="13" w15:restartNumberingAfterBreak="0">
+  <w:abstractNum w:abstractNumId="14" w15:restartNumberingAfterBreak="0">
     <w:nsid w:val="1D726210"/>
     <w:multiLevelType w:val="hybridMultilevel"/>
     <w:tmpl w:val="24C8812A"/>
@@ -7503,7 +6314,7 @@
       </w:pPr>
     </w:lvl>
   </w:abstractNum>
-  <w:abstractNum w:abstractNumId="14" w15:restartNumberingAfterBreak="0">
+  <w:abstractNum w:abstractNumId="15" w15:restartNumberingAfterBreak="0">
     <w:nsid w:val="3353475A"/>
     <w:multiLevelType w:val="multilevel"/>
     <w:tmpl w:val="418E4214"/>
@@ -7590,7 +6401,7 @@
       </w:pPr>
     </w:lvl>
   </w:abstractNum>
-  <w:abstractNum w:abstractNumId="15" w15:restartNumberingAfterBreak="0">
+  <w:abstractNum w:abstractNumId="16" w15:restartNumberingAfterBreak="0">
     <w:nsid w:val="36AB7E05"/>
     <w:multiLevelType w:val="multilevel"/>
     <w:tmpl w:val="FFB42E42"/>
@@ -7707,7 +6518,7 @@
       </w:pPr>
     </w:lvl>
   </w:abstractNum>
-  <w:abstractNum w:abstractNumId="16" w15:restartNumberingAfterBreak="0">
+  <w:abstractNum w:abstractNumId="17" w15:restartNumberingAfterBreak="0">
     <w:nsid w:val="36B04F5A"/>
     <w:multiLevelType w:val="multilevel"/>
     <w:tmpl w:val="907A15EC"/>
@@ -7849,7 +6660,7 @@
       </w:rPr>
     </w:lvl>
   </w:abstractNum>
-  <w:abstractNum w:abstractNumId="17" w15:restartNumberingAfterBreak="0">
+  <w:abstractNum w:abstractNumId="18" w15:restartNumberingAfterBreak="0">
     <w:nsid w:val="3A162A58"/>
     <w:multiLevelType w:val="multilevel"/>
     <w:tmpl w:val="907A15EC"/>
@@ -7993,7 +6804,7 @@
       </w:rPr>
     </w:lvl>
   </w:abstractNum>
-  <w:abstractNum w:abstractNumId="18" w15:restartNumberingAfterBreak="0">
+  <w:abstractNum w:abstractNumId="19" w15:restartNumberingAfterBreak="0">
     <w:nsid w:val="43AD1628"/>
     <w:multiLevelType w:val="multilevel"/>
     <w:tmpl w:val="907A15EC"/>
@@ -8137,7 +6948,7 @@
       </w:rPr>
     </w:lvl>
   </w:abstractNum>
-  <w:abstractNum w:abstractNumId="19" w15:restartNumberingAfterBreak="0">
+  <w:abstractNum w:abstractNumId="20" w15:restartNumberingAfterBreak="0">
     <w:nsid w:val="49603694"/>
     <w:multiLevelType w:val="hybridMultilevel"/>
     <w:tmpl w:val="067AB5DC"/>
@@ -8223,7 +7034,7 @@
       </w:pPr>
     </w:lvl>
   </w:abstractNum>
-  <w:abstractNum w:abstractNumId="20" w15:restartNumberingAfterBreak="0">
+  <w:abstractNum w:abstractNumId="21" w15:restartNumberingAfterBreak="0">
     <w:nsid w:val="53535320"/>
     <w:multiLevelType w:val="multilevel"/>
     <w:tmpl w:val="907A15EC"/>
@@ -8367,7 +7178,7 @@
       </w:rPr>
     </w:lvl>
   </w:abstractNum>
-  <w:abstractNum w:abstractNumId="21" w15:restartNumberingAfterBreak="0">
+  <w:abstractNum w:abstractNumId="22" w15:restartNumberingAfterBreak="0">
     <w:nsid w:val="6AFC1994"/>
     <w:multiLevelType w:val="multilevel"/>
     <w:tmpl w:val="907A15EC"/>
@@ -8510,7 +7321,7 @@
       </w:rPr>
     </w:lvl>
   </w:abstractNum>
-  <w:abstractNum w:abstractNumId="22" w15:restartNumberingAfterBreak="0">
+  <w:abstractNum w:abstractNumId="23" w15:restartNumberingAfterBreak="0">
     <w:nsid w:val="799C3B84"/>
     <w:multiLevelType w:val="multilevel"/>
     <w:tmpl w:val="C3565810"/>
@@ -8651,7 +7462,7 @@
       </w:rPr>
     </w:lvl>
   </w:abstractNum>
-  <w:abstractNum w:abstractNumId="23" w15:restartNumberingAfterBreak="0">
+  <w:abstractNum w:abstractNumId="24" w15:restartNumberingAfterBreak="0">
     <w:nsid w:val="7CE6451A"/>
     <w:multiLevelType w:val="multilevel"/>
     <w:tmpl w:val="907A15EC"/>
@@ -8798,37 +7609,37 @@
     <w:abstractNumId w:val="10"/>
   </w:num>
   <w:num w:numId="2" w16cid:durableId="1836991430">
-    <w:abstractNumId w:val="22"/>
+    <w:abstractNumId w:val="23"/>
   </w:num>
   <w:num w:numId="3" w16cid:durableId="891573526">
+    <w:abstractNumId w:val="13"/>
+  </w:num>
+  <w:num w:numId="4" w16cid:durableId="729692673">
+    <w:abstractNumId w:val="18"/>
+  </w:num>
+  <w:num w:numId="5" w16cid:durableId="1064180354">
+    <w:abstractNumId w:val="19"/>
+  </w:num>
+  <w:num w:numId="6" w16cid:durableId="858009432">
+    <w:abstractNumId w:val="21"/>
+  </w:num>
+  <w:num w:numId="7" w16cid:durableId="1913807814">
+    <w:abstractNumId w:val="15"/>
+  </w:num>
+  <w:num w:numId="8" w16cid:durableId="760687161">
     <w:abstractNumId w:val="12"/>
   </w:num>
-  <w:num w:numId="4" w16cid:durableId="729692673">
+  <w:num w:numId="9" w16cid:durableId="2126148652">
+    <w:abstractNumId w:val="16"/>
+  </w:num>
+  <w:num w:numId="10" w16cid:durableId="675152112">
+    <w:abstractNumId w:val="24"/>
+  </w:num>
+  <w:num w:numId="11" w16cid:durableId="1417094765">
     <w:abstractNumId w:val="17"/>
   </w:num>
-  <w:num w:numId="5" w16cid:durableId="1064180354">
-    <w:abstractNumId w:val="18"/>
-  </w:num>
-  <w:num w:numId="6" w16cid:durableId="858009432">
-    <w:abstractNumId w:val="20"/>
-  </w:num>
-  <w:num w:numId="7" w16cid:durableId="1913807814">
-    <w:abstractNumId w:val="14"/>
-  </w:num>
-  <w:num w:numId="8" w16cid:durableId="760687161">
-    <w:abstractNumId w:val="11"/>
-  </w:num>
-  <w:num w:numId="9" w16cid:durableId="2126148652">
-    <w:abstractNumId w:val="15"/>
-  </w:num>
-  <w:num w:numId="10" w16cid:durableId="675152112">
-    <w:abstractNumId w:val="23"/>
-  </w:num>
-  <w:num w:numId="11" w16cid:durableId="1417094765">
-    <w:abstractNumId w:val="16"/>
-  </w:num>
   <w:num w:numId="12" w16cid:durableId="1415588961">
-    <w:abstractNumId w:val="21"/>
+    <w:abstractNumId w:val="22"/>
   </w:num>
   <w:num w:numId="13" w16cid:durableId="1492286194">
     <w:abstractNumId w:val="9"/>
@@ -8861,10 +7672,13 @@
     <w:abstractNumId w:val="0"/>
   </w:num>
   <w:num w:numId="23" w16cid:durableId="1860045779">
-    <w:abstractNumId w:val="19"/>
+    <w:abstractNumId w:val="20"/>
   </w:num>
   <w:num w:numId="24" w16cid:durableId="632104558">
-    <w:abstractNumId w:val="13"/>
+    <w:abstractNumId w:val="14"/>
+  </w:num>
+  <w:num w:numId="25" w16cid:durableId="1332954997">
+    <w:abstractNumId w:val="11"/>
   </w:num>
   <w:numIdMacAtCleanup w:val="12"/>
 </w:numbering>
@@ -9366,6 +8180,7 @@
   <w:style w:type="character" w:default="1" w:styleId="DefaultParagraphFont">
     <w:name w:val="Default Paragraph Font"/>
     <w:uiPriority w:val="1"/>
+    <w:semiHidden/>
     <w:unhideWhenUsed/>
   </w:style>
   <w:style w:type="table" w:default="1" w:styleId="TableNormal">

</xml_diff>